<commit_message>
Make reviewer workflow website first
</commit_message>
<xml_diff>
--- a/docs/CCAF_Independent_Review_Response_Template.docx
+++ b/docs/CCAF_Independent_Review_Response_Template.docx
@@ -46,7 +46,7 @@
           <w:color w:val="1C2731"/>
           <w:sz w:val="18"/>
         </w:rPr>
-        <w:t>The release facts below are pre-filled for confirmation. Professional opinions must be written by the reviewer. Brief responses are acceptable; address only prompts relevant to the review performed.</w:t>
+        <w:t>The release facts below are pre-filled for confirmation. Professional opinions must be written by the reviewer. Brief responses are acceptable; address only prompts relevant to the materials and procedures examined. The normal review can be completed through the website; GitHub and local reproduction are optional.</w:t>
       </w:r>
     </w:p>
     <w:p>
@@ -219,7 +219,7 @@
                 <w:color w:val="1C2731"/>
                 <w:sz w:val="17"/>
               </w:rPr>
-              <w:t>Review depth: [ ] Focused  [ ] Detailed  [ ] Other: __________</w:t>
+              <w:t>Review depth: [ ] Website methodology  [ ] Source-code  [ ] Detailed</w:t>
             </w:r>
           </w:p>
         </w:tc>
@@ -308,7 +308,58 @@
                 <w:color w:val="1C2731"/>
                 <w:sz w:val="17"/>
               </w:rPr>
-              <w:t>Repository and license</w:t>
+              <w:t>Interactive website</w:t>
+            </w:r>
+          </w:p>
+        </w:tc>
+        <w:tc>
+          <w:tcPr>
+            <w:tcW w:type="dxa" w:w="5184"/>
+            <w:vAlign w:val="center"/>
+            <w:tcMar>
+              <w:top w:w="65" w:type="dxa"/>
+              <w:start w:w="100" w:type="dxa"/>
+              <w:bottom w:w="65" w:type="dxa"/>
+              <w:end w:w="100" w:type="dxa"/>
+            </w:tcMar>
+          </w:tcPr>
+          <w:p>
+            <w:r>
+              <w:rPr>
+                <w:rFonts w:ascii="Arial" w:hAnsi="Arial"/>
+                <w:b w:val="0"/>
+                <w:i w:val="0"/>
+                <w:color w:val="1C2731"/>
+                <w:sz w:val="17"/>
+              </w:rPr>
+              <w:t>continuous-control-assurance.streamlit.app</w:t>
+            </w:r>
+          </w:p>
+        </w:tc>
+      </w:tr>
+      <w:tr>
+        <w:tc>
+          <w:tcPr>
+            <w:tcW w:type="dxa" w:w="5184"/>
+            <w:shd w:fill="EAF0F5"/>
+            <w:vAlign w:val="center"/>
+            <w:tcMar>
+              <w:top w:w="65" w:type="dxa"/>
+              <w:start w:w="100" w:type="dxa"/>
+              <w:bottom w:w="65" w:type="dxa"/>
+              <w:end w:w="100" w:type="dxa"/>
+            </w:tcMar>
+          </w:tcPr>
+          <w:p>
+            <w:r>
+              <w:rPr>
+                <w:rFonts w:ascii="Arial" w:hAnsi="Arial"/>
+                <w:b/>
+                <w:i w:val="0"/>
+                <w:color w:val="1C2731"/>
+                <w:sz w:val="17"/>
+              </w:rPr>
+              <w:t>Optional source code</w:t>
             </w:r>
           </w:p>
         </w:tc>
@@ -461,7 +512,7 @@
                 <w:color w:val="1C2731"/>
                 <w:sz w:val="17"/>
               </w:rPr>
-              <w:t>Focused command</w:t>
+              <w:t>Review emphasis</w:t>
             </w:r>
           </w:p>
         </w:tc>
@@ -485,58 +536,7 @@
                 <w:color w:val="1C2731"/>
                 <w:sz w:val="17"/>
               </w:rPr>
-              <w:t>python run_all.py --regenerate --no-charts</w:t>
-            </w:r>
-          </w:p>
-        </w:tc>
-      </w:tr>
-      <w:tr>
-        <w:tc>
-          <w:tcPr>
-            <w:tcW w:type="dxa" w:w="5184"/>
-            <w:shd w:fill="EAF0F5"/>
-            <w:vAlign w:val="center"/>
-            <w:tcMar>
-              <w:top w:w="65" w:type="dxa"/>
-              <w:start w:w="100" w:type="dxa"/>
-              <w:bottom w:w="65" w:type="dxa"/>
-              <w:end w:w="100" w:type="dxa"/>
-            </w:tcMar>
-          </w:tcPr>
-          <w:p>
-            <w:r>
-              <w:rPr>
-                <w:rFonts w:ascii="Arial" w:hAnsi="Arial"/>
-                <w:b/>
-                <w:i w:val="0"/>
-                <w:color w:val="1C2731"/>
-                <w:sz w:val="17"/>
-              </w:rPr>
-              <w:t>Automated test command</w:t>
-            </w:r>
-          </w:p>
-        </w:tc>
-        <w:tc>
-          <w:tcPr>
-            <w:tcW w:type="dxa" w:w="5184"/>
-            <w:vAlign w:val="center"/>
-            <w:tcMar>
-              <w:top w:w="65" w:type="dxa"/>
-              <w:start w:w="100" w:type="dxa"/>
-              <w:bottom w:w="65" w:type="dxa"/>
-              <w:end w:w="100" w:type="dxa"/>
-            </w:tcMar>
-          </w:tcPr>
-          <w:p>
-            <w:r>
-              <w:rPr>
-                <w:rFonts w:ascii="Arial" w:hAnsi="Arial"/>
-                <w:b w:val="0"/>
-                <w:i w:val="0"/>
-                <w:color w:val="1C2731"/>
-                <w:sz w:val="17"/>
-              </w:rPr>
-              <w:t>python -m unittest discover -s tests -v</w:t>
+              <w:t>Methodology, professional coherence, boundaries, and institutional adaptability</w:t>
             </w:r>
           </w:p>
         </w:tc>
@@ -554,7 +554,22 @@
           <w:color w:val="1C2731"/>
           <w:sz w:val="17"/>
         </w:rPr>
-        <w:t>Procedures personally performed:  [ ] Reproduced demonstration  [ ] Reviewed methodology/limitations  [ ] Ran tests  [ ] Inspected selected logic/artifacts</w:t>
+        <w:t>Procedures personally performed:  [ ] Reviewed website methodology/limitations  [ ] Inspected selected control procedures/logic</w:t>
+      </w:r>
+    </w:p>
+    <w:p>
+      <w:pPr>
+        <w:spacing w:after="20"/>
+      </w:pPr>
+      <w:r>
+        <w:rPr>
+          <w:rFonts w:ascii="Arial" w:hAnsi="Arial"/>
+          <w:b w:val="0"/>
+          <w:i w:val="0"/>
+          <w:color w:val="1C2731"/>
+          <w:sz w:val="17"/>
+        </w:rPr>
+        <w:t>[ ] Ran browser demonstration  [ ] Inspected website evidence  |  Optional: [ ] Inspected code/local reproduction  [ ] Ran tests</w:t>
       </w:r>
     </w:p>
     <w:p>
@@ -584,7 +599,7 @@
           <w:color w:val="1C2731"/>
           <w:sz w:val="17"/>
         </w:rPr>
-        <w:t>Result observed by reviewer, if reproduced: _____________________________________________</w:t>
+        <w:t>Result observed in browser or local reproduction: __________________________________________</w:t>
       </w:r>
     </w:p>
     <w:p>

</xml_diff>

<commit_message>
Make independent review documents first
</commit_message>
<xml_diff>
--- a/docs/CCAF_Independent_Review_Response_Template.docx
+++ b/docs/CCAF_Independent_Review_Response_Template.docx
@@ -13,7 +13,7 @@
           <w:b/>
           <w:i w:val="0"/>
           <w:color w:val="193A5A"/>
-          <w:sz w:val="31"/>
+          <w:sz w:val="28"/>
         </w:rPr>
         <w:t>INDEPENDENT TECHNICAL REVIEW RESPONSE</w:t>
       </w:r>
@@ -29,7 +29,7 @@
           <w:b w:val="0"/>
           <w:i/>
           <w:color w:val="1C2731"/>
-          <w:sz w:val="20"/>
+          <w:sz w:val="18"/>
         </w:rPr>
         <w:t>Continuous Control Assurance Framework (CCAF), Version 1.3.1</w:t>
       </w:r>
@@ -44,15 +44,15 @@
           <w:b w:val="0"/>
           <w:i w:val="0"/>
           <w:color w:val="1C2731"/>
-          <w:sz w:val="18"/>
+          <w:sz w:val="17"/>
         </w:rPr>
-        <w:t>The release facts below are pre-filled for confirmation. Professional opinions must be written by the reviewer. Brief responses are acceptable; address only prompts relevant to the materials and procedures examined. The normal review can be completed through the website; GitHub and local reproduction are optional.</w:t>
+        <w:t>The release facts below are pre-filled for confirmation. Professional opinions must be written by the reviewer. Brief responses are acceptable. A documents-based design review is sufficient; source-code inspection and local reproduction are optional.</w:t>
       </w:r>
     </w:p>
     <w:p>
       <w:pPr>
         <w:keepNext/>
-        <w:spacing w:before="100" w:after="60"/>
+        <w:spacing w:before="60" w:after="40"/>
       </w:pPr>
       <w:r>
         <w:rPr>
@@ -86,7 +86,7 @@
       <w:tr>
         <w:tc>
           <w:tcPr>
-            <w:tcW w:type="dxa" w:w="5184"/>
+            <w:tcW w:type="dxa" w:w="5256"/>
             <w:vAlign w:val="center"/>
             <w:tcMar>
               <w:top w:w="90" w:type="dxa"/>
@@ -113,7 +113,7 @@
         </w:tc>
         <w:tc>
           <w:tcPr>
-            <w:tcW w:type="dxa" w:w="5184"/>
+            <w:tcW w:type="dxa" w:w="5256"/>
             <w:vAlign w:val="center"/>
             <w:tcMar>
               <w:top w:w="90" w:type="dxa"/>
@@ -142,7 +142,7 @@
       <w:tr>
         <w:tc>
           <w:tcPr>
-            <w:tcW w:type="dxa" w:w="5184"/>
+            <w:tcW w:type="dxa" w:w="5256"/>
             <w:vAlign w:val="center"/>
             <w:tcMar>
               <w:top w:w="90" w:type="dxa"/>
@@ -169,7 +169,7 @@
         </w:tc>
         <w:tc>
           <w:tcPr>
-            <w:tcW w:type="dxa" w:w="5184"/>
+            <w:tcW w:type="dxa" w:w="5256"/>
             <w:vAlign w:val="center"/>
             <w:tcMar>
               <w:top w:w="90" w:type="dxa"/>
@@ -198,7 +198,7 @@
       <w:tr>
         <w:tc>
           <w:tcPr>
-            <w:tcW w:type="dxa" w:w="5184"/>
+            <w:tcW w:type="dxa" w:w="5256"/>
             <w:vAlign w:val="center"/>
             <w:tcMar>
               <w:top w:w="90" w:type="dxa"/>
@@ -219,13 +219,13 @@
                 <w:color w:val="1C2731"/>
                 <w:sz w:val="17"/>
               </w:rPr>
-              <w:t>Review depth: [ ] Website methodology  [ ] Source-code  [ ] Detailed</w:t>
+              <w:t>Review depth: [ ] Documents  [ ] Source-code  [ ] Reproduction</w:t>
             </w:r>
           </w:p>
         </w:tc>
         <w:tc>
           <w:tcPr>
-            <w:tcW w:type="dxa" w:w="5184"/>
+            <w:tcW w:type="dxa" w:w="5256"/>
             <w:vAlign w:val="center"/>
             <w:tcMar>
               <w:top w:w="90" w:type="dxa"/>
@@ -255,7 +255,7 @@
     <w:p>
       <w:pPr>
         <w:keepNext/>
-        <w:spacing w:before="100" w:after="60"/>
+        <w:spacing w:before="60" w:after="40"/>
       </w:pPr>
       <w:r>
         <w:rPr>
@@ -289,7 +289,7 @@
       <w:tr>
         <w:tc>
           <w:tcPr>
-            <w:tcW w:type="dxa" w:w="5184"/>
+            <w:tcW w:type="dxa" w:w="5256"/>
             <w:shd w:fill="EAF0F5"/>
             <w:vAlign w:val="center"/>
             <w:tcMar>
@@ -308,13 +308,13 @@
                 <w:color w:val="1C2731"/>
                 <w:sz w:val="17"/>
               </w:rPr>
-              <w:t>Interactive website</w:t>
+              <w:t>Methodology summary</w:t>
             </w:r>
           </w:p>
         </w:tc>
         <w:tc>
           <w:tcPr>
-            <w:tcW w:type="dxa" w:w="5184"/>
+            <w:tcW w:type="dxa" w:w="5256"/>
             <w:vAlign w:val="center"/>
             <w:tcMar>
               <w:top w:w="65" w:type="dxa"/>
@@ -332,7 +332,7 @@
                 <w:color w:val="1C2731"/>
                 <w:sz w:val="17"/>
               </w:rPr>
-              <w:t>continuous-control-assurance.streamlit.app</w:t>
+              <w:t>CCAF Framework Methodology, Version 1.3.1</w:t>
             </w:r>
           </w:p>
         </w:tc>
@@ -340,7 +340,58 @@
       <w:tr>
         <w:tc>
           <w:tcPr>
-            <w:tcW w:type="dxa" w:w="5184"/>
+            <w:tcW w:type="dxa" w:w="5256"/>
+            <w:shd w:fill="EAF0F5"/>
+            <w:vAlign w:val="center"/>
+            <w:tcMar>
+              <w:top w:w="65" w:type="dxa"/>
+              <w:start w:w="100" w:type="dxa"/>
+              <w:bottom w:w="65" w:type="dxa"/>
+              <w:end w:w="100" w:type="dxa"/>
+            </w:tcMar>
+          </w:tcPr>
+          <w:p>
+            <w:r>
+              <w:rPr>
+                <w:rFonts w:ascii="Arial" w:hAnsi="Arial"/>
+                <w:b/>
+                <w:i w:val="0"/>
+                <w:color w:val="1C2731"/>
+                <w:sz w:val="17"/>
+              </w:rPr>
+              <w:t>Control work program</w:t>
+            </w:r>
+          </w:p>
+        </w:tc>
+        <w:tc>
+          <w:tcPr>
+            <w:tcW w:type="dxa" w:w="5256"/>
+            <w:vAlign w:val="center"/>
+            <w:tcMar>
+              <w:top w:w="65" w:type="dxa"/>
+              <w:start w:w="100" w:type="dxa"/>
+              <w:bottom w:w="65" w:type="dxa"/>
+              <w:end w:w="100" w:type="dxa"/>
+            </w:tcMar>
+          </w:tcPr>
+          <w:p>
+            <w:r>
+              <w:rPr>
+                <w:rFonts w:ascii="Arial" w:hAnsi="Arial"/>
+                <w:b w:val="0"/>
+                <w:i w:val="0"/>
+                <w:color w:val="1C2731"/>
+                <w:sz w:val="17"/>
+              </w:rPr>
+              <w:t>CCAF Control-Test Catalog, Version 1.3.1</w:t>
+            </w:r>
+          </w:p>
+        </w:tc>
+      </w:tr>
+      <w:tr>
+        <w:tc>
+          <w:tcPr>
+            <w:tcW w:type="dxa" w:w="5256"/>
             <w:shd w:fill="EAF0F5"/>
             <w:vAlign w:val="center"/>
             <w:tcMar>
@@ -365,7 +416,7 @@
         </w:tc>
         <w:tc>
           <w:tcPr>
-            <w:tcW w:type="dxa" w:w="5184"/>
+            <w:tcW w:type="dxa" w:w="5256"/>
             <w:vAlign w:val="center"/>
             <w:tcMar>
               <w:top w:w="65" w:type="dxa"/>
@@ -391,7 +442,7 @@
       <w:tr>
         <w:tc>
           <w:tcPr>
-            <w:tcW w:type="dxa" w:w="5184"/>
+            <w:tcW w:type="dxa" w:w="5256"/>
             <w:shd w:fill="EAF0F5"/>
             <w:vAlign w:val="center"/>
             <w:tcMar>
@@ -416,7 +467,7 @@
         </w:tc>
         <w:tc>
           <w:tcPr>
-            <w:tcW w:type="dxa" w:w="5184"/>
+            <w:tcW w:type="dxa" w:w="5256"/>
             <w:vAlign w:val="center"/>
             <w:tcMar>
               <w:top w:w="65" w:type="dxa"/>
@@ -442,7 +493,7 @@
       <w:tr>
         <w:tc>
           <w:tcPr>
-            <w:tcW w:type="dxa" w:w="5184"/>
+            <w:tcW w:type="dxa" w:w="5256"/>
             <w:shd w:fill="EAF0F5"/>
             <w:vAlign w:val="center"/>
             <w:tcMar>
@@ -467,7 +518,7 @@
         </w:tc>
         <w:tc>
           <w:tcPr>
-            <w:tcW w:type="dxa" w:w="5184"/>
+            <w:tcW w:type="dxa" w:w="5256"/>
             <w:vAlign w:val="center"/>
             <w:tcMar>
               <w:top w:w="65" w:type="dxa"/>
@@ -490,57 +541,6 @@
           </w:p>
         </w:tc>
       </w:tr>
-      <w:tr>
-        <w:tc>
-          <w:tcPr>
-            <w:tcW w:type="dxa" w:w="5184"/>
-            <w:shd w:fill="EAF0F5"/>
-            <w:vAlign w:val="center"/>
-            <w:tcMar>
-              <w:top w:w="65" w:type="dxa"/>
-              <w:start w:w="100" w:type="dxa"/>
-              <w:bottom w:w="65" w:type="dxa"/>
-              <w:end w:w="100" w:type="dxa"/>
-            </w:tcMar>
-          </w:tcPr>
-          <w:p>
-            <w:r>
-              <w:rPr>
-                <w:rFonts w:ascii="Arial" w:hAnsi="Arial"/>
-                <w:b/>
-                <w:i w:val="0"/>
-                <w:color w:val="1C2731"/>
-                <w:sz w:val="17"/>
-              </w:rPr>
-              <w:t>Review emphasis</w:t>
-            </w:r>
-          </w:p>
-        </w:tc>
-        <w:tc>
-          <w:tcPr>
-            <w:tcW w:type="dxa" w:w="5184"/>
-            <w:vAlign w:val="center"/>
-            <w:tcMar>
-              <w:top w:w="65" w:type="dxa"/>
-              <w:start w:w="100" w:type="dxa"/>
-              <w:bottom w:w="65" w:type="dxa"/>
-              <w:end w:w="100" w:type="dxa"/>
-            </w:tcMar>
-          </w:tcPr>
-          <w:p>
-            <w:r>
-              <w:rPr>
-                <w:rFonts w:ascii="Arial" w:hAnsi="Arial"/>
-                <w:b w:val="0"/>
-                <w:i w:val="0"/>
-                <w:color w:val="1C2731"/>
-                <w:sz w:val="17"/>
-              </w:rPr>
-              <w:t>Methodology, professional coherence, boundaries, and institutional adaptability</w:t>
-            </w:r>
-          </w:p>
-        </w:tc>
-      </w:tr>
     </w:tbl>
     <w:p>
       <w:pPr>
@@ -554,7 +554,7 @@
           <w:color w:val="1C2731"/>
           <w:sz w:val="17"/>
         </w:rPr>
-        <w:t>Procedures personally performed:  [ ] Reviewed website methodology/limitations  [ ] Inspected selected control procedures/logic</w:t>
+        <w:t>Procedures personally performed:  [ ] Reviewed methodology/limitations  [ ] Reviewed catalog and selected procedures</w:t>
       </w:r>
     </w:p>
     <w:p>
@@ -569,7 +569,7 @@
           <w:color w:val="1C2731"/>
           <w:sz w:val="17"/>
         </w:rPr>
-        <w:t>[ ] Ran browser demonstration  [ ] Inspected website evidence  |  Optional: [ ] Inspected code/local reproduction  [ ] Ran tests</w:t>
+        <w:t>Optional: [ ] Inspected repository artifacts/code  [ ] Reproduced seed-42 run  [ ] Ran automated tests</w:t>
       </w:r>
     </w:p>
     <w:p>
@@ -599,13 +599,13 @@
           <w:color w:val="1C2731"/>
           <w:sz w:val="17"/>
         </w:rPr>
-        <w:t>Result observed in browser or local reproduction: __________________________________________</w:t>
+        <w:t>Result and seed observed, if locally reproduced: __________________________________________</w:t>
       </w:r>
     </w:p>
     <w:p>
       <w:pPr>
         <w:keepNext/>
-        <w:spacing w:before="100" w:after="60"/>
+        <w:spacing w:before="60" w:after="40"/>
       </w:pPr>
       <w:r>
         <w:rPr>
@@ -621,7 +621,7 @@
     <w:p>
       <w:pPr>
         <w:keepNext/>
-        <w:spacing w:before="80" w:after="60"/>
+        <w:spacing w:before="40" w:after="20"/>
       </w:pPr>
       <w:r>
         <w:rPr>
@@ -629,7 +629,7 @@
           <w:b/>
           <w:i w:val="0"/>
           <w:color w:val="1C2731"/>
-          <w:sz w:val="18"/>
+          <w:sz w:val="17"/>
         </w:rPr>
         <w:t xml:space="preserve">Technical soundness: </w:t>
       </w:r>
@@ -639,7 +639,7 @@
           <w:b/>
           <w:i w:val="0"/>
           <w:color w:val="1C2731"/>
-          <w:sz w:val="18"/>
+          <w:sz w:val="17"/>
         </w:rPr>
         <w:t>Is the methodology technically sound and consistent with professional control-testing practice for a synthetic reference prototype?</w:t>
       </w:r>
@@ -663,17 +663,17 @@
       </w:tblGrid>
       <w:tr>
         <w:trPr>
-          <w:trHeight w:val="1800" w:hRule="atLeast"/>
+          <w:trHeight w:val="691" w:hRule="atLeast"/>
         </w:trPr>
         <w:tc>
           <w:tcPr>
             <w:tcW w:type="dxa" w:w="10296"/>
             <w:vAlign w:val="top"/>
             <w:tcMar>
-              <w:top w:w="100" w:type="dxa"/>
-              <w:start w:w="110" w:type="dxa"/>
-              <w:bottom w:w="100" w:type="dxa"/>
-              <w:end w:w="110" w:type="dxa"/>
+              <w:top w:w="65" w:type="dxa"/>
+              <w:start w:w="95" w:type="dxa"/>
+              <w:bottom w:w="65" w:type="dxa"/>
+              <w:end w:w="95" w:type="dxa"/>
             </w:tcMar>
           </w:tcPr>
           <w:p>
@@ -686,9 +686,9 @@
                 <w:b w:val="0"/>
                 <w:i/>
                 <w:color w:val="646464"/>
-                <w:sz w:val="18"/>
+                <w:sz w:val="17"/>
               </w:rPr>
-              <w:t>[Type response here]</w:t>
+              <w:t>[Brief response]</w:t>
             </w:r>
           </w:p>
         </w:tc>
@@ -697,7 +697,7 @@
     <w:p>
       <w:pPr>
         <w:keepNext/>
-        <w:spacing w:before="80" w:after="60"/>
+        <w:spacing w:before="40" w:after="20"/>
       </w:pPr>
       <w:r>
         <w:rPr>
@@ -705,7 +705,7 @@
           <w:b/>
           <w:i w:val="0"/>
           <w:color w:val="1C2731"/>
-          <w:sz w:val="18"/>
+          <w:sz w:val="17"/>
         </w:rPr>
         <w:t xml:space="preserve">Claims and limitations: </w:t>
       </w:r>
@@ -715,7 +715,7 @@
           <w:b/>
           <w:i w:val="0"/>
           <w:color w:val="1C2731"/>
-          <w:sz w:val="18"/>
+          <w:sz w:val="17"/>
         </w:rPr>
         <w:t>Are the claims appropriately bounded to what the demonstration establishes?</w:t>
       </w:r>
@@ -739,17 +739,17 @@
       </w:tblGrid>
       <w:tr>
         <w:trPr>
-          <w:trHeight w:val="1800" w:hRule="atLeast"/>
+          <w:trHeight w:val="691" w:hRule="atLeast"/>
         </w:trPr>
         <w:tc>
           <w:tcPr>
             <w:tcW w:type="dxa" w:w="10296"/>
             <w:vAlign w:val="top"/>
             <w:tcMar>
-              <w:top w:w="100" w:type="dxa"/>
-              <w:start w:w="110" w:type="dxa"/>
-              <w:bottom w:w="100" w:type="dxa"/>
-              <w:end w:w="110" w:type="dxa"/>
+              <w:top w:w="65" w:type="dxa"/>
+              <w:start w:w="95" w:type="dxa"/>
+              <w:bottom w:w="65" w:type="dxa"/>
+              <w:end w:w="95" w:type="dxa"/>
             </w:tcMar>
           </w:tcPr>
           <w:p>
@@ -762,39 +762,18 @@
                 <w:b w:val="0"/>
                 <w:i/>
                 <w:color w:val="646464"/>
-                <w:sz w:val="18"/>
+                <w:sz w:val="17"/>
               </w:rPr>
-              <w:t>[Type response here]</w:t>
+              <w:t>[Brief response]</w:t>
             </w:r>
           </w:p>
         </w:tc>
       </w:tr>
     </w:tbl>
     <w:p>
-      <w:r>
-        <w:br w:type="page"/>
-      </w:r>
-    </w:p>
-    <w:p>
-      <w:pPr>
-        <w:spacing w:after="100"/>
-        <w:jc w:val="center"/>
-      </w:pPr>
-      <w:r>
-        <w:rPr>
-          <w:rFonts w:ascii="Arial" w:hAnsi="Arial"/>
-          <w:b/>
-          <w:i w:val="0"/>
-          <w:color w:val="193A5A"/>
-          <w:sz w:val="25"/>
-        </w:rPr>
-        <w:t>INDEPENDENT TECHNICAL REVIEW RESPONSE (CONTINUED)</w:t>
-      </w:r>
-    </w:p>
-    <w:p>
       <w:pPr>
         <w:keepNext/>
-        <w:spacing w:before="80" w:after="60"/>
+        <w:spacing w:before="40" w:after="20"/>
       </w:pPr>
       <w:r>
         <w:rPr>
@@ -802,7 +781,7 @@
           <w:b/>
           <w:i w:val="0"/>
           <w:color w:val="1C2731"/>
-          <w:sz w:val="18"/>
+          <w:sz w:val="17"/>
         </w:rPr>
         <w:t xml:space="preserve">Transferability: </w:t>
       </w:r>
@@ -812,7 +791,7 @@
           <w:b/>
           <w:i w:val="0"/>
           <w:color w:val="1C2731"/>
-          <w:sz w:val="18"/>
+          <w:sz w:val="17"/>
         </w:rPr>
         <w:t>In your professional judgment, could this methodology be adapted by other institutions or practitioners to their own authorized data and control environments?</w:t>
       </w:r>
@@ -836,17 +815,17 @@
       </w:tblGrid>
       <w:tr>
         <w:trPr>
-          <w:trHeight w:val="2952" w:hRule="atLeast"/>
+          <w:trHeight w:val="691" w:hRule="atLeast"/>
         </w:trPr>
         <w:tc>
           <w:tcPr>
             <w:tcW w:type="dxa" w:w="10296"/>
             <w:vAlign w:val="top"/>
             <w:tcMar>
-              <w:top w:w="100" w:type="dxa"/>
-              <w:start w:w="110" w:type="dxa"/>
-              <w:bottom w:w="100" w:type="dxa"/>
-              <w:end w:w="110" w:type="dxa"/>
+              <w:top w:w="65" w:type="dxa"/>
+              <w:start w:w="95" w:type="dxa"/>
+              <w:bottom w:w="65" w:type="dxa"/>
+              <w:end w:w="95" w:type="dxa"/>
             </w:tcMar>
           </w:tcPr>
           <w:p>
@@ -859,9 +838,9 @@
                 <w:b w:val="0"/>
                 <w:i/>
                 <w:color w:val="646464"/>
-                <w:sz w:val="18"/>
+                <w:sz w:val="17"/>
               </w:rPr>
-              <w:t>[Type response here]</w:t>
+              <w:t>[Brief response]</w:t>
             </w:r>
           </w:p>
         </w:tc>
@@ -870,7 +849,7 @@
     <w:p>
       <w:pPr>
         <w:keepNext/>
-        <w:spacing w:before="80" w:after="60"/>
+        <w:spacing w:before="40" w:after="20"/>
       </w:pPr>
       <w:r>
         <w:rPr>
@@ -878,7 +857,7 @@
           <w:b/>
           <w:i w:val="0"/>
           <w:color w:val="1C2731"/>
-          <w:sz w:val="18"/>
+          <w:sz w:val="17"/>
         </w:rPr>
         <w:t xml:space="preserve">Observations: </w:t>
       </w:r>
@@ -888,7 +867,7 @@
           <w:b/>
           <w:i w:val="0"/>
           <w:color w:val="1C2731"/>
-          <w:sz w:val="18"/>
+          <w:sz w:val="17"/>
         </w:rPr>
         <w:t>What strengths, limitations, or improvements, if any, would you note?</w:t>
       </w:r>
@@ -912,17 +891,17 @@
       </w:tblGrid>
       <w:tr>
         <w:trPr>
-          <w:trHeight w:val="2952" w:hRule="atLeast"/>
+          <w:trHeight w:val="691" w:hRule="atLeast"/>
         </w:trPr>
         <w:tc>
           <w:tcPr>
             <w:tcW w:type="dxa" w:w="10296"/>
             <w:vAlign w:val="top"/>
             <w:tcMar>
-              <w:top w:w="100" w:type="dxa"/>
-              <w:start w:w="110" w:type="dxa"/>
-              <w:bottom w:w="100" w:type="dxa"/>
-              <w:end w:w="110" w:type="dxa"/>
+              <w:top w:w="65" w:type="dxa"/>
+              <w:start w:w="95" w:type="dxa"/>
+              <w:bottom w:w="65" w:type="dxa"/>
+              <w:end w:w="95" w:type="dxa"/>
             </w:tcMar>
           </w:tcPr>
           <w:p>
@@ -935,9 +914,9 @@
                 <w:b w:val="0"/>
                 <w:i/>
                 <w:color w:val="646464"/>
-                <w:sz w:val="18"/>
+                <w:sz w:val="17"/>
               </w:rPr>
-              <w:t>[Type response here]</w:t>
+              <w:t>[Brief response]</w:t>
             </w:r>
           </w:p>
         </w:tc>
@@ -945,7 +924,7 @@
     </w:tbl>
     <w:p>
       <w:pPr>
-        <w:spacing w:before="140" w:after="40"/>
+        <w:spacing w:before="60" w:after="20"/>
       </w:pPr>
       <w:r>
         <w:rPr>
@@ -971,7 +950,7 @@
     <w:p>
       <w:pPr>
         <w:keepNext/>
-        <w:spacing w:after="140"/>
+        <w:spacing w:after="60"/>
       </w:pPr>
       <w:r>
         <w:rPr>
@@ -1087,7 +1066,7 @@
     </w:tbl>
     <w:sectPr>
       <w:pgSz w:w="12240" w:h="15840"/>
-      <w:pgMar w:top="792" w:right="936" w:bottom="792" w:left="936" w:header="720" w:footer="720" w:gutter="0"/>
+      <w:pgMar w:top="576" w:right="864" w:bottom="576" w:left="864" w:header="720" w:footer="720" w:gutter="0"/>
       <w:cols w:space="720"/>
       <w:docGrid w:linePitch="360"/>
     </w:sectPr>

</xml_diff>

<commit_message>
Strengthen independent review package
</commit_message>
<xml_diff>
--- a/docs/CCAF_Independent_Review_Response_Template.docx
+++ b/docs/CCAF_Independent_Review_Response_Template.docx
@@ -107,7 +107,7 @@
                 <w:color w:val="1C2731"/>
                 <w:sz w:val="17"/>
               </w:rPr>
-              <w:t>Reviewer name and role: __________________________</w:t>
+              <w:t>Reviewer name: __________________________</w:t>
             </w:r>
           </w:p>
         </w:tc>
@@ -134,7 +134,7 @@
                 <w:color w:val="1C2731"/>
                 <w:sz w:val="17"/>
               </w:rPr>
-              <w:t>Relevant experience: __________________________</w:t>
+              <w:t>Current professional title: __________________________</w:t>
             </w:r>
           </w:p>
         </w:tc>
@@ -163,7 +163,7 @@
                 <w:color w:val="1C2731"/>
                 <w:sz w:val="17"/>
               </w:rPr>
-              <w:t>Review date: __________________________</w:t>
+              <w:t>Organization: __________________________</w:t>
             </w:r>
           </w:p>
         </w:tc>
@@ -190,7 +190,7 @@
                 <w:color w:val="1C2731"/>
                 <w:sz w:val="17"/>
               </w:rPr>
-              <w:t>Prior relationship, conflict, or compensation, if any: __________________</w:t>
+              <w:t>Email or telephone: __________________________</w:t>
             </w:r>
           </w:p>
         </w:tc>
@@ -219,7 +219,7 @@
                 <w:color w:val="1C2731"/>
                 <w:sz w:val="17"/>
               </w:rPr>
-              <w:t>Review depth: [ ] Documents  [ ] Source-code  [ ] Reproduction</w:t>
+              <w:t>Relevant experience: __________________________</w:t>
             </w:r>
           </w:p>
         </w:tc>
@@ -246,7 +246,63 @@
                 <w:color w:val="1C2731"/>
                 <w:sz w:val="17"/>
               </w:rPr>
-              <w:t>Release/commit examined: v1.3.1 / __________</w:t>
+              <w:t>Review date: __________________________</w:t>
+            </w:r>
+          </w:p>
+        </w:tc>
+      </w:tr>
+      <w:tr>
+        <w:tc>
+          <w:tcPr>
+            <w:tcW w:type="dxa" w:w="5256"/>
+            <w:vAlign w:val="center"/>
+            <w:tcMar>
+              <w:top w:w="90" w:type="dxa"/>
+              <w:start w:w="100" w:type="dxa"/>
+              <w:bottom w:w="90" w:type="dxa"/>
+              <w:end w:w="100" w:type="dxa"/>
+            </w:tcMar>
+          </w:tcPr>
+          <w:p>
+            <w:pPr>
+              <w:spacing w:after="0"/>
+            </w:pPr>
+            <w:r>
+              <w:rPr>
+                <w:rFonts w:ascii="Arial" w:hAnsi="Arial"/>
+                <w:b/>
+                <w:i w:val="0"/>
+                <w:color w:val="1C2731"/>
+                <w:sz w:val="17"/>
+              </w:rPr>
+              <w:t>Prior relationship, conflict, or compensation, if any: __________________</w:t>
+            </w:r>
+          </w:p>
+        </w:tc>
+        <w:tc>
+          <w:tcPr>
+            <w:tcW w:type="dxa" w:w="5256"/>
+            <w:vAlign w:val="center"/>
+            <w:tcMar>
+              <w:top w:w="90" w:type="dxa"/>
+              <w:start w:w="100" w:type="dxa"/>
+              <w:bottom w:w="90" w:type="dxa"/>
+              <w:end w:w="100" w:type="dxa"/>
+            </w:tcMar>
+          </w:tcPr>
+          <w:p>
+            <w:pPr>
+              <w:spacing w:after="0"/>
+            </w:pPr>
+            <w:r>
+              <w:rPr>
+                <w:rFonts w:ascii="Arial" w:hAnsi="Arial"/>
+                <w:b/>
+                <w:i w:val="0"/>
+                <w:color w:val="1C2731"/>
+                <w:sz w:val="17"/>
+              </w:rPr>
+              <w:t>Review depth: [ ] Documents  [ ] Source-code  [ ] Reproduction</w:t>
             </w:r>
           </w:p>
         </w:tc>
@@ -308,7 +364,7 @@
                 <w:color w:val="1C2731"/>
                 <w:sz w:val="17"/>
               </w:rPr>
-              <w:t>Methodology summary</w:t>
+              <w:t>Documents reviewed</w:t>
             </w:r>
           </w:p>
         </w:tc>
@@ -332,7 +388,7 @@
                 <w:color w:val="1C2731"/>
                 <w:sz w:val="17"/>
               </w:rPr>
-              <w:t>CCAF Framework Methodology, Version 1.3.1</w:t>
+              <w:t>CCAF Framework Methodology and Control-Test Catalog, Version 1.3.1</w:t>
             </w:r>
           </w:p>
         </w:tc>
@@ -359,7 +415,7 @@
                 <w:color w:val="1C2731"/>
                 <w:sz w:val="17"/>
               </w:rPr>
-              <w:t>Control work program</w:t>
+              <w:t>Review snapshot</w:t>
             </w:r>
           </w:p>
         </w:tc>
@@ -383,7 +439,7 @@
                 <w:color w:val="1C2731"/>
                 <w:sz w:val="17"/>
               </w:rPr>
-              <w:t>CCAF Control-Test Catalog, Version 1.3.1</w:t>
+              <w:t>review-v1.3.1</w:t>
             </w:r>
           </w:p>
         </w:tc>
@@ -434,7 +490,7 @@
                 <w:color w:val="1C2731"/>
                 <w:sz w:val="17"/>
               </w:rPr>
-              <w:t>github.com/Ayodele-Adeniyi/continuous-control-assurance-framework | Apache-2.0</w:t>
+              <w:t>github.com/Ayodele-Adeniyi/continuous-control-assurance-framework/tree/review-v1.3.1 | Apache-2.0</w:t>
             </w:r>
           </w:p>
         </w:tc>
@@ -536,7 +592,7 @@
                 <w:color w:val="1C2731"/>
                 <w:sz w:val="17"/>
               </w:rPr>
-              <w:t>165 of 165 deliberately planted conditions detected under the official seed-42 benchmark</w:t>
+              <w:t>165 of 165 deliberately planted conditions detected under the official seed-42 benchmark; 3 additional peer-comparison observations reported separately; 168 total exceptions</w:t>
             </w:r>
           </w:p>
         </w:tc>
@@ -570,6 +626,21 @@
           <w:sz w:val="17"/>
         </w:rPr>
         <w:t>Optional: [ ] Inspected repository artifacts/code  [ ] Reproduced seed-42 run  [ ] Ran automated tests</w:t>
+      </w:r>
+    </w:p>
+    <w:p>
+      <w:pPr>
+        <w:spacing w:after="20"/>
+      </w:pPr>
+      <w:r>
+        <w:rPr>
+          <w:rFonts w:ascii="Arial" w:hAnsi="Arial"/>
+          <w:b w:val="0"/>
+          <w:i w:val="0"/>
+          <w:color w:val="1C2731"/>
+          <w:sz w:val="17"/>
+        </w:rPr>
+        <w:t>Catalog scope personally examined: [ ] All 20 controls  [ ] Selected modules/control IDs: __________________</w:t>
       </w:r>
     </w:p>
     <w:p>
@@ -663,7 +734,7 @@
       </w:tblGrid>
       <w:tr>
         <w:trPr>
-          <w:trHeight w:val="691" w:hRule="atLeast"/>
+          <w:trHeight w:val="634" w:hRule="atLeast"/>
         </w:trPr>
         <w:tc>
           <w:tcPr>
@@ -739,7 +810,7 @@
       </w:tblGrid>
       <w:tr>
         <w:trPr>
-          <w:trHeight w:val="691" w:hRule="atLeast"/>
+          <w:trHeight w:val="634" w:hRule="atLeast"/>
         </w:trPr>
         <w:tc>
           <w:tcPr>
@@ -815,7 +886,7 @@
       </w:tblGrid>
       <w:tr>
         <w:trPr>
-          <w:trHeight w:val="691" w:hRule="atLeast"/>
+          <w:trHeight w:val="634" w:hRule="atLeast"/>
         </w:trPr>
         <w:tc>
           <w:tcPr>
@@ -891,7 +962,7 @@
       </w:tblGrid>
       <w:tr>
         <w:trPr>
-          <w:trHeight w:val="691" w:hRule="atLeast"/>
+          <w:trHeight w:val="634" w:hRule="atLeast"/>
         </w:trPr>
         <w:tc>
           <w:tcPr>

</xml_diff>

<commit_message>
Simplify independent review response form
</commit_message>
<xml_diff>
--- a/docs/CCAF_Independent_Review_Response_Template.docx
+++ b/docs/CCAF_Independent_Review_Response_Template.docx
@@ -4,7 +4,7 @@
   <w:body>
     <w:p>
       <w:pPr>
-        <w:spacing w:after="20"/>
+        <w:spacing w:after="10"/>
         <w:jc w:val="center"/>
       </w:pPr>
       <w:r>
@@ -13,14 +13,14 @@
           <w:b/>
           <w:i w:val="0"/>
           <w:color w:val="193A5A"/>
-          <w:sz w:val="28"/>
+          <w:sz w:val="26"/>
         </w:rPr>
         <w:t>INDEPENDENT TECHNICAL REVIEW RESPONSE</w:t>
       </w:r>
     </w:p>
     <w:p>
       <w:pPr>
-        <w:spacing w:after="120"/>
+        <w:spacing w:after="60"/>
         <w:jc w:val="center"/>
       </w:pPr>
       <w:r>
@@ -29,30 +29,30 @@
           <w:b w:val="0"/>
           <w:i/>
           <w:color w:val="1C2731"/>
-          <w:sz w:val="18"/>
+          <w:sz w:val="17"/>
         </w:rPr>
         <w:t>Continuous Control Assurance Framework (CCAF), Version 1.3.1</w:t>
       </w:r>
     </w:p>
     <w:p>
       <w:pPr>
-        <w:spacing w:after="80"/>
+        <w:spacing w:after="40"/>
       </w:pPr>
       <w:r>
         <w:rPr>
           <w:rFonts w:ascii="Arial" w:hAnsi="Arial"/>
           <w:b w:val="0"/>
           <w:i w:val="0"/>
-          <w:color w:val="1C2731"/>
-          <w:sz w:val="17"/>
+          <w:color w:val="56626C"/>
+          <w:sz w:val="15"/>
         </w:rPr>
-        <w:t>The release facts below are pre-filled for confirmation. Professional opinions must be written by the reviewer. Brief responses are acceptable. A documents-based design review is sufficient; source-code inspection and local reproduction are optional.</w:t>
+        <w:t>This concise form records the materials and procedures personally reviewed and the reviewer's independent professional judgment. A documents-based design review is sufficient; repository inspection and local reproduction are optional.</w:t>
       </w:r>
     </w:p>
     <w:p>
       <w:pPr>
         <w:keepNext/>
-        <w:spacing w:before="60" w:after="40"/>
+        <w:spacing w:before="50" w:after="30"/>
       </w:pPr>
       <w:r>
         <w:rPr>
@@ -60,39 +60,39 @@
           <w:b/>
           <w:i w:val="0"/>
           <w:color w:val="193A5A"/>
-          <w:sz w:val="23"/>
+          <w:sz w:val="20"/>
         </w:rPr>
-        <w:t>1. Reviewer and scope</w:t>
+        <w:t>1. Reviewer information</w:t>
       </w:r>
     </w:p>
     <w:tbl>
       <w:tblPr>
-        <w:tblW w:type="auto" w:w="0"/>
+        <w:tblW w:type="dxa" w:w="10656"/>
         <w:tblLayout w:type="fixed"/>
         <w:tblLook w:firstColumn="1" w:firstRow="1" w:lastColumn="0" w:lastRow="0" w:noHBand="0" w:noVBand="1" w:val="04A0"/>
         <w:tblBorders>
-          <w:top w:val="single" w:sz="6" w:color="8EA2B3"/>
-          <w:left w:val="single" w:sz="6" w:color="8EA2B3"/>
-          <w:bottom w:val="single" w:sz="6" w:color="8EA2B3"/>
-          <w:right w:val="single" w:sz="6" w:color="8EA2B3"/>
-          <w:insideH w:val="single" w:sz="6" w:color="8EA2B3"/>
-          <w:insideV w:val="single" w:sz="6" w:color="8EA2B3"/>
+          <w:top w:val="single" w:sz="5" w:color="8EA2B3"/>
+          <w:left w:val="single" w:sz="5" w:color="8EA2B3"/>
+          <w:bottom w:val="single" w:sz="5" w:color="8EA2B3"/>
+          <w:right w:val="single" w:sz="5" w:color="8EA2B3"/>
+          <w:insideH w:val="single" w:sz="5" w:color="8EA2B3"/>
+          <w:insideV w:val="single" w:sz="5" w:color="8EA2B3"/>
         </w:tblBorders>
       </w:tblPr>
       <w:tblGrid>
-        <w:gridCol w:w="5184"/>
-        <w:gridCol w:w="5112"/>
+        <w:gridCol w:w="5328"/>
+        <w:gridCol w:w="5328"/>
       </w:tblGrid>
       <w:tr>
         <w:tc>
           <w:tcPr>
-            <w:tcW w:type="dxa" w:w="5256"/>
+            <w:tcW w:type="dxa" w:w="5328"/>
             <w:vAlign w:val="center"/>
             <w:tcMar>
-              <w:top w:w="90" w:type="dxa"/>
-              <w:start w:w="100" w:type="dxa"/>
-              <w:bottom w:w="90" w:type="dxa"/>
-              <w:end w:w="100" w:type="dxa"/>
+              <w:top w:w="65" w:type="dxa"/>
+              <w:start w:w="90" w:type="dxa"/>
+              <w:bottom w:w="65" w:type="dxa"/>
+              <w:end w:w="90" w:type="dxa"/>
             </w:tcMar>
           </w:tcPr>
           <w:p>
@@ -105,7 +105,7 @@
                 <w:b/>
                 <w:i w:val="0"/>
                 <w:color w:val="1C2731"/>
-                <w:sz w:val="17"/>
+                <w:sz w:val="15"/>
               </w:rPr>
               <w:t>Reviewer name: __________________________</w:t>
             </w:r>
@@ -113,13 +113,13 @@
         </w:tc>
         <w:tc>
           <w:tcPr>
-            <w:tcW w:type="dxa" w:w="5256"/>
+            <w:tcW w:type="dxa" w:w="5328"/>
             <w:vAlign w:val="center"/>
             <w:tcMar>
-              <w:top w:w="90" w:type="dxa"/>
-              <w:start w:w="100" w:type="dxa"/>
-              <w:bottom w:w="90" w:type="dxa"/>
-              <w:end w:w="100" w:type="dxa"/>
+              <w:top w:w="65" w:type="dxa"/>
+              <w:start w:w="90" w:type="dxa"/>
+              <w:bottom w:w="65" w:type="dxa"/>
+              <w:end w:w="90" w:type="dxa"/>
             </w:tcMar>
           </w:tcPr>
           <w:p>
@@ -132,7 +132,7 @@
                 <w:b/>
                 <w:i w:val="0"/>
                 <w:color w:val="1C2731"/>
-                <w:sz w:val="17"/>
+                <w:sz w:val="15"/>
               </w:rPr>
               <w:t>Current professional title: __________________________</w:t>
             </w:r>
@@ -142,13 +142,13 @@
       <w:tr>
         <w:tc>
           <w:tcPr>
-            <w:tcW w:type="dxa" w:w="5256"/>
+            <w:tcW w:type="dxa" w:w="5328"/>
             <w:vAlign w:val="center"/>
             <w:tcMar>
-              <w:top w:w="90" w:type="dxa"/>
-              <w:start w:w="100" w:type="dxa"/>
-              <w:bottom w:w="90" w:type="dxa"/>
-              <w:end w:w="100" w:type="dxa"/>
+              <w:top w:w="65" w:type="dxa"/>
+              <w:start w:w="90" w:type="dxa"/>
+              <w:bottom w:w="65" w:type="dxa"/>
+              <w:end w:w="90" w:type="dxa"/>
             </w:tcMar>
           </w:tcPr>
           <w:p>
@@ -161,7 +161,7 @@
                 <w:b/>
                 <w:i w:val="0"/>
                 <w:color w:val="1C2731"/>
-                <w:sz w:val="17"/>
+                <w:sz w:val="15"/>
               </w:rPr>
               <w:t>Organization: __________________________</w:t>
             </w:r>
@@ -169,13 +169,13 @@
         </w:tc>
         <w:tc>
           <w:tcPr>
-            <w:tcW w:type="dxa" w:w="5256"/>
+            <w:tcW w:type="dxa" w:w="5328"/>
             <w:vAlign w:val="center"/>
             <w:tcMar>
-              <w:top w:w="90" w:type="dxa"/>
-              <w:start w:w="100" w:type="dxa"/>
-              <w:bottom w:w="90" w:type="dxa"/>
-              <w:end w:w="100" w:type="dxa"/>
+              <w:top w:w="65" w:type="dxa"/>
+              <w:start w:w="90" w:type="dxa"/>
+              <w:bottom w:w="65" w:type="dxa"/>
+              <w:end w:w="90" w:type="dxa"/>
             </w:tcMar>
           </w:tcPr>
           <w:p>
@@ -188,7 +188,7 @@
                 <w:b/>
                 <w:i w:val="0"/>
                 <w:color w:val="1C2731"/>
-                <w:sz w:val="17"/>
+                <w:sz w:val="15"/>
               </w:rPr>
               <w:t>Email or telephone: __________________________</w:t>
             </w:r>
@@ -198,13 +198,13 @@
       <w:tr>
         <w:tc>
           <w:tcPr>
-            <w:tcW w:type="dxa" w:w="5256"/>
+            <w:tcW w:type="dxa" w:w="5328"/>
             <w:vAlign w:val="center"/>
             <w:tcMar>
-              <w:top w:w="90" w:type="dxa"/>
-              <w:start w:w="100" w:type="dxa"/>
-              <w:bottom w:w="90" w:type="dxa"/>
-              <w:end w:w="100" w:type="dxa"/>
+              <w:top w:w="65" w:type="dxa"/>
+              <w:start w:w="90" w:type="dxa"/>
+              <w:bottom w:w="65" w:type="dxa"/>
+              <w:end w:w="90" w:type="dxa"/>
             </w:tcMar>
           </w:tcPr>
           <w:p>
@@ -217,21 +217,21 @@
                 <w:b/>
                 <w:i w:val="0"/>
                 <w:color w:val="1C2731"/>
-                <w:sz w:val="17"/>
+                <w:sz w:val="15"/>
               </w:rPr>
-              <w:t>Relevant experience: __________________________</w:t>
+              <w:t>Relevant experience (brief): __________________</w:t>
             </w:r>
           </w:p>
         </w:tc>
         <w:tc>
           <w:tcPr>
-            <w:tcW w:type="dxa" w:w="5256"/>
+            <w:tcW w:type="dxa" w:w="5328"/>
             <w:vAlign w:val="center"/>
             <w:tcMar>
-              <w:top w:w="90" w:type="dxa"/>
-              <w:start w:w="100" w:type="dxa"/>
-              <w:bottom w:w="90" w:type="dxa"/>
-              <w:end w:w="100" w:type="dxa"/>
+              <w:top w:w="65" w:type="dxa"/>
+              <w:start w:w="90" w:type="dxa"/>
+              <w:bottom w:w="65" w:type="dxa"/>
+              <w:end w:w="90" w:type="dxa"/>
             </w:tcMar>
           </w:tcPr>
           <w:p>
@@ -244,7 +244,7 @@
                 <w:b/>
                 <w:i w:val="0"/>
                 <w:color w:val="1C2731"/>
-                <w:sz w:val="17"/>
+                <w:sz w:val="15"/>
               </w:rPr>
               <w:t>Review date: __________________________</w:t>
             </w:r>
@@ -254,105 +254,13 @@
       <w:tr>
         <w:tc>
           <w:tcPr>
-            <w:tcW w:type="dxa" w:w="5256"/>
-            <w:vAlign w:val="center"/>
-            <w:tcMar>
-              <w:top w:w="90" w:type="dxa"/>
-              <w:start w:w="100" w:type="dxa"/>
-              <w:bottom w:w="90" w:type="dxa"/>
-              <w:end w:w="100" w:type="dxa"/>
-            </w:tcMar>
-          </w:tcPr>
-          <w:p>
-            <w:pPr>
-              <w:spacing w:after="0"/>
-            </w:pPr>
-            <w:r>
-              <w:rPr>
-                <w:rFonts w:ascii="Arial" w:hAnsi="Arial"/>
-                <w:b/>
-                <w:i w:val="0"/>
-                <w:color w:val="1C2731"/>
-                <w:sz w:val="17"/>
-              </w:rPr>
-              <w:t>Prior relationship, conflict, or compensation, if any: __________________</w:t>
-            </w:r>
-          </w:p>
-        </w:tc>
-        <w:tc>
-          <w:tcPr>
-            <w:tcW w:type="dxa" w:w="5256"/>
-            <w:vAlign w:val="center"/>
-            <w:tcMar>
-              <w:top w:w="90" w:type="dxa"/>
-              <w:start w:w="100" w:type="dxa"/>
-              <w:bottom w:w="90" w:type="dxa"/>
-              <w:end w:w="100" w:type="dxa"/>
-            </w:tcMar>
-          </w:tcPr>
-          <w:p>
-            <w:pPr>
-              <w:spacing w:after="0"/>
-            </w:pPr>
-            <w:r>
-              <w:rPr>
-                <w:rFonts w:ascii="Arial" w:hAnsi="Arial"/>
-                <w:b/>
-                <w:i w:val="0"/>
-                <w:color w:val="1C2731"/>
-                <w:sz w:val="17"/>
-              </w:rPr>
-              <w:t>Review depth: [ ] Documents  [ ] Source-code  [ ] Reproduction</w:t>
-            </w:r>
-          </w:p>
-        </w:tc>
-      </w:tr>
-    </w:tbl>
-    <w:p>
-      <w:pPr>
-        <w:keepNext/>
-        <w:spacing w:before="60" w:after="40"/>
-      </w:pPr>
-      <w:r>
-        <w:rPr>
-          <w:rFonts w:ascii="Arial" w:hAnsi="Arial"/>
-          <w:b/>
-          <w:i w:val="0"/>
-          <w:color w:val="193A5A"/>
-          <w:sz w:val="23"/>
-        </w:rPr>
-        <w:t>2. Release facts and procedures</w:t>
-      </w:r>
-    </w:p>
-    <w:tbl>
-      <w:tblPr>
-        <w:tblW w:type="auto" w:w="0"/>
-        <w:tblLayout w:type="fixed"/>
-        <w:tblLook w:firstColumn="1" w:firstRow="1" w:lastColumn="0" w:lastRow="0" w:noHBand="0" w:noVBand="1" w:val="04A0"/>
-        <w:tblBorders>
-          <w:top w:val="single" w:sz="6" w:color="8EA2B3"/>
-          <w:left w:val="single" w:sz="6" w:color="8EA2B3"/>
-          <w:bottom w:val="single" w:sz="6" w:color="8EA2B3"/>
-          <w:right w:val="single" w:sz="6" w:color="8EA2B3"/>
-          <w:insideH w:val="single" w:sz="6" w:color="8EA2B3"/>
-          <w:insideV w:val="single" w:sz="6" w:color="8EA2B3"/>
-        </w:tblBorders>
-      </w:tblPr>
-      <w:tblGrid>
-        <w:gridCol w:w="2952"/>
-        <w:gridCol w:w="7344"/>
-      </w:tblGrid>
-      <w:tr>
-        <w:tc>
-          <w:tcPr>
-            <w:tcW w:type="dxa" w:w="5256"/>
-            <w:shd w:fill="EAF0F5"/>
-            <w:vAlign w:val="center"/>
+            <w:tcW w:type="dxa" w:w="10656"/>
+            <w:gridSpan w:val="2"/>
             <w:tcMar>
               <w:top w:w="65" w:type="dxa"/>
-              <w:start w:w="100" w:type="dxa"/>
+              <w:start w:w="90" w:type="dxa"/>
               <w:bottom w:w="65" w:type="dxa"/>
-              <w:end w:w="100" w:type="dxa"/>
+              <w:end w:w="90" w:type="dxa"/>
             </w:tcMar>
           </w:tcPr>
           <w:p>
@@ -362,21 +270,567 @@
                 <w:b/>
                 <w:i w:val="0"/>
                 <w:color w:val="1C2731"/>
-                <w:sz w:val="17"/>
+                <w:sz w:val="15"/>
               </w:rPr>
-              <w:t>Documents reviewed</w:t>
+              <w:t>Prior relationship, conflict, or compensation, if any: ________________________________________________</w:t>
             </w:r>
           </w:p>
         </w:tc>
+      </w:tr>
+    </w:tbl>
+    <w:p>
+      <w:pPr>
+        <w:keepNext/>
+        <w:spacing w:before="50" w:after="30"/>
+      </w:pPr>
+      <w:r>
+        <w:rPr>
+          <w:rFonts w:ascii="Arial" w:hAnsi="Arial"/>
+          <w:b/>
+          <w:i w:val="0"/>
+          <w:color w:val="193A5A"/>
+          <w:sz w:val="20"/>
+        </w:rPr>
+        <w:t>2. Materials, scope, and procedures reviewed</w:t>
+      </w:r>
+    </w:p>
+    <w:tbl>
+      <w:tblPr>
+        <w:tblW w:type="dxa" w:w="10656"/>
+        <w:tblLayout w:type="fixed"/>
+        <w:tblLook w:firstColumn="1" w:firstRow="1" w:lastColumn="0" w:lastRow="0" w:noHBand="0" w:noVBand="1" w:val="04A0"/>
+        <w:tblBorders>
+          <w:top w:val="single" w:sz="5" w:color="8EA2B3"/>
+          <w:left w:val="single" w:sz="5" w:color="8EA2B3"/>
+          <w:bottom w:val="single" w:sz="5" w:color="8EA2B3"/>
+          <w:right w:val="single" w:sz="5" w:color="8EA2B3"/>
+          <w:insideH w:val="single" w:sz="5" w:color="8EA2B3"/>
+          <w:insideV w:val="single" w:sz="5" w:color="8EA2B3"/>
+        </w:tblBorders>
+      </w:tblPr>
+      <w:tblGrid>
+        <w:gridCol w:w="10656"/>
+      </w:tblGrid>
+      <w:tr>
         <w:tc>
           <w:tcPr>
-            <w:tcW w:type="dxa" w:w="5256"/>
-            <w:vAlign w:val="center"/>
+            <w:tcW w:type="dxa" w:w="10656"/>
+            <w:shd w:fill="EAF0F5"/>
             <w:tcMar>
-              <w:top w:w="65" w:type="dxa"/>
-              <w:start w:w="100" w:type="dxa"/>
-              <w:bottom w:w="65" w:type="dxa"/>
-              <w:end w:w="100" w:type="dxa"/>
+              <w:top w:w="55" w:type="dxa"/>
+              <w:start w:w="90" w:type="dxa"/>
+              <w:bottom w:w="55" w:type="dxa"/>
+              <w:end w:w="90" w:type="dxa"/>
+            </w:tcMar>
+          </w:tcPr>
+          <w:p>
+            <w:r>
+              <w:rPr>
+                <w:rFonts w:ascii="Arial" w:hAnsi="Arial"/>
+                <w:b/>
+                <w:i w:val="0"/>
+                <w:color w:val="1C2731"/>
+                <w:sz w:val="15"/>
+              </w:rPr>
+              <w:t xml:space="preserve">Stable snapshot: review-v1.3.1  |  </w:t>
+            </w:r>
+            <w:r>
+              <w:rPr>
+                <w:rFonts w:ascii="Arial" w:hAnsi="Arial"/>
+                <w:b w:val="0"/>
+                <w:i w:val="0"/>
+                <w:color w:val="215B91"/>
+                <w:sz w:val="14"/>
+              </w:rPr>
+              <w:t>https://github.com/Ayodele-Adeniyi/continuous-control-assurance-framework/tree/review-v1.3.1</w:t>
+            </w:r>
+          </w:p>
+        </w:tc>
+      </w:tr>
+      <w:tr>
+        <w:tc>
+          <w:tcPr>
+            <w:tcW w:type="dxa" w:w="10656"/>
+            <w:tcMar>
+              <w:top w:w="45" w:type="dxa"/>
+              <w:start w:w="90" w:type="dxa"/>
+              <w:bottom w:w="45" w:type="dxa"/>
+              <w:end w:w="90" w:type="dxa"/>
+            </w:tcMar>
+          </w:tcPr>
+          <w:p>
+            <w:r>
+              <w:rPr>
+                <w:rFonts w:ascii="Arial" w:hAnsi="Arial"/>
+                <w:b/>
+                <w:i w:val="0"/>
+                <w:color w:val="1C2731"/>
+                <w:sz w:val="15"/>
+              </w:rPr>
+              <w:t xml:space="preserve">Materials/procedures: </w:t>
+            </w:r>
+            <w:r>
+              <w:rPr>
+                <w:rFonts w:ascii="Arial" w:hAnsi="Arial"/>
+                <w:b w:val="0"/>
+                <w:i w:val="0"/>
+                <w:color w:val="1C2731"/>
+                <w:sz w:val="15"/>
+              </w:rPr>
+              <w:t>☐ Methodology  ☐ Control-Test Catalog  ☐ Repository/code (optional)  ☐ Local reproduction (optional)  ☐ Automated tests (optional)</w:t>
+            </w:r>
+          </w:p>
+        </w:tc>
+      </w:tr>
+      <w:tr>
+        <w:tc>
+          <w:tcPr>
+            <w:tcW w:type="dxa" w:w="10656"/>
+            <w:tcMar>
+              <w:top w:w="45" w:type="dxa"/>
+              <w:start w:w="90" w:type="dxa"/>
+              <w:bottom w:w="45" w:type="dxa"/>
+              <w:end w:w="90" w:type="dxa"/>
+            </w:tcMar>
+          </w:tcPr>
+          <w:p>
+            <w:r>
+              <w:rPr>
+                <w:rFonts w:ascii="Arial" w:hAnsi="Arial"/>
+                <w:b/>
+                <w:i w:val="0"/>
+                <w:color w:val="1C2731"/>
+                <w:sz w:val="15"/>
+              </w:rPr>
+              <w:t xml:space="preserve">Catalog scope: </w:t>
+            </w:r>
+            <w:r>
+              <w:rPr>
+                <w:rFonts w:ascii="Arial" w:hAnsi="Arial"/>
+                <w:b w:val="0"/>
+                <w:i w:val="0"/>
+                <w:color w:val="1C2731"/>
+                <w:sz w:val="15"/>
+              </w:rPr>
+              <w:t>☐ All 20 controls  ☐ Selected modules/control IDs: __________________________</w:t>
+            </w:r>
+            <w:r>
+              <w:br/>
+            </w:r>
+            <w:r>
+              <w:rPr>
+                <w:rFonts w:ascii="Arial" w:hAnsi="Arial"/>
+                <w:b w:val="0"/>
+                <w:i w:val="0"/>
+                <w:color w:val="1C2731"/>
+                <w:sz w:val="15"/>
+              </w:rPr>
+              <w:t>Observed result and seed, if locally reproduced: __________________________________________</w:t>
+            </w:r>
+          </w:p>
+        </w:tc>
+      </w:tr>
+      <w:tr>
+        <w:tc>
+          <w:tcPr>
+            <w:tcW w:type="dxa" w:w="10656"/>
+            <w:shd w:fill="EAF0F5"/>
+            <w:tcMar>
+              <w:top w:w="55" w:type="dxa"/>
+              <w:start w:w="90" w:type="dxa"/>
+              <w:bottom w:w="55" w:type="dxa"/>
+              <w:end w:w="90" w:type="dxa"/>
+            </w:tcMar>
+          </w:tcPr>
+          <w:p>
+            <w:r>
+              <w:rPr>
+                <w:rFonts w:ascii="Arial" w:hAnsi="Arial"/>
+                <w:b/>
+                <w:i w:val="0"/>
+                <w:color w:val="1C2731"/>
+                <w:sz w:val="15"/>
+              </w:rPr>
+              <w:t xml:space="preserve">Documented release facts: </w:t>
+            </w:r>
+            <w:r>
+              <w:rPr>
+                <w:rFonts w:ascii="Arial" w:hAnsi="Arial"/>
+                <w:b w:val="0"/>
+                <w:i w:val="0"/>
+                <w:color w:val="1C2731"/>
+                <w:sz w:val="14"/>
+              </w:rPr>
+              <w:t>Version 1.3.1; Apache-2.0 license; 20 control tests using synthetic demonstration data. Under the official seed-42 benchmark, the release documentation reports 165 of 165 deliberately planted conditions detected, 3 additional peer-comparison observations, and 168 total exceptions.</w:t>
+            </w:r>
+            <w:r>
+              <w:br/>
+            </w:r>
+            <w:r>
+              <w:rPr>
+                <w:rFonts w:ascii="Arial" w:hAnsi="Arial"/>
+                <w:b w:val="0"/>
+                <w:i/>
+                <w:color w:val="56626C"/>
+                <w:sz w:val="14"/>
+              </w:rPr>
+              <w:t>Corrections, if any: ________________________________________________</w:t>
+            </w:r>
+          </w:p>
+        </w:tc>
+      </w:tr>
+    </w:tbl>
+    <w:p>
+      <w:pPr>
+        <w:keepNext/>
+        <w:spacing w:before="50" w:after="30"/>
+      </w:pPr>
+      <w:r>
+        <w:rPr>
+          <w:rFonts w:ascii="Arial" w:hAnsi="Arial"/>
+          <w:b/>
+          <w:i w:val="0"/>
+          <w:color w:val="193A5A"/>
+          <w:sz w:val="20"/>
+        </w:rPr>
+        <w:t>3. Professional opinion</w:t>
+      </w:r>
+    </w:p>
+    <w:p>
+      <w:pPr>
+        <w:keepNext/>
+        <w:spacing w:before="24" w:after="10"/>
+      </w:pPr>
+      <w:r>
+        <w:rPr>
+          <w:rFonts w:ascii="Arial" w:hAnsi="Arial"/>
+          <w:b/>
+          <w:i w:val="0"/>
+          <w:color w:val="1C2731"/>
+          <w:sz w:val="16"/>
+        </w:rPr>
+        <w:t xml:space="preserve">Technical soundness. </w:t>
+      </w:r>
+      <w:r>
+        <w:rPr>
+          <w:rFonts w:ascii="Arial" w:hAnsi="Arial"/>
+          <w:b w:val="0"/>
+          <w:i w:val="0"/>
+          <w:color w:val="1C2731"/>
+          <w:sz w:val="16"/>
+        </w:rPr>
+        <w:t>In my professional judgment, this framework is:</w:t>
+      </w:r>
+    </w:p>
+    <w:p>
+      <w:pPr>
+        <w:spacing w:after="6" w:line="221" w:lineRule="auto"/>
+        <w:ind w:left="115"/>
+      </w:pPr>
+      <w:r>
+        <w:rPr>
+          <w:rFonts w:ascii="Arial" w:hAnsi="Arial"/>
+          <w:b w:val="0"/>
+          <w:i w:val="0"/>
+          <w:color w:val="1C2731"/>
+          <w:sz w:val="15"/>
+        </w:rPr>
+        <w:t>☐ Technically sound and consistent with professional control-testing practice for a synthetic reference prototype</w:t>
+      </w:r>
+      <w:r>
+        <w:br/>
+      </w:r>
+      <w:r>
+        <w:rPr>
+          <w:rFonts w:ascii="Arial" w:hAnsi="Arial"/>
+          <w:b w:val="0"/>
+          <w:i w:val="0"/>
+          <w:color w:val="1C2731"/>
+          <w:sz w:val="15"/>
+        </w:rPr>
+        <w:t>☐ Technically sound with minor reservations explained below</w:t>
+      </w:r>
+      <w:r>
+        <w:br/>
+      </w:r>
+      <w:r>
+        <w:rPr>
+          <w:rFonts w:ascii="Arial" w:hAnsi="Arial"/>
+          <w:b w:val="0"/>
+          <w:i w:val="0"/>
+          <w:color w:val="1C2731"/>
+          <w:sz w:val="15"/>
+        </w:rPr>
+        <w:t>☐ Not technically sound, as explained below</w:t>
+      </w:r>
+    </w:p>
+    <w:p>
+      <w:pPr>
+        <w:spacing w:after="14"/>
+      </w:pPr>
+      <w:r>
+        <w:rPr>
+          <w:rFonts w:ascii="Arial" w:hAnsi="Arial"/>
+          <w:b w:val="0"/>
+          <w:i/>
+          <w:color w:val="56626C"/>
+          <w:sz w:val="15"/>
+        </w:rPr>
+        <w:t xml:space="preserve">Comments (optional): </w:t>
+      </w:r>
+      <w:r>
+        <w:rPr>
+          <w:rFonts w:ascii="Arial" w:hAnsi="Arial"/>
+          <w:b w:val="0"/>
+          <w:i w:val="0"/>
+          <w:color w:val="56626C"/>
+          <w:sz w:val="15"/>
+        </w:rPr>
+        <w:t>_______________________________________________________________</w:t>
+      </w:r>
+    </w:p>
+    <w:p>
+      <w:pPr>
+        <w:keepNext/>
+        <w:spacing w:before="24" w:after="10"/>
+      </w:pPr>
+      <w:r>
+        <w:rPr>
+          <w:rFonts w:ascii="Arial" w:hAnsi="Arial"/>
+          <w:b/>
+          <w:i w:val="0"/>
+          <w:color w:val="1C2731"/>
+          <w:sz w:val="16"/>
+        </w:rPr>
+        <w:t xml:space="preserve">Claims and limitations. </w:t>
+      </w:r>
+      <w:r>
+        <w:rPr>
+          <w:rFonts w:ascii="Arial" w:hAnsi="Arial"/>
+          <w:b w:val="0"/>
+          <w:i w:val="0"/>
+          <w:color w:val="1C2731"/>
+          <w:sz w:val="16"/>
+        </w:rPr>
+        <w:t>In my professional judgment, the framework's claims are:</w:t>
+      </w:r>
+    </w:p>
+    <w:p>
+      <w:pPr>
+        <w:spacing w:after="6" w:line="221" w:lineRule="auto"/>
+        <w:ind w:left="115"/>
+      </w:pPr>
+      <w:r>
+        <w:rPr>
+          <w:rFonts w:ascii="Arial" w:hAnsi="Arial"/>
+          <w:b w:val="0"/>
+          <w:i w:val="0"/>
+          <w:color w:val="1C2731"/>
+          <w:sz w:val="15"/>
+        </w:rPr>
+        <w:t>☐ Appropriately bounded to what the demonstration establishes</w:t>
+      </w:r>
+      <w:r>
+        <w:br/>
+      </w:r>
+      <w:r>
+        <w:rPr>
+          <w:rFonts w:ascii="Arial" w:hAnsi="Arial"/>
+          <w:b w:val="0"/>
+          <w:i w:val="0"/>
+          <w:color w:val="1C2731"/>
+          <w:sz w:val="15"/>
+        </w:rPr>
+        <w:t>☐ Generally appropriate, but some claims are overstated as explained below</w:t>
+      </w:r>
+      <w:r>
+        <w:br/>
+      </w:r>
+      <w:r>
+        <w:rPr>
+          <w:rFonts w:ascii="Arial" w:hAnsi="Arial"/>
+          <w:b w:val="0"/>
+          <w:i w:val="0"/>
+          <w:color w:val="1C2731"/>
+          <w:sz w:val="15"/>
+        </w:rPr>
+        <w:t>☐ Not appropriately bounded, as explained below</w:t>
+      </w:r>
+    </w:p>
+    <w:p>
+      <w:pPr>
+        <w:spacing w:after="14"/>
+      </w:pPr>
+      <w:r>
+        <w:rPr>
+          <w:rFonts w:ascii="Arial" w:hAnsi="Arial"/>
+          <w:b w:val="0"/>
+          <w:i/>
+          <w:color w:val="56626C"/>
+          <w:sz w:val="15"/>
+        </w:rPr>
+        <w:t xml:space="preserve">Comments (optional): </w:t>
+      </w:r>
+      <w:r>
+        <w:rPr>
+          <w:rFonts w:ascii="Arial" w:hAnsi="Arial"/>
+          <w:b w:val="0"/>
+          <w:i w:val="0"/>
+          <w:color w:val="56626C"/>
+          <w:sz w:val="15"/>
+        </w:rPr>
+        <w:t>_______________________________________________________________</w:t>
+      </w:r>
+    </w:p>
+    <w:p>
+      <w:pPr>
+        <w:keepNext/>
+        <w:spacing w:before="24" w:after="10"/>
+      </w:pPr>
+      <w:r>
+        <w:rPr>
+          <w:rFonts w:ascii="Arial" w:hAnsi="Arial"/>
+          <w:b/>
+          <w:i w:val="0"/>
+          <w:color w:val="1C2731"/>
+          <w:sz w:val="16"/>
+        </w:rPr>
+        <w:t xml:space="preserve">Transferability. </w:t>
+      </w:r>
+      <w:r>
+        <w:rPr>
+          <w:rFonts w:ascii="Arial" w:hAnsi="Arial"/>
+          <w:b w:val="0"/>
+          <w:i w:val="0"/>
+          <w:color w:val="1C2731"/>
+          <w:sz w:val="16"/>
+        </w:rPr>
+        <w:t>In my professional judgment, this methodology:</w:t>
+      </w:r>
+    </w:p>
+    <w:p>
+      <w:pPr>
+        <w:spacing w:after="6" w:line="221" w:lineRule="auto"/>
+        <w:ind w:left="115"/>
+      </w:pPr>
+      <w:r>
+        <w:rPr>
+          <w:rFonts w:ascii="Arial" w:hAnsi="Arial"/>
+          <w:b w:val="0"/>
+          <w:i w:val="0"/>
+          <w:color w:val="1C2731"/>
+          <w:sz w:val="15"/>
+        </w:rPr>
+        <w:t>☐ Could be adapted by other institutions or practitioners to their own authorized data and control environments</w:t>
+      </w:r>
+      <w:r>
+        <w:br/>
+      </w:r>
+      <w:r>
+        <w:rPr>
+          <w:rFonts w:ascii="Arial" w:hAnsi="Arial"/>
+          <w:b w:val="0"/>
+          <w:i w:val="0"/>
+          <w:color w:val="1C2731"/>
+          <w:sz w:val="15"/>
+        </w:rPr>
+        <w:t>☐ Could be adapted with significant effort, as explained below</w:t>
+      </w:r>
+      <w:r>
+        <w:br/>
+      </w:r>
+      <w:r>
+        <w:rPr>
+          <w:rFonts w:ascii="Arial" w:hAnsi="Arial"/>
+          <w:b w:val="0"/>
+          <w:i w:val="0"/>
+          <w:color w:val="1C2731"/>
+          <w:sz w:val="15"/>
+        </w:rPr>
+        <w:t>☐ Is not practically transferable, as explained below</w:t>
+      </w:r>
+    </w:p>
+    <w:p>
+      <w:pPr>
+        <w:spacing w:after="14"/>
+      </w:pPr>
+      <w:r>
+        <w:rPr>
+          <w:rFonts w:ascii="Arial" w:hAnsi="Arial"/>
+          <w:b w:val="0"/>
+          <w:i/>
+          <w:color w:val="56626C"/>
+          <w:sz w:val="15"/>
+        </w:rPr>
+        <w:t xml:space="preserve">Comments (optional): </w:t>
+      </w:r>
+      <w:r>
+        <w:rPr>
+          <w:rFonts w:ascii="Arial" w:hAnsi="Arial"/>
+          <w:b w:val="0"/>
+          <w:i w:val="0"/>
+          <w:color w:val="56626C"/>
+          <w:sz w:val="15"/>
+        </w:rPr>
+        <w:t>_______________________________________________________________</w:t>
+      </w:r>
+    </w:p>
+    <w:p>
+      <w:pPr>
+        <w:keepNext/>
+        <w:spacing w:before="20" w:after="10"/>
+      </w:pPr>
+      <w:r>
+        <w:rPr>
+          <w:rFonts w:ascii="Arial" w:hAnsi="Arial"/>
+          <w:b/>
+          <w:i w:val="0"/>
+          <w:color w:val="1C2731"/>
+          <w:sz w:val="16"/>
+        </w:rPr>
+        <w:t xml:space="preserve">Overall assessment. </w:t>
+      </w:r>
+      <w:r>
+        <w:rPr>
+          <w:rFonts w:ascii="Arial" w:hAnsi="Arial"/>
+          <w:b w:val="0"/>
+          <w:i w:val="0"/>
+          <w:color w:val="1C2731"/>
+          <w:sz w:val="16"/>
+        </w:rPr>
+        <w:t>Briefly address technical soundness, limitations, and potential transferability (2-4 sentences):</w:t>
+      </w:r>
+    </w:p>
+    <w:tbl>
+      <w:tblPr>
+        <w:tblW w:type="dxa" w:w="10656"/>
+        <w:tblLayout w:type="fixed"/>
+        <w:tblLook w:firstColumn="1" w:firstRow="1" w:lastColumn="0" w:lastRow="0" w:noHBand="0" w:noVBand="1" w:val="04A0"/>
+        <w:tblBorders>
+          <w:top w:val="single" w:sz="5" w:color="8EA2B3"/>
+          <w:left w:val="single" w:sz="5" w:color="8EA2B3"/>
+          <w:bottom w:val="single" w:sz="5" w:color="8EA2B3"/>
+          <w:right w:val="single" w:sz="5" w:color="8EA2B3"/>
+          <w:insideH w:val="single" w:sz="5" w:color="8EA2B3"/>
+          <w:insideV w:val="single" w:sz="5" w:color="8EA2B3"/>
+        </w:tblBorders>
+      </w:tblPr>
+      <w:tblGrid>
+        <w:gridCol w:w="10656"/>
+      </w:tblGrid>
+      <w:tr>
+        <w:trPr>
+          <w:trHeight w:val="835" w:hRule="atLeast"/>
+        </w:trPr>
+        <w:tc>
+          <w:tcPr>
+            <w:tcW w:type="dxa" w:w="10656"/>
+            <w:vAlign w:val="top"/>
+            <w:tcMar>
+              <w:top w:w="55" w:type="dxa"/>
+              <w:start w:w="90" w:type="dxa"/>
+              <w:bottom w:w="55" w:type="dxa"/>
+              <w:end w:w="90" w:type="dxa"/>
             </w:tcMar>
           </w:tcPr>
           <w:p>
@@ -386,213 +840,8 @@
                 <w:b w:val="0"/>
                 <w:i w:val="0"/>
                 <w:color w:val="1C2731"/>
-                <w:sz w:val="17"/>
+                <w:sz w:val="16"/>
               </w:rPr>
-              <w:t>CCAF Framework Methodology and Control-Test Catalog, Version 1.3.1</w:t>
-            </w:r>
-          </w:p>
-        </w:tc>
-      </w:tr>
-      <w:tr>
-        <w:tc>
-          <w:tcPr>
-            <w:tcW w:type="dxa" w:w="5256"/>
-            <w:shd w:fill="EAF0F5"/>
-            <w:vAlign w:val="center"/>
-            <w:tcMar>
-              <w:top w:w="65" w:type="dxa"/>
-              <w:start w:w="100" w:type="dxa"/>
-              <w:bottom w:w="65" w:type="dxa"/>
-              <w:end w:w="100" w:type="dxa"/>
-            </w:tcMar>
-          </w:tcPr>
-          <w:p>
-            <w:r>
-              <w:rPr>
-                <w:rFonts w:ascii="Arial" w:hAnsi="Arial"/>
-                <w:b/>
-                <w:i w:val="0"/>
-                <w:color w:val="1C2731"/>
-                <w:sz w:val="17"/>
-              </w:rPr>
-              <w:t>Review snapshot</w:t>
-            </w:r>
-          </w:p>
-        </w:tc>
-        <w:tc>
-          <w:tcPr>
-            <w:tcW w:type="dxa" w:w="5256"/>
-            <w:vAlign w:val="center"/>
-            <w:tcMar>
-              <w:top w:w="65" w:type="dxa"/>
-              <w:start w:w="100" w:type="dxa"/>
-              <w:bottom w:w="65" w:type="dxa"/>
-              <w:end w:w="100" w:type="dxa"/>
-            </w:tcMar>
-          </w:tcPr>
-          <w:p>
-            <w:r>
-              <w:rPr>
-                <w:rFonts w:ascii="Arial" w:hAnsi="Arial"/>
-                <w:b w:val="0"/>
-                <w:i w:val="0"/>
-                <w:color w:val="1C2731"/>
-                <w:sz w:val="17"/>
-              </w:rPr>
-              <w:t>review-v1.3.1</w:t>
-            </w:r>
-          </w:p>
-        </w:tc>
-      </w:tr>
-      <w:tr>
-        <w:tc>
-          <w:tcPr>
-            <w:tcW w:type="dxa" w:w="5256"/>
-            <w:shd w:fill="EAF0F5"/>
-            <w:vAlign w:val="center"/>
-            <w:tcMar>
-              <w:top w:w="65" w:type="dxa"/>
-              <w:start w:w="100" w:type="dxa"/>
-              <w:bottom w:w="65" w:type="dxa"/>
-              <w:end w:w="100" w:type="dxa"/>
-            </w:tcMar>
-          </w:tcPr>
-          <w:p>
-            <w:r>
-              <w:rPr>
-                <w:rFonts w:ascii="Arial" w:hAnsi="Arial"/>
-                <w:b/>
-                <w:i w:val="0"/>
-                <w:color w:val="1C2731"/>
-                <w:sz w:val="17"/>
-              </w:rPr>
-              <w:t>Optional source code</w:t>
-            </w:r>
-          </w:p>
-        </w:tc>
-        <w:tc>
-          <w:tcPr>
-            <w:tcW w:type="dxa" w:w="5256"/>
-            <w:vAlign w:val="center"/>
-            <w:tcMar>
-              <w:top w:w="65" w:type="dxa"/>
-              <w:start w:w="100" w:type="dxa"/>
-              <w:bottom w:w="65" w:type="dxa"/>
-              <w:end w:w="100" w:type="dxa"/>
-            </w:tcMar>
-          </w:tcPr>
-          <w:p>
-            <w:r>
-              <w:rPr>
-                <w:rFonts w:ascii="Arial" w:hAnsi="Arial"/>
-                <w:b w:val="0"/>
-                <w:i w:val="0"/>
-                <w:color w:val="1C2731"/>
-                <w:sz w:val="17"/>
-              </w:rPr>
-              <w:t>github.com/Ayodele-Adeniyi/continuous-control-assurance-framework/tree/review-v1.3.1 | Apache-2.0</w:t>
-            </w:r>
-          </w:p>
-        </w:tc>
-      </w:tr>
-      <w:tr>
-        <w:tc>
-          <w:tcPr>
-            <w:tcW w:type="dxa" w:w="5256"/>
-            <w:shd w:fill="EAF0F5"/>
-            <w:vAlign w:val="center"/>
-            <w:tcMar>
-              <w:top w:w="65" w:type="dxa"/>
-              <w:start w:w="100" w:type="dxa"/>
-              <w:bottom w:w="65" w:type="dxa"/>
-              <w:end w:w="100" w:type="dxa"/>
-            </w:tcMar>
-          </w:tcPr>
-          <w:p>
-            <w:r>
-              <w:rPr>
-                <w:rFonts w:ascii="Arial" w:hAnsi="Arial"/>
-                <w:b/>
-                <w:i w:val="0"/>
-                <w:color w:val="1C2731"/>
-                <w:sz w:val="17"/>
-              </w:rPr>
-              <w:t>Documented scope</w:t>
-            </w:r>
-          </w:p>
-        </w:tc>
-        <w:tc>
-          <w:tcPr>
-            <w:tcW w:type="dxa" w:w="5256"/>
-            <w:vAlign w:val="center"/>
-            <w:tcMar>
-              <w:top w:w="65" w:type="dxa"/>
-              <w:start w:w="100" w:type="dxa"/>
-              <w:bottom w:w="65" w:type="dxa"/>
-              <w:end w:w="100" w:type="dxa"/>
-            </w:tcMar>
-          </w:tcPr>
-          <w:p>
-            <w:r>
-              <w:rPr>
-                <w:rFonts w:ascii="Arial" w:hAnsi="Arial"/>
-                <w:b w:val="0"/>
-                <w:i w:val="0"/>
-                <w:color w:val="1C2731"/>
-                <w:sz w:val="17"/>
-              </w:rPr>
-              <w:t>20 control tests using synthetic demonstration data</w:t>
-            </w:r>
-          </w:p>
-        </w:tc>
-      </w:tr>
-      <w:tr>
-        <w:tc>
-          <w:tcPr>
-            <w:tcW w:type="dxa" w:w="5256"/>
-            <w:shd w:fill="EAF0F5"/>
-            <w:vAlign w:val="center"/>
-            <w:tcMar>
-              <w:top w:w="65" w:type="dxa"/>
-              <w:start w:w="100" w:type="dxa"/>
-              <w:bottom w:w="65" w:type="dxa"/>
-              <w:end w:w="100" w:type="dxa"/>
-            </w:tcMar>
-          </w:tcPr>
-          <w:p>
-            <w:r>
-              <w:rPr>
-                <w:rFonts w:ascii="Arial" w:hAnsi="Arial"/>
-                <w:b/>
-                <w:i w:val="0"/>
-                <w:color w:val="1C2731"/>
-                <w:sz w:val="17"/>
-              </w:rPr>
-              <w:t>Documented release claim</w:t>
-            </w:r>
-          </w:p>
-        </w:tc>
-        <w:tc>
-          <w:tcPr>
-            <w:tcW w:type="dxa" w:w="5256"/>
-            <w:vAlign w:val="center"/>
-            <w:tcMar>
-              <w:top w:w="65" w:type="dxa"/>
-              <w:start w:w="100" w:type="dxa"/>
-              <w:bottom w:w="65" w:type="dxa"/>
-              <w:end w:w="100" w:type="dxa"/>
-            </w:tcMar>
-          </w:tcPr>
-          <w:p>
-            <w:r>
-              <w:rPr>
-                <w:rFonts w:ascii="Arial" w:hAnsi="Arial"/>
-                <w:b w:val="0"/>
-                <w:i w:val="0"/>
-                <w:color w:val="1C2731"/>
-                <w:sz w:val="17"/>
-              </w:rPr>
-              <w:t>165 of 165 deliberately planted conditions detected under the official seed-42 benchmark; 3 additional peer-comparison observations reported separately; 168 total exceptions</w:t>
             </w:r>
           </w:p>
         </w:tc>
@@ -600,17 +849,18 @@
     </w:tbl>
     <w:p>
       <w:pPr>
-        <w:spacing w:before="60" w:after="20"/>
+        <w:keepNext/>
+        <w:spacing w:before="50" w:after="30"/>
       </w:pPr>
       <w:r>
         <w:rPr>
           <w:rFonts w:ascii="Arial" w:hAnsi="Arial"/>
-          <w:b w:val="0"/>
+          <w:b/>
           <w:i w:val="0"/>
-          <w:color w:val="1C2731"/>
-          <w:sz w:val="17"/>
+          <w:color w:val="193A5A"/>
+          <w:sz w:val="20"/>
         </w:rPr>
-        <w:t>Procedures personally performed:  [ ] Reviewed methodology/limitations  [ ] Reviewed catalog and selected procedures</w:t>
+        <w:t>4. Confirmation</w:t>
       </w:r>
     </w:p>
     <w:p>
@@ -623,430 +873,14 @@
           <w:b w:val="0"/>
           <w:i w:val="0"/>
           <w:color w:val="1C2731"/>
-          <w:sz w:val="17"/>
+          <w:sz w:val="14"/>
         </w:rPr>
-        <w:t>Optional: [ ] Inspected repository artifacts/code  [ ] Reproduced seed-42 run  [ ] Ran automated tests</w:t>
-      </w:r>
-    </w:p>
-    <w:p>
-      <w:pPr>
-        <w:spacing w:after="20"/>
-      </w:pPr>
-      <w:r>
-        <w:rPr>
-          <w:rFonts w:ascii="Arial" w:hAnsi="Arial"/>
-          <w:b w:val="0"/>
-          <w:i w:val="0"/>
-          <w:color w:val="1C2731"/>
-          <w:sz w:val="17"/>
-        </w:rPr>
-        <w:t>Catalog scope personally examined: [ ] All 20 controls  [ ] Selected modules/control IDs: __________________</w:t>
-      </w:r>
-    </w:p>
-    <w:p>
-      <w:pPr>
-        <w:spacing w:after="20"/>
-      </w:pPr>
-      <w:r>
-        <w:rPr>
-          <w:rFonts w:ascii="Arial" w:hAnsi="Arial"/>
-          <w:b w:val="0"/>
-          <w:i w:val="0"/>
-          <w:color w:val="1C2731"/>
-          <w:sz w:val="17"/>
-        </w:rPr>
-        <w:t>Corrections to pre-filled facts, if any: ________________________________________________</w:t>
-      </w:r>
-    </w:p>
-    <w:p>
-      <w:pPr>
-        <w:spacing w:after="60"/>
-      </w:pPr>
-      <w:r>
-        <w:rPr>
-          <w:rFonts w:ascii="Arial" w:hAnsi="Arial"/>
-          <w:b w:val="0"/>
-          <w:i w:val="0"/>
-          <w:color w:val="1C2731"/>
-          <w:sz w:val="17"/>
-        </w:rPr>
-        <w:t>Result and seed observed, if locally reproduced: __________________________________________</w:t>
-      </w:r>
-    </w:p>
-    <w:p>
-      <w:pPr>
-        <w:keepNext/>
-        <w:spacing w:before="60" w:after="40"/>
-      </w:pPr>
-      <w:r>
-        <w:rPr>
-          <w:rFonts w:ascii="Arial" w:hAnsi="Arial"/>
-          <w:b/>
-          <w:i w:val="0"/>
-          <w:color w:val="193A5A"/>
-          <w:sz w:val="23"/>
-        </w:rPr>
-        <w:t>3. Reviewer-authored professional opinion</w:t>
-      </w:r>
-    </w:p>
-    <w:p>
-      <w:pPr>
-        <w:keepNext/>
-        <w:spacing w:before="40" w:after="20"/>
-      </w:pPr>
-      <w:r>
-        <w:rPr>
-          <w:rFonts w:ascii="Arial" w:hAnsi="Arial"/>
-          <w:b/>
-          <w:i w:val="0"/>
-          <w:color w:val="1C2731"/>
-          <w:sz w:val="17"/>
-        </w:rPr>
-        <w:t xml:space="preserve">Technical soundness: </w:t>
-      </w:r>
-      <w:r>
-        <w:rPr>
-          <w:rFonts w:ascii="Arial" w:hAnsi="Arial"/>
-          <w:b/>
-          <w:i w:val="0"/>
-          <w:color w:val="1C2731"/>
-          <w:sz w:val="17"/>
-        </w:rPr>
-        <w:t>Is the methodology technically sound and consistent with professional control-testing practice for a synthetic reference prototype?</w:t>
+        <w:t>This response reflects my independent professional judgment based on the materials and procedures identified above. It does not constitute institutional endorsement, regulatory approval, certification, a claim of institutional adoption, or a claim about production performance. I understand that this response may be cited publicly and in professional or immigration-related submissions as evidence of independent review.</w:t>
       </w:r>
     </w:p>
     <w:tbl>
       <w:tblPr>
-        <w:tblW w:type="auto" w:w="0"/>
-        <w:tblLayout w:type="fixed"/>
-        <w:tblLook w:firstColumn="1" w:firstRow="1" w:lastColumn="0" w:lastRow="0" w:noHBand="0" w:noVBand="1" w:val="04A0"/>
-        <w:tblBorders>
-          <w:top w:val="single" w:sz="6" w:color="8EA2B3"/>
-          <w:left w:val="single" w:sz="6" w:color="8EA2B3"/>
-          <w:bottom w:val="single" w:sz="6" w:color="8EA2B3"/>
-          <w:right w:val="single" w:sz="6" w:color="8EA2B3"/>
-          <w:insideH w:val="single" w:sz="6" w:color="8EA2B3"/>
-          <w:insideV w:val="single" w:sz="6" w:color="8EA2B3"/>
-        </w:tblBorders>
-      </w:tblPr>
-      <w:tblGrid>
-        <w:gridCol w:w="10296"/>
-      </w:tblGrid>
-      <w:tr>
-        <w:trPr>
-          <w:trHeight w:val="634" w:hRule="atLeast"/>
-        </w:trPr>
-        <w:tc>
-          <w:tcPr>
-            <w:tcW w:type="dxa" w:w="10296"/>
-            <w:vAlign w:val="top"/>
-            <w:tcMar>
-              <w:top w:w="65" w:type="dxa"/>
-              <w:start w:w="95" w:type="dxa"/>
-              <w:bottom w:w="65" w:type="dxa"/>
-              <w:end w:w="95" w:type="dxa"/>
-            </w:tcMar>
-          </w:tcPr>
-          <w:p>
-            <w:pPr>
-              <w:spacing w:after="0"/>
-            </w:pPr>
-            <w:r>
-              <w:rPr>
-                <w:rFonts w:ascii="Arial" w:hAnsi="Arial"/>
-                <w:b w:val="0"/>
-                <w:i/>
-                <w:color w:val="646464"/>
-                <w:sz w:val="17"/>
-              </w:rPr>
-              <w:t>[Brief response]</w:t>
-            </w:r>
-          </w:p>
-        </w:tc>
-      </w:tr>
-    </w:tbl>
-    <w:p>
-      <w:pPr>
-        <w:keepNext/>
-        <w:spacing w:before="40" w:after="20"/>
-      </w:pPr>
-      <w:r>
-        <w:rPr>
-          <w:rFonts w:ascii="Arial" w:hAnsi="Arial"/>
-          <w:b/>
-          <w:i w:val="0"/>
-          <w:color w:val="1C2731"/>
-          <w:sz w:val="17"/>
-        </w:rPr>
-        <w:t xml:space="preserve">Claims and limitations: </w:t>
-      </w:r>
-      <w:r>
-        <w:rPr>
-          <w:rFonts w:ascii="Arial" w:hAnsi="Arial"/>
-          <w:b/>
-          <w:i w:val="0"/>
-          <w:color w:val="1C2731"/>
-          <w:sz w:val="17"/>
-        </w:rPr>
-        <w:t>Are the claims appropriately bounded to what the demonstration establishes?</w:t>
-      </w:r>
-    </w:p>
-    <w:tbl>
-      <w:tblPr>
-        <w:tblW w:type="auto" w:w="0"/>
-        <w:tblLayout w:type="fixed"/>
-        <w:tblLook w:firstColumn="1" w:firstRow="1" w:lastColumn="0" w:lastRow="0" w:noHBand="0" w:noVBand="1" w:val="04A0"/>
-        <w:tblBorders>
-          <w:top w:val="single" w:sz="6" w:color="8EA2B3"/>
-          <w:left w:val="single" w:sz="6" w:color="8EA2B3"/>
-          <w:bottom w:val="single" w:sz="6" w:color="8EA2B3"/>
-          <w:right w:val="single" w:sz="6" w:color="8EA2B3"/>
-          <w:insideH w:val="single" w:sz="6" w:color="8EA2B3"/>
-          <w:insideV w:val="single" w:sz="6" w:color="8EA2B3"/>
-        </w:tblBorders>
-      </w:tblPr>
-      <w:tblGrid>
-        <w:gridCol w:w="10296"/>
-      </w:tblGrid>
-      <w:tr>
-        <w:trPr>
-          <w:trHeight w:val="634" w:hRule="atLeast"/>
-        </w:trPr>
-        <w:tc>
-          <w:tcPr>
-            <w:tcW w:type="dxa" w:w="10296"/>
-            <w:vAlign w:val="top"/>
-            <w:tcMar>
-              <w:top w:w="65" w:type="dxa"/>
-              <w:start w:w="95" w:type="dxa"/>
-              <w:bottom w:w="65" w:type="dxa"/>
-              <w:end w:w="95" w:type="dxa"/>
-            </w:tcMar>
-          </w:tcPr>
-          <w:p>
-            <w:pPr>
-              <w:spacing w:after="0"/>
-            </w:pPr>
-            <w:r>
-              <w:rPr>
-                <w:rFonts w:ascii="Arial" w:hAnsi="Arial"/>
-                <w:b w:val="0"/>
-                <w:i/>
-                <w:color w:val="646464"/>
-                <w:sz w:val="17"/>
-              </w:rPr>
-              <w:t>[Brief response]</w:t>
-            </w:r>
-          </w:p>
-        </w:tc>
-      </w:tr>
-    </w:tbl>
-    <w:p>
-      <w:pPr>
-        <w:keepNext/>
-        <w:spacing w:before="40" w:after="20"/>
-      </w:pPr>
-      <w:r>
-        <w:rPr>
-          <w:rFonts w:ascii="Arial" w:hAnsi="Arial"/>
-          <w:b/>
-          <w:i w:val="0"/>
-          <w:color w:val="1C2731"/>
-          <w:sz w:val="17"/>
-        </w:rPr>
-        <w:t xml:space="preserve">Transferability: </w:t>
-      </w:r>
-      <w:r>
-        <w:rPr>
-          <w:rFonts w:ascii="Arial" w:hAnsi="Arial"/>
-          <w:b/>
-          <w:i w:val="0"/>
-          <w:color w:val="1C2731"/>
-          <w:sz w:val="17"/>
-        </w:rPr>
-        <w:t>In your professional judgment, could this methodology be adapted by other institutions or practitioners to their own authorized data and control environments?</w:t>
-      </w:r>
-    </w:p>
-    <w:tbl>
-      <w:tblPr>
-        <w:tblW w:type="auto" w:w="0"/>
-        <w:tblLayout w:type="fixed"/>
-        <w:tblLook w:firstColumn="1" w:firstRow="1" w:lastColumn="0" w:lastRow="0" w:noHBand="0" w:noVBand="1" w:val="04A0"/>
-        <w:tblBorders>
-          <w:top w:val="single" w:sz="6" w:color="8EA2B3"/>
-          <w:left w:val="single" w:sz="6" w:color="8EA2B3"/>
-          <w:bottom w:val="single" w:sz="6" w:color="8EA2B3"/>
-          <w:right w:val="single" w:sz="6" w:color="8EA2B3"/>
-          <w:insideH w:val="single" w:sz="6" w:color="8EA2B3"/>
-          <w:insideV w:val="single" w:sz="6" w:color="8EA2B3"/>
-        </w:tblBorders>
-      </w:tblPr>
-      <w:tblGrid>
-        <w:gridCol w:w="10296"/>
-      </w:tblGrid>
-      <w:tr>
-        <w:trPr>
-          <w:trHeight w:val="634" w:hRule="atLeast"/>
-        </w:trPr>
-        <w:tc>
-          <w:tcPr>
-            <w:tcW w:type="dxa" w:w="10296"/>
-            <w:vAlign w:val="top"/>
-            <w:tcMar>
-              <w:top w:w="65" w:type="dxa"/>
-              <w:start w:w="95" w:type="dxa"/>
-              <w:bottom w:w="65" w:type="dxa"/>
-              <w:end w:w="95" w:type="dxa"/>
-            </w:tcMar>
-          </w:tcPr>
-          <w:p>
-            <w:pPr>
-              <w:spacing w:after="0"/>
-            </w:pPr>
-            <w:r>
-              <w:rPr>
-                <w:rFonts w:ascii="Arial" w:hAnsi="Arial"/>
-                <w:b w:val="0"/>
-                <w:i/>
-                <w:color w:val="646464"/>
-                <w:sz w:val="17"/>
-              </w:rPr>
-              <w:t>[Brief response]</w:t>
-            </w:r>
-          </w:p>
-        </w:tc>
-      </w:tr>
-    </w:tbl>
-    <w:p>
-      <w:pPr>
-        <w:keepNext/>
-        <w:spacing w:before="40" w:after="20"/>
-      </w:pPr>
-      <w:r>
-        <w:rPr>
-          <w:rFonts w:ascii="Arial" w:hAnsi="Arial"/>
-          <w:b/>
-          <w:i w:val="0"/>
-          <w:color w:val="1C2731"/>
-          <w:sz w:val="17"/>
-        </w:rPr>
-        <w:t xml:space="preserve">Observations: </w:t>
-      </w:r>
-      <w:r>
-        <w:rPr>
-          <w:rFonts w:ascii="Arial" w:hAnsi="Arial"/>
-          <w:b/>
-          <w:i w:val="0"/>
-          <w:color w:val="1C2731"/>
-          <w:sz w:val="17"/>
-        </w:rPr>
-        <w:t>What strengths, limitations, or improvements, if any, would you note?</w:t>
-      </w:r>
-    </w:p>
-    <w:tbl>
-      <w:tblPr>
-        <w:tblW w:type="auto" w:w="0"/>
-        <w:tblLayout w:type="fixed"/>
-        <w:tblLook w:firstColumn="1" w:firstRow="1" w:lastColumn="0" w:lastRow="0" w:noHBand="0" w:noVBand="1" w:val="04A0"/>
-        <w:tblBorders>
-          <w:top w:val="single" w:sz="6" w:color="8EA2B3"/>
-          <w:left w:val="single" w:sz="6" w:color="8EA2B3"/>
-          <w:bottom w:val="single" w:sz="6" w:color="8EA2B3"/>
-          <w:right w:val="single" w:sz="6" w:color="8EA2B3"/>
-          <w:insideH w:val="single" w:sz="6" w:color="8EA2B3"/>
-          <w:insideV w:val="single" w:sz="6" w:color="8EA2B3"/>
-        </w:tblBorders>
-      </w:tblPr>
-      <w:tblGrid>
-        <w:gridCol w:w="10296"/>
-      </w:tblGrid>
-      <w:tr>
-        <w:trPr>
-          <w:trHeight w:val="634" w:hRule="atLeast"/>
-        </w:trPr>
-        <w:tc>
-          <w:tcPr>
-            <w:tcW w:type="dxa" w:w="10296"/>
-            <w:vAlign w:val="top"/>
-            <w:tcMar>
-              <w:top w:w="65" w:type="dxa"/>
-              <w:start w:w="95" w:type="dxa"/>
-              <w:bottom w:w="65" w:type="dxa"/>
-              <w:end w:w="95" w:type="dxa"/>
-            </w:tcMar>
-          </w:tcPr>
-          <w:p>
-            <w:pPr>
-              <w:spacing w:after="0"/>
-            </w:pPr>
-            <w:r>
-              <w:rPr>
-                <w:rFonts w:ascii="Arial" w:hAnsi="Arial"/>
-                <w:b w:val="0"/>
-                <w:i/>
-                <w:color w:val="646464"/>
-                <w:sz w:val="17"/>
-              </w:rPr>
-              <w:t>[Brief response]</w:t>
-            </w:r>
-          </w:p>
-        </w:tc>
-      </w:tr>
-    </w:tbl>
-    <w:p>
-      <w:pPr>
-        <w:spacing w:before="60" w:after="20"/>
-      </w:pPr>
-      <w:r>
-        <w:rPr>
-          <w:rFonts w:ascii="Arial" w:hAnsi="Arial"/>
-          <w:b/>
-          <w:i/>
-          <w:color w:val="1C2731"/>
-          <w:sz w:val="17"/>
-        </w:rPr>
-        <w:t xml:space="preserve">Use disclosure: </w:t>
-      </w:r>
-      <w:r>
-        <w:rPr>
-          <w:rFonts w:ascii="Arial" w:hAnsi="Arial"/>
-          <w:b w:val="0"/>
-          <w:i/>
-          <w:color w:val="1C2731"/>
-          <w:sz w:val="17"/>
-        </w:rPr>
-        <w:t>This response may be cited publicly and in professional or immigration-related submissions as evidence of independent review.</w:t>
-      </w:r>
-    </w:p>
-    <w:p>
-      <w:pPr>
-        <w:keepNext/>
-        <w:spacing w:after="60"/>
-      </w:pPr>
-      <w:r>
-        <w:rPr>
-          <w:rFonts w:ascii="Arial" w:hAnsi="Arial"/>
-          <w:b/>
-          <w:i/>
-          <w:color w:val="1C2731"/>
-          <w:sz w:val="17"/>
-        </w:rPr>
-        <w:t xml:space="preserve">Confirmation: </w:t>
-      </w:r>
-      <w:r>
-        <w:rPr>
-          <w:rFonts w:ascii="Arial" w:hAnsi="Arial"/>
-          <w:b w:val="0"/>
-          <w:i/>
-          <w:color w:val="1C2731"/>
-          <w:sz w:val="17"/>
-        </w:rPr>
-        <w:t>This response reflects my independent professional judgment concerning the release and procedures identified above. It does not claim institutional adoption, regulatory approval, certification, or production performance.</w:t>
-      </w:r>
-    </w:p>
-    <w:tbl>
-      <w:tblPr>
-        <w:tblW w:type="auto" w:w="0"/>
+        <w:tblW w:type="dxa" w:w="10656"/>
         <w:tblLayout w:type="fixed"/>
         <w:tblLook w:firstColumn="1" w:firstRow="1" w:lastColumn="0" w:lastRow="0" w:noHBand="0" w:noVBand="1" w:val="04A0"/>
         <w:tblBorders>
@@ -1060,51 +894,51 @@
       </w:tblPr>
       <w:tblGrid>
         <w:gridCol w:w="3240"/>
-        <w:gridCol w:w="4392"/>
-        <w:gridCol w:w="2664"/>
+        <w:gridCol w:w="4536"/>
+        <w:gridCol w:w="2880"/>
       </w:tblGrid>
       <w:tr>
         <w:tc>
           <w:tcPr>
-            <w:tcW w:type="dxa" w:w="3240"/>
+            <w:tcW w:type="dxa" w:w="3552"/>
             <w:tcMar>
-              <w:top w:w="70" w:type="dxa"/>
-              <w:start w:w="100" w:type="dxa"/>
-              <w:bottom w:w="70" w:type="dxa"/>
-              <w:end w:w="100" w:type="dxa"/>
+              <w:top w:w="55" w:type="dxa"/>
+              <w:start w:w="90" w:type="dxa"/>
+              <w:bottom w:w="55" w:type="dxa"/>
+              <w:end w:w="90" w:type="dxa"/>
             </w:tcMar>
           </w:tcPr>
           <w:p>
             <w:r>
               <w:rPr>
                 <w:rFonts w:ascii="Arial" w:hAnsi="Arial"/>
-                <w:b w:val="0"/>
+                <w:b/>
                 <w:i w:val="0"/>
                 <w:color w:val="1C2731"/>
-                <w:sz w:val="18"/>
+                <w:sz w:val="16"/>
               </w:rPr>
-              <w:t>Name: ____________________</w:t>
+              <w:t>Name (printed): __________________</w:t>
             </w:r>
           </w:p>
         </w:tc>
         <w:tc>
           <w:tcPr>
-            <w:tcW w:type="dxa" w:w="4392"/>
+            <w:tcW w:type="dxa" w:w="3552"/>
             <w:tcMar>
-              <w:top w:w="70" w:type="dxa"/>
-              <w:start w:w="100" w:type="dxa"/>
-              <w:bottom w:w="70" w:type="dxa"/>
-              <w:end w:w="100" w:type="dxa"/>
+              <w:top w:w="55" w:type="dxa"/>
+              <w:start w:w="90" w:type="dxa"/>
+              <w:bottom w:w="55" w:type="dxa"/>
+              <w:end w:w="90" w:type="dxa"/>
             </w:tcMar>
           </w:tcPr>
           <w:p>
             <w:r>
               <w:rPr>
                 <w:rFonts w:ascii="Arial" w:hAnsi="Arial"/>
-                <w:b w:val="0"/>
+                <w:b/>
                 <w:i w:val="0"/>
                 <w:color w:val="1C2731"/>
-                <w:sz w:val="18"/>
+                <w:sz w:val="16"/>
               </w:rPr>
               <w:t>Signature: __________________________</w:t>
             </w:r>
@@ -1112,22 +946,22 @@
         </w:tc>
         <w:tc>
           <w:tcPr>
-            <w:tcW w:type="dxa" w:w="2664"/>
+            <w:tcW w:type="dxa" w:w="3552"/>
             <w:tcMar>
-              <w:top w:w="70" w:type="dxa"/>
-              <w:start w:w="100" w:type="dxa"/>
-              <w:bottom w:w="70" w:type="dxa"/>
-              <w:end w:w="100" w:type="dxa"/>
+              <w:top w:w="55" w:type="dxa"/>
+              <w:start w:w="90" w:type="dxa"/>
+              <w:bottom w:w="55" w:type="dxa"/>
+              <w:end w:w="90" w:type="dxa"/>
             </w:tcMar>
           </w:tcPr>
           <w:p>
             <w:r>
               <w:rPr>
                 <w:rFonts w:ascii="Arial" w:hAnsi="Arial"/>
-                <w:b w:val="0"/>
+                <w:b/>
                 <w:i w:val="0"/>
                 <w:color w:val="1C2731"/>
-                <w:sz w:val="18"/>
+                <w:sz w:val="16"/>
               </w:rPr>
               <w:t>Date: ______________</w:t>
             </w:r>
@@ -1136,13 +970,35 @@
       </w:tr>
     </w:tbl>
     <w:sectPr>
+      <w:footerReference w:type="default" r:id="rId9"/>
       <w:pgSz w:w="12240" w:h="15840"/>
-      <w:pgMar w:top="576" w:right="864" w:bottom="576" w:left="864" w:header="720" w:footer="720" w:gutter="0"/>
+      <w:pgMar w:top="547" w:right="792" w:bottom="547" w:left="792" w:header="720" w:footer="720" w:gutter="0"/>
       <w:cols w:space="720"/>
       <w:docGrid w:linePitch="360"/>
     </w:sectPr>
   </w:body>
 </w:document>
+</file>
+
+<file path=word/footer1.xml><?xml version="1.0" encoding="utf-8"?>
+<w:ftr xmlns:m="http://schemas.openxmlformats.org/officeDocument/2006/math" xmlns:mc="http://schemas.openxmlformats.org/markup-compatibility/2006" xmlns:mo="http://schemas.microsoft.com/office/mac/office/2008/main" xmlns:mv="urn:schemas-microsoft-com:mac:vml" xmlns:o="urn:schemas-microsoft-com:office:office" xmlns:r="http://schemas.openxmlformats.org/officeDocument/2006/relationships" xmlns:v="urn:schemas-microsoft-com:vml" xmlns:w10="urn:schemas-microsoft-com:office:word" xmlns:w14="http://schemas.microsoft.com/office/word/2010/wordml" xmlns:w="http://schemas.openxmlformats.org/wordprocessingml/2006/main" xmlns:wne="http://schemas.microsoft.com/office/word/2006/wordml" xmlns:wp14="http://schemas.microsoft.com/office/word/2010/wordprocessingDrawing" xmlns:wp="http://schemas.openxmlformats.org/drawingml/2006/wordprocessingDrawing" xmlns:wpc="http://schemas.microsoft.com/office/word/2010/wordprocessingCanvas" xmlns:wpg="http://schemas.microsoft.com/office/word/2010/wordprocessingGroup" xmlns:wpi="http://schemas.microsoft.com/office/word/2010/wordprocessingInk" xmlns:wps="http://schemas.microsoft.com/office/word/2010/wordprocessingShape" mc:Ignorable="w14 wp14">
+  <w:p>
+    <w:pPr>
+      <w:pStyle w:val="Footer"/>
+      <w:jc w:val="center"/>
+    </w:pPr>
+    <w:r>
+      <w:rPr>
+        <w:rFonts w:ascii="Arial" w:hAnsi="Arial"/>
+        <w:b w:val="0"/>
+        <w:i w:val="0"/>
+        <w:color w:val="56626C"/>
+        <w:sz w:val="14"/>
+      </w:rPr>
+      <w:t>CCAF independent review | Stable snapshot: review-v1.3.1</w:t>
+    </w:r>
+  </w:p>
+</w:ftr>
 </file>
 
 <file path=word/numbering.xml><?xml version="1.0" encoding="utf-8"?>
@@ -1509,12 +1365,12 @@
     <w:qFormat/>
     <w:rsid w:val="00FC693F"/>
     <w:pPr>
-      <w:spacing w:after="40" w:line="240" w:lineRule="auto"/>
+      <w:spacing w:after="20" w:line="240" w:lineRule="auto"/>
     </w:pPr>
     <w:rPr>
       <w:rFonts w:ascii="Arial" w:hAnsi="Arial"/>
       <w:color w:val="1C2731"/>
-      <w:sz w:val="19"/>
+      <w:sz w:val="16"/>
     </w:rPr>
   </w:style>
   <w:style w:type="paragraph" w:styleId="Header">

</xml_diff>

<commit_message>
Improve reviewer form spacing
</commit_message>
<xml_diff>
--- a/docs/CCAF_Independent_Review_Response_Template.docx
+++ b/docs/CCAF_Independent_Review_Response_Template.docx
@@ -4,7 +4,7 @@
   <w:body>
     <w:p>
       <w:pPr>
-        <w:spacing w:after="10"/>
+        <w:spacing w:after="40"/>
         <w:jc w:val="center"/>
       </w:pPr>
       <w:r>
@@ -13,14 +13,14 @@
           <w:b/>
           <w:i w:val="0"/>
           <w:color w:val="193A5A"/>
-          <w:sz w:val="26"/>
+          <w:sz w:val="29"/>
         </w:rPr>
         <w:t>INDEPENDENT TECHNICAL REVIEW RESPONSE</w:t>
       </w:r>
     </w:p>
     <w:p>
       <w:pPr>
-        <w:spacing w:after="60"/>
+        <w:spacing w:after="140"/>
         <w:jc w:val="center"/>
       </w:pPr>
       <w:r>
@@ -29,14 +29,14 @@
           <w:b w:val="0"/>
           <w:i/>
           <w:color w:val="1C2731"/>
-          <w:sz w:val="17"/>
+          <w:sz w:val="19"/>
         </w:rPr>
         <w:t>Continuous Control Assurance Framework (CCAF), Version 1.3.1</w:t>
       </w:r>
     </w:p>
     <w:p>
       <w:pPr>
-        <w:spacing w:after="40"/>
+        <w:spacing w:after="100"/>
       </w:pPr>
       <w:r>
         <w:rPr>
@@ -44,7 +44,7 @@
           <w:b w:val="0"/>
           <w:i w:val="0"/>
           <w:color w:val="56626C"/>
-          <w:sz w:val="15"/>
+          <w:sz w:val="17"/>
         </w:rPr>
         <w:t>This concise form records the materials and procedures personally reviewed and the reviewer's independent professional judgment. A documents-based design review is sufficient; repository inspection and local reproduction are optional.</w:t>
       </w:r>
@@ -52,7 +52,7 @@
     <w:p>
       <w:pPr>
         <w:keepNext/>
-        <w:spacing w:before="50" w:after="30"/>
+        <w:spacing w:before="140" w:after="80"/>
       </w:pPr>
       <w:r>
         <w:rPr>
@@ -60,14 +60,14 @@
           <w:b/>
           <w:i w:val="0"/>
           <w:color w:val="193A5A"/>
-          <w:sz w:val="20"/>
+          <w:sz w:val="22"/>
         </w:rPr>
         <w:t>1. Reviewer information</w:t>
       </w:r>
     </w:p>
     <w:tbl>
       <w:tblPr>
-        <w:tblW w:type="dxa" w:w="10656"/>
+        <w:tblW w:type="dxa" w:w="10368"/>
         <w:tblLayout w:type="fixed"/>
         <w:tblLook w:firstColumn="1" w:firstRow="1" w:lastColumn="0" w:lastRow="0" w:noHBand="0" w:noVBand="1" w:val="04A0"/>
         <w:tblBorders>
@@ -80,19 +80,19 @@
         </w:tblBorders>
       </w:tblPr>
       <w:tblGrid>
-        <w:gridCol w:w="5328"/>
-        <w:gridCol w:w="5328"/>
+        <w:gridCol w:w="5184"/>
+        <w:gridCol w:w="5184"/>
       </w:tblGrid>
       <w:tr>
         <w:tc>
           <w:tcPr>
-            <w:tcW w:type="dxa" w:w="5328"/>
+            <w:tcW w:type="dxa" w:w="5184"/>
             <w:vAlign w:val="center"/>
             <w:tcMar>
-              <w:top w:w="65" w:type="dxa"/>
-              <w:start w:w="90" w:type="dxa"/>
-              <w:bottom w:w="65" w:type="dxa"/>
-              <w:end w:w="90" w:type="dxa"/>
+              <w:top w:w="90" w:type="dxa"/>
+              <w:start w:w="115" w:type="dxa"/>
+              <w:bottom w:w="90" w:type="dxa"/>
+              <w:end w:w="115" w:type="dxa"/>
             </w:tcMar>
           </w:tcPr>
           <w:p>
@@ -105,7 +105,7 @@
                 <w:b/>
                 <w:i w:val="0"/>
                 <w:color w:val="1C2731"/>
-                <w:sz w:val="15"/>
+                <w:sz w:val="17"/>
               </w:rPr>
               <w:t>Reviewer name: __________________________</w:t>
             </w:r>
@@ -113,13 +113,13 @@
         </w:tc>
         <w:tc>
           <w:tcPr>
-            <w:tcW w:type="dxa" w:w="5328"/>
+            <w:tcW w:type="dxa" w:w="5184"/>
             <w:vAlign w:val="center"/>
             <w:tcMar>
-              <w:top w:w="65" w:type="dxa"/>
-              <w:start w:w="90" w:type="dxa"/>
-              <w:bottom w:w="65" w:type="dxa"/>
-              <w:end w:w="90" w:type="dxa"/>
+              <w:top w:w="90" w:type="dxa"/>
+              <w:start w:w="115" w:type="dxa"/>
+              <w:bottom w:w="90" w:type="dxa"/>
+              <w:end w:w="115" w:type="dxa"/>
             </w:tcMar>
           </w:tcPr>
           <w:p>
@@ -132,7 +132,7 @@
                 <w:b/>
                 <w:i w:val="0"/>
                 <w:color w:val="1C2731"/>
-                <w:sz w:val="15"/>
+                <w:sz w:val="17"/>
               </w:rPr>
               <w:t>Current professional title: __________________________</w:t>
             </w:r>
@@ -142,13 +142,13 @@
       <w:tr>
         <w:tc>
           <w:tcPr>
-            <w:tcW w:type="dxa" w:w="5328"/>
+            <w:tcW w:type="dxa" w:w="5184"/>
             <w:vAlign w:val="center"/>
             <w:tcMar>
-              <w:top w:w="65" w:type="dxa"/>
-              <w:start w:w="90" w:type="dxa"/>
-              <w:bottom w:w="65" w:type="dxa"/>
-              <w:end w:w="90" w:type="dxa"/>
+              <w:top w:w="90" w:type="dxa"/>
+              <w:start w:w="115" w:type="dxa"/>
+              <w:bottom w:w="90" w:type="dxa"/>
+              <w:end w:w="115" w:type="dxa"/>
             </w:tcMar>
           </w:tcPr>
           <w:p>
@@ -161,7 +161,7 @@
                 <w:b/>
                 <w:i w:val="0"/>
                 <w:color w:val="1C2731"/>
-                <w:sz w:val="15"/>
+                <w:sz w:val="17"/>
               </w:rPr>
               <w:t>Organization: __________________________</w:t>
             </w:r>
@@ -169,13 +169,13 @@
         </w:tc>
         <w:tc>
           <w:tcPr>
-            <w:tcW w:type="dxa" w:w="5328"/>
+            <w:tcW w:type="dxa" w:w="5184"/>
             <w:vAlign w:val="center"/>
             <w:tcMar>
-              <w:top w:w="65" w:type="dxa"/>
-              <w:start w:w="90" w:type="dxa"/>
-              <w:bottom w:w="65" w:type="dxa"/>
-              <w:end w:w="90" w:type="dxa"/>
+              <w:top w:w="90" w:type="dxa"/>
+              <w:start w:w="115" w:type="dxa"/>
+              <w:bottom w:w="90" w:type="dxa"/>
+              <w:end w:w="115" w:type="dxa"/>
             </w:tcMar>
           </w:tcPr>
           <w:p>
@@ -188,7 +188,7 @@
                 <w:b/>
                 <w:i w:val="0"/>
                 <w:color w:val="1C2731"/>
-                <w:sz w:val="15"/>
+                <w:sz w:val="17"/>
               </w:rPr>
               <w:t>Email or telephone: __________________________</w:t>
             </w:r>
@@ -198,13 +198,13 @@
       <w:tr>
         <w:tc>
           <w:tcPr>
-            <w:tcW w:type="dxa" w:w="5328"/>
+            <w:tcW w:type="dxa" w:w="5184"/>
             <w:vAlign w:val="center"/>
             <w:tcMar>
-              <w:top w:w="65" w:type="dxa"/>
-              <w:start w:w="90" w:type="dxa"/>
-              <w:bottom w:w="65" w:type="dxa"/>
-              <w:end w:w="90" w:type="dxa"/>
+              <w:top w:w="90" w:type="dxa"/>
+              <w:start w:w="115" w:type="dxa"/>
+              <w:bottom w:w="90" w:type="dxa"/>
+              <w:end w:w="115" w:type="dxa"/>
             </w:tcMar>
           </w:tcPr>
           <w:p>
@@ -217,7 +217,7 @@
                 <w:b/>
                 <w:i w:val="0"/>
                 <w:color w:val="1C2731"/>
-                <w:sz w:val="15"/>
+                <w:sz w:val="17"/>
               </w:rPr>
               <w:t>Relevant experience (brief): __________________</w:t>
             </w:r>
@@ -225,13 +225,13 @@
         </w:tc>
         <w:tc>
           <w:tcPr>
-            <w:tcW w:type="dxa" w:w="5328"/>
+            <w:tcW w:type="dxa" w:w="5184"/>
             <w:vAlign w:val="center"/>
             <w:tcMar>
-              <w:top w:w="65" w:type="dxa"/>
-              <w:start w:w="90" w:type="dxa"/>
-              <w:bottom w:w="65" w:type="dxa"/>
-              <w:end w:w="90" w:type="dxa"/>
+              <w:top w:w="90" w:type="dxa"/>
+              <w:start w:w="115" w:type="dxa"/>
+              <w:bottom w:w="90" w:type="dxa"/>
+              <w:end w:w="115" w:type="dxa"/>
             </w:tcMar>
           </w:tcPr>
           <w:p>
@@ -244,7 +244,7 @@
                 <w:b/>
                 <w:i w:val="0"/>
                 <w:color w:val="1C2731"/>
-                <w:sz w:val="15"/>
+                <w:sz w:val="17"/>
               </w:rPr>
               <w:t>Review date: __________________________</w:t>
             </w:r>
@@ -254,13 +254,13 @@
       <w:tr>
         <w:tc>
           <w:tcPr>
-            <w:tcW w:type="dxa" w:w="10656"/>
+            <w:tcW w:type="dxa" w:w="10368"/>
             <w:gridSpan w:val="2"/>
             <w:tcMar>
-              <w:top w:w="65" w:type="dxa"/>
-              <w:start w:w="90" w:type="dxa"/>
-              <w:bottom w:w="65" w:type="dxa"/>
-              <w:end w:w="90" w:type="dxa"/>
+              <w:top w:w="90" w:type="dxa"/>
+              <w:start w:w="115" w:type="dxa"/>
+              <w:bottom w:w="90" w:type="dxa"/>
+              <w:end w:w="115" w:type="dxa"/>
             </w:tcMar>
           </w:tcPr>
           <w:p>
@@ -270,7 +270,7 @@
                 <w:b/>
                 <w:i w:val="0"/>
                 <w:color w:val="1C2731"/>
-                <w:sz w:val="15"/>
+                <w:sz w:val="17"/>
               </w:rPr>
               <w:t>Prior relationship, conflict, or compensation, if any: ________________________________________________</w:t>
             </w:r>
@@ -281,7 +281,7 @@
     <w:p>
       <w:pPr>
         <w:keepNext/>
-        <w:spacing w:before="50" w:after="30"/>
+        <w:spacing w:before="140" w:after="80"/>
       </w:pPr>
       <w:r>
         <w:rPr>
@@ -289,14 +289,14 @@
           <w:b/>
           <w:i w:val="0"/>
           <w:color w:val="193A5A"/>
-          <w:sz w:val="20"/>
+          <w:sz w:val="22"/>
         </w:rPr>
         <w:t>2. Materials, scope, and procedures reviewed</w:t>
       </w:r>
     </w:p>
     <w:tbl>
       <w:tblPr>
-        <w:tblW w:type="dxa" w:w="10656"/>
+        <w:tblW w:type="dxa" w:w="10368"/>
         <w:tblLayout w:type="fixed"/>
         <w:tblLook w:firstColumn="1" w:firstRow="1" w:lastColumn="0" w:lastRow="0" w:noHBand="0" w:noVBand="1" w:val="04A0"/>
         <w:tblBorders>
@@ -309,18 +309,18 @@
         </w:tblBorders>
       </w:tblPr>
       <w:tblGrid>
-        <w:gridCol w:w="10656"/>
+        <w:gridCol w:w="10368"/>
       </w:tblGrid>
       <w:tr>
         <w:tc>
           <w:tcPr>
-            <w:tcW w:type="dxa" w:w="10656"/>
+            <w:tcW w:type="dxa" w:w="10368"/>
             <w:shd w:fill="EAF0F5"/>
             <w:tcMar>
-              <w:top w:w="55" w:type="dxa"/>
-              <w:start w:w="90" w:type="dxa"/>
-              <w:bottom w:w="55" w:type="dxa"/>
-              <w:end w:w="90" w:type="dxa"/>
+              <w:top w:w="85" w:type="dxa"/>
+              <w:start w:w="115" w:type="dxa"/>
+              <w:bottom w:w="85" w:type="dxa"/>
+              <w:end w:w="115" w:type="dxa"/>
             </w:tcMar>
           </w:tcPr>
           <w:p>
@@ -330,7 +330,7 @@
                 <w:b/>
                 <w:i w:val="0"/>
                 <w:color w:val="1C2731"/>
-                <w:sz w:val="15"/>
+                <w:sz w:val="17"/>
               </w:rPr>
               <w:t xml:space="preserve">Stable snapshot: review-v1.3.1  |  </w:t>
             </w:r>
@@ -340,7 +340,7 @@
                 <w:b w:val="0"/>
                 <w:i w:val="0"/>
                 <w:color w:val="215B91"/>
-                <w:sz w:val="14"/>
+                <w:sz w:val="16"/>
               </w:rPr>
               <w:t>https://github.com/Ayodele-Adeniyi/continuous-control-assurance-framework/tree/review-v1.3.1</w:t>
             </w:r>
@@ -350,12 +350,12 @@
       <w:tr>
         <w:tc>
           <w:tcPr>
-            <w:tcW w:type="dxa" w:w="10656"/>
+            <w:tcW w:type="dxa" w:w="10368"/>
             <w:tcMar>
-              <w:top w:w="45" w:type="dxa"/>
-              <w:start w:w="90" w:type="dxa"/>
-              <w:bottom w:w="45" w:type="dxa"/>
-              <w:end w:w="90" w:type="dxa"/>
+              <w:top w:w="80" w:type="dxa"/>
+              <w:start w:w="115" w:type="dxa"/>
+              <w:bottom w:w="80" w:type="dxa"/>
+              <w:end w:w="115" w:type="dxa"/>
             </w:tcMar>
           </w:tcPr>
           <w:p>
@@ -365,7 +365,7 @@
                 <w:b/>
                 <w:i w:val="0"/>
                 <w:color w:val="1C2731"/>
-                <w:sz w:val="15"/>
+                <w:sz w:val="17"/>
               </w:rPr>
               <w:t xml:space="preserve">Materials/procedures: </w:t>
             </w:r>
@@ -375,7 +375,7 @@
                 <w:b w:val="0"/>
                 <w:i w:val="0"/>
                 <w:color w:val="1C2731"/>
-                <w:sz w:val="15"/>
+                <w:sz w:val="16"/>
               </w:rPr>
               <w:t>☐ Methodology  ☐ Control-Test Catalog  ☐ Repository/code (optional)  ☐ Local reproduction (optional)  ☐ Automated tests (optional)</w:t>
             </w:r>
@@ -385,12 +385,12 @@
       <w:tr>
         <w:tc>
           <w:tcPr>
-            <w:tcW w:type="dxa" w:w="10656"/>
+            <w:tcW w:type="dxa" w:w="10368"/>
             <w:tcMar>
-              <w:top w:w="45" w:type="dxa"/>
-              <w:start w:w="90" w:type="dxa"/>
-              <w:bottom w:w="45" w:type="dxa"/>
-              <w:end w:w="90" w:type="dxa"/>
+              <w:top w:w="80" w:type="dxa"/>
+              <w:start w:w="115" w:type="dxa"/>
+              <w:bottom w:w="80" w:type="dxa"/>
+              <w:end w:w="115" w:type="dxa"/>
             </w:tcMar>
           </w:tcPr>
           <w:p>
@@ -400,7 +400,7 @@
                 <w:b/>
                 <w:i w:val="0"/>
                 <w:color w:val="1C2731"/>
-                <w:sz w:val="15"/>
+                <w:sz w:val="17"/>
               </w:rPr>
               <w:t xml:space="preserve">Catalog scope: </w:t>
             </w:r>
@@ -410,7 +410,7 @@
                 <w:b w:val="0"/>
                 <w:i w:val="0"/>
                 <w:color w:val="1C2731"/>
-                <w:sz w:val="15"/>
+                <w:sz w:val="16"/>
               </w:rPr>
               <w:t>☐ All 20 controls  ☐ Selected modules/control IDs: __________________________</w:t>
             </w:r>
@@ -423,7 +423,7 @@
                 <w:b w:val="0"/>
                 <w:i w:val="0"/>
                 <w:color w:val="1C2731"/>
-                <w:sz w:val="15"/>
+                <w:sz w:val="16"/>
               </w:rPr>
               <w:t>Observed result and seed, if locally reproduced: __________________________________________</w:t>
             </w:r>
@@ -433,13 +433,13 @@
       <w:tr>
         <w:tc>
           <w:tcPr>
-            <w:tcW w:type="dxa" w:w="10656"/>
+            <w:tcW w:type="dxa" w:w="10368"/>
             <w:shd w:fill="EAF0F5"/>
             <w:tcMar>
-              <w:top w:w="55" w:type="dxa"/>
-              <w:start w:w="90" w:type="dxa"/>
-              <w:bottom w:w="55" w:type="dxa"/>
-              <w:end w:w="90" w:type="dxa"/>
+              <w:top w:w="90" w:type="dxa"/>
+              <w:start w:w="115" w:type="dxa"/>
+              <w:bottom w:w="90" w:type="dxa"/>
+              <w:end w:w="115" w:type="dxa"/>
             </w:tcMar>
           </w:tcPr>
           <w:p>
@@ -449,7 +449,7 @@
                 <w:b/>
                 <w:i w:val="0"/>
                 <w:color w:val="1C2731"/>
-                <w:sz w:val="15"/>
+                <w:sz w:val="17"/>
               </w:rPr>
               <w:t xml:space="preserve">Documented release facts: </w:t>
             </w:r>
@@ -459,7 +459,7 @@
                 <w:b w:val="0"/>
                 <w:i w:val="0"/>
                 <w:color w:val="1C2731"/>
-                <w:sz w:val="14"/>
+                <w:sz w:val="16"/>
               </w:rPr>
               <w:t>Version 1.3.1; Apache-2.0 license; 20 control tests using synthetic demonstration data. Under the official seed-42 benchmark, the release documentation reports 165 of 165 deliberately planted conditions detected, 3 additional peer-comparison observations, and 168 total exceptions.</w:t>
             </w:r>
@@ -472,7 +472,7 @@
                 <w:b w:val="0"/>
                 <w:i/>
                 <w:color w:val="56626C"/>
-                <w:sz w:val="14"/>
+                <w:sz w:val="16"/>
               </w:rPr>
               <w:t>Corrections, if any: ________________________________________________</w:t>
             </w:r>
@@ -481,9 +481,14 @@
       </w:tr>
     </w:tbl>
     <w:p>
+      <w:r>
+        <w:br w:type="page"/>
+      </w:r>
+    </w:p>
+    <w:p>
       <w:pPr>
         <w:keepNext/>
-        <w:spacing w:before="50" w:after="30"/>
+        <w:spacing w:before="140" w:after="80"/>
       </w:pPr>
       <w:r>
         <w:rPr>
@@ -491,7 +496,7 @@
           <w:b/>
           <w:i w:val="0"/>
           <w:color w:val="193A5A"/>
-          <w:sz w:val="20"/>
+          <w:sz w:val="22"/>
         </w:rPr>
         <w:t>3. Professional opinion</w:t>
       </w:r>
@@ -499,7 +504,7 @@
     <w:p>
       <w:pPr>
         <w:keepNext/>
-        <w:spacing w:before="24" w:after="10"/>
+        <w:spacing w:before="100" w:after="40"/>
       </w:pPr>
       <w:r>
         <w:rPr>
@@ -507,7 +512,7 @@
           <w:b/>
           <w:i w:val="0"/>
           <w:color w:val="1C2731"/>
-          <w:sz w:val="16"/>
+          <w:sz w:val="19"/>
         </w:rPr>
         <w:t xml:space="preserve">Technical soundness. </w:t>
       </w:r>
@@ -517,15 +522,15 @@
           <w:b w:val="0"/>
           <w:i w:val="0"/>
           <w:color w:val="1C2731"/>
-          <w:sz w:val="16"/>
+          <w:sz w:val="18"/>
         </w:rPr>
         <w:t>In my professional judgment, this framework is:</w:t>
       </w:r>
     </w:p>
     <w:p>
       <w:pPr>
-        <w:spacing w:after="6" w:line="221" w:lineRule="auto"/>
-        <w:ind w:left="115"/>
+        <w:spacing w:after="60" w:line="252" w:lineRule="auto"/>
+        <w:ind w:left="216"/>
       </w:pPr>
       <w:r>
         <w:rPr>
@@ -533,7 +538,7 @@
           <w:b w:val="0"/>
           <w:i w:val="0"/>
           <w:color w:val="1C2731"/>
-          <w:sz w:val="15"/>
+          <w:sz w:val="17"/>
         </w:rPr>
         <w:t>☐ Technically sound and consistent with professional control-testing practice for a synthetic reference prototype</w:t>
       </w:r>
@@ -546,7 +551,7 @@
           <w:b w:val="0"/>
           <w:i w:val="0"/>
           <w:color w:val="1C2731"/>
-          <w:sz w:val="15"/>
+          <w:sz w:val="17"/>
         </w:rPr>
         <w:t>☐ Technically sound with minor reservations explained below</w:t>
       </w:r>
@@ -559,14 +564,15 @@
           <w:b w:val="0"/>
           <w:i w:val="0"/>
           <w:color w:val="1C2731"/>
-          <w:sz w:val="15"/>
+          <w:sz w:val="17"/>
         </w:rPr>
         <w:t>☐ Not technically sound, as explained below</w:t>
       </w:r>
     </w:p>
     <w:p>
       <w:pPr>
-        <w:spacing w:after="14"/>
+        <w:keepNext/>
+        <w:spacing w:after="40"/>
       </w:pPr>
       <w:r>
         <w:rPr>
@@ -574,25 +580,50 @@
           <w:b w:val="0"/>
           <w:i/>
           <w:color w:val="56626C"/>
-          <w:sz w:val="15"/>
+          <w:sz w:val="17"/>
         </w:rPr>
-        <w:t xml:space="preserve">Comments (optional): </w:t>
-      </w:r>
-      <w:r>
-        <w:rPr>
-          <w:rFonts w:ascii="Arial" w:hAnsi="Arial"/>
-          <w:b w:val="0"/>
-          <w:i w:val="0"/>
-          <w:color w:val="56626C"/>
-          <w:sz w:val="15"/>
-        </w:rPr>
-        <w:t>_______________________________________________________________</w:t>
+        <w:t>Comments (optional):</w:t>
       </w:r>
     </w:p>
+    <w:tbl>
+      <w:tblPr>
+        <w:tblW w:type="dxa" w:w="10368"/>
+        <w:tblLayout w:type="fixed"/>
+        <w:tblLook w:firstColumn="1" w:firstRow="1" w:lastColumn="0" w:lastRow="0" w:noHBand="0" w:noVBand="1" w:val="04A0"/>
+        <w:tblBorders>
+          <w:top w:val="single" w:sz="5" w:color="8EA2B3"/>
+          <w:left w:val="single" w:sz="5" w:color="8EA2B3"/>
+          <w:bottom w:val="single" w:sz="5" w:color="8EA2B3"/>
+          <w:right w:val="single" w:sz="5" w:color="8EA2B3"/>
+          <w:insideH w:val="single" w:sz="5" w:color="8EA2B3"/>
+          <w:insideV w:val="single" w:sz="5" w:color="8EA2B3"/>
+        </w:tblBorders>
+      </w:tblPr>
+      <w:tblGrid>
+        <w:gridCol w:w="10368"/>
+      </w:tblGrid>
+      <w:tr>
+        <w:trPr>
+          <w:trHeight w:val="547" w:hRule="atLeast"/>
+        </w:trPr>
+        <w:tc>
+          <w:tcPr>
+            <w:tcW w:type="dxa" w:w="10368"/>
+            <w:tcMar>
+              <w:top w:w="70" w:type="dxa"/>
+              <w:start w:w="115" w:type="dxa"/>
+              <w:bottom w:w="70" w:type="dxa"/>
+              <w:end w:w="115" w:type="dxa"/>
+            </w:tcMar>
+          </w:tcPr>
+          <w:p/>
+        </w:tc>
+      </w:tr>
+    </w:tbl>
     <w:p>
       <w:pPr>
         <w:keepNext/>
-        <w:spacing w:before="24" w:after="10"/>
+        <w:spacing w:before="100" w:after="40"/>
       </w:pPr>
       <w:r>
         <w:rPr>
@@ -600,7 +631,7 @@
           <w:b/>
           <w:i w:val="0"/>
           <w:color w:val="1C2731"/>
-          <w:sz w:val="16"/>
+          <w:sz w:val="19"/>
         </w:rPr>
         <w:t xml:space="preserve">Claims and limitations. </w:t>
       </w:r>
@@ -610,15 +641,15 @@
           <w:b w:val="0"/>
           <w:i w:val="0"/>
           <w:color w:val="1C2731"/>
-          <w:sz w:val="16"/>
+          <w:sz w:val="18"/>
         </w:rPr>
         <w:t>In my professional judgment, the framework's claims are:</w:t>
       </w:r>
     </w:p>
     <w:p>
       <w:pPr>
-        <w:spacing w:after="6" w:line="221" w:lineRule="auto"/>
-        <w:ind w:left="115"/>
+        <w:spacing w:after="60" w:line="252" w:lineRule="auto"/>
+        <w:ind w:left="216"/>
       </w:pPr>
       <w:r>
         <w:rPr>
@@ -626,7 +657,7 @@
           <w:b w:val="0"/>
           <w:i w:val="0"/>
           <w:color w:val="1C2731"/>
-          <w:sz w:val="15"/>
+          <w:sz w:val="17"/>
         </w:rPr>
         <w:t>☐ Appropriately bounded to what the demonstration establishes</w:t>
       </w:r>
@@ -639,7 +670,7 @@
           <w:b w:val="0"/>
           <w:i w:val="0"/>
           <w:color w:val="1C2731"/>
-          <w:sz w:val="15"/>
+          <w:sz w:val="17"/>
         </w:rPr>
         <w:t>☐ Generally appropriate, but some claims are overstated as explained below</w:t>
       </w:r>
@@ -652,14 +683,15 @@
           <w:b w:val="0"/>
           <w:i w:val="0"/>
           <w:color w:val="1C2731"/>
-          <w:sz w:val="15"/>
+          <w:sz w:val="17"/>
         </w:rPr>
         <w:t>☐ Not appropriately bounded, as explained below</w:t>
       </w:r>
     </w:p>
     <w:p>
       <w:pPr>
-        <w:spacing w:after="14"/>
+        <w:keepNext/>
+        <w:spacing w:after="40"/>
       </w:pPr>
       <w:r>
         <w:rPr>
@@ -667,25 +699,50 @@
           <w:b w:val="0"/>
           <w:i/>
           <w:color w:val="56626C"/>
-          <w:sz w:val="15"/>
+          <w:sz w:val="17"/>
         </w:rPr>
-        <w:t xml:space="preserve">Comments (optional): </w:t>
-      </w:r>
-      <w:r>
-        <w:rPr>
-          <w:rFonts w:ascii="Arial" w:hAnsi="Arial"/>
-          <w:b w:val="0"/>
-          <w:i w:val="0"/>
-          <w:color w:val="56626C"/>
-          <w:sz w:val="15"/>
-        </w:rPr>
-        <w:t>_______________________________________________________________</w:t>
+        <w:t>Comments (optional):</w:t>
       </w:r>
     </w:p>
+    <w:tbl>
+      <w:tblPr>
+        <w:tblW w:type="dxa" w:w="10368"/>
+        <w:tblLayout w:type="fixed"/>
+        <w:tblLook w:firstColumn="1" w:firstRow="1" w:lastColumn="0" w:lastRow="0" w:noHBand="0" w:noVBand="1" w:val="04A0"/>
+        <w:tblBorders>
+          <w:top w:val="single" w:sz="5" w:color="8EA2B3"/>
+          <w:left w:val="single" w:sz="5" w:color="8EA2B3"/>
+          <w:bottom w:val="single" w:sz="5" w:color="8EA2B3"/>
+          <w:right w:val="single" w:sz="5" w:color="8EA2B3"/>
+          <w:insideH w:val="single" w:sz="5" w:color="8EA2B3"/>
+          <w:insideV w:val="single" w:sz="5" w:color="8EA2B3"/>
+        </w:tblBorders>
+      </w:tblPr>
+      <w:tblGrid>
+        <w:gridCol w:w="10368"/>
+      </w:tblGrid>
+      <w:tr>
+        <w:trPr>
+          <w:trHeight w:val="547" w:hRule="atLeast"/>
+        </w:trPr>
+        <w:tc>
+          <w:tcPr>
+            <w:tcW w:type="dxa" w:w="10368"/>
+            <w:tcMar>
+              <w:top w:w="70" w:type="dxa"/>
+              <w:start w:w="115" w:type="dxa"/>
+              <w:bottom w:w="70" w:type="dxa"/>
+              <w:end w:w="115" w:type="dxa"/>
+            </w:tcMar>
+          </w:tcPr>
+          <w:p/>
+        </w:tc>
+      </w:tr>
+    </w:tbl>
     <w:p>
       <w:pPr>
         <w:keepNext/>
-        <w:spacing w:before="24" w:after="10"/>
+        <w:spacing w:before="100" w:after="40"/>
       </w:pPr>
       <w:r>
         <w:rPr>
@@ -693,7 +750,7 @@
           <w:b/>
           <w:i w:val="0"/>
           <w:color w:val="1C2731"/>
-          <w:sz w:val="16"/>
+          <w:sz w:val="19"/>
         </w:rPr>
         <w:t xml:space="preserve">Transferability. </w:t>
       </w:r>
@@ -703,15 +760,15 @@
           <w:b w:val="0"/>
           <w:i w:val="0"/>
           <w:color w:val="1C2731"/>
-          <w:sz w:val="16"/>
+          <w:sz w:val="18"/>
         </w:rPr>
         <w:t>In my professional judgment, this methodology:</w:t>
       </w:r>
     </w:p>
     <w:p>
       <w:pPr>
-        <w:spacing w:after="6" w:line="221" w:lineRule="auto"/>
-        <w:ind w:left="115"/>
+        <w:spacing w:after="60" w:line="252" w:lineRule="auto"/>
+        <w:ind w:left="216"/>
       </w:pPr>
       <w:r>
         <w:rPr>
@@ -719,7 +776,7 @@
           <w:b w:val="0"/>
           <w:i w:val="0"/>
           <w:color w:val="1C2731"/>
-          <w:sz w:val="15"/>
+          <w:sz w:val="17"/>
         </w:rPr>
         <w:t>☐ Could be adapted by other institutions or practitioners to their own authorized data and control environments</w:t>
       </w:r>
@@ -732,7 +789,7 @@
           <w:b w:val="0"/>
           <w:i w:val="0"/>
           <w:color w:val="1C2731"/>
-          <w:sz w:val="15"/>
+          <w:sz w:val="17"/>
         </w:rPr>
         <w:t>☐ Could be adapted with significant effort, as explained below</w:t>
       </w:r>
@@ -745,14 +802,15 @@
           <w:b w:val="0"/>
           <w:i w:val="0"/>
           <w:color w:val="1C2731"/>
-          <w:sz w:val="15"/>
+          <w:sz w:val="17"/>
         </w:rPr>
         <w:t>☐ Is not practically transferable, as explained below</w:t>
       </w:r>
     </w:p>
     <w:p>
       <w:pPr>
-        <w:spacing w:after="14"/>
+        <w:keepNext/>
+        <w:spacing w:after="40"/>
       </w:pPr>
       <w:r>
         <w:rPr>
@@ -760,50 +818,14 @@
           <w:b w:val="0"/>
           <w:i/>
           <w:color w:val="56626C"/>
-          <w:sz w:val="15"/>
+          <w:sz w:val="17"/>
         </w:rPr>
-        <w:t xml:space="preserve">Comments (optional): </w:t>
-      </w:r>
-      <w:r>
-        <w:rPr>
-          <w:rFonts w:ascii="Arial" w:hAnsi="Arial"/>
-          <w:b w:val="0"/>
-          <w:i w:val="0"/>
-          <w:color w:val="56626C"/>
-          <w:sz w:val="15"/>
-        </w:rPr>
-        <w:t>_______________________________________________________________</w:t>
-      </w:r>
-    </w:p>
-    <w:p>
-      <w:pPr>
-        <w:keepNext/>
-        <w:spacing w:before="20" w:after="10"/>
-      </w:pPr>
-      <w:r>
-        <w:rPr>
-          <w:rFonts w:ascii="Arial" w:hAnsi="Arial"/>
-          <w:b/>
-          <w:i w:val="0"/>
-          <w:color w:val="1C2731"/>
-          <w:sz w:val="16"/>
-        </w:rPr>
-        <w:t xml:space="preserve">Overall assessment. </w:t>
-      </w:r>
-      <w:r>
-        <w:rPr>
-          <w:rFonts w:ascii="Arial" w:hAnsi="Arial"/>
-          <w:b w:val="0"/>
-          <w:i w:val="0"/>
-          <w:color w:val="1C2731"/>
-          <w:sz w:val="16"/>
-        </w:rPr>
-        <w:t>Briefly address technical soundness, limitations, and potential transferability (2-4 sentences):</w:t>
+        <w:t>Comments (optional):</w:t>
       </w:r>
     </w:p>
     <w:tbl>
       <w:tblPr>
-        <w:tblW w:type="dxa" w:w="10656"/>
+        <w:tblW w:type="dxa" w:w="10368"/>
         <w:tblLayout w:type="fixed"/>
         <w:tblLook w:firstColumn="1" w:firstRow="1" w:lastColumn="0" w:lastRow="0" w:noHBand="0" w:noVBand="1" w:val="04A0"/>
         <w:tblBorders>
@@ -816,21 +838,82 @@
         </w:tblBorders>
       </w:tblPr>
       <w:tblGrid>
-        <w:gridCol w:w="10656"/>
+        <w:gridCol w:w="10368"/>
       </w:tblGrid>
       <w:tr>
         <w:trPr>
-          <w:trHeight w:val="835" w:hRule="atLeast"/>
+          <w:trHeight w:val="547" w:hRule="atLeast"/>
         </w:trPr>
         <w:tc>
           <w:tcPr>
-            <w:tcW w:type="dxa" w:w="10656"/>
+            <w:tcW w:type="dxa" w:w="10368"/>
+            <w:tcMar>
+              <w:top w:w="70" w:type="dxa"/>
+              <w:start w:w="115" w:type="dxa"/>
+              <w:bottom w:w="70" w:type="dxa"/>
+              <w:end w:w="115" w:type="dxa"/>
+            </w:tcMar>
+          </w:tcPr>
+          <w:p/>
+        </w:tc>
+      </w:tr>
+    </w:tbl>
+    <w:p>
+      <w:pPr>
+        <w:keepNext/>
+        <w:spacing w:before="140" w:after="60"/>
+      </w:pPr>
+      <w:r>
+        <w:rPr>
+          <w:rFonts w:ascii="Arial" w:hAnsi="Arial"/>
+          <w:b/>
+          <w:i w:val="0"/>
+          <w:color w:val="1C2731"/>
+          <w:sz w:val="19"/>
+        </w:rPr>
+        <w:t xml:space="preserve">Overall assessment. </w:t>
+      </w:r>
+      <w:r>
+        <w:rPr>
+          <w:rFonts w:ascii="Arial" w:hAnsi="Arial"/>
+          <w:b w:val="0"/>
+          <w:i w:val="0"/>
+          <w:color w:val="1C2731"/>
+          <w:sz w:val="18"/>
+        </w:rPr>
+        <w:t>Briefly address technical soundness, limitations, and potential transferability (2-4 sentences):</w:t>
+      </w:r>
+    </w:p>
+    <w:tbl>
+      <w:tblPr>
+        <w:tblW w:type="dxa" w:w="10368"/>
+        <w:tblLayout w:type="fixed"/>
+        <w:tblLook w:firstColumn="1" w:firstRow="1" w:lastColumn="0" w:lastRow="0" w:noHBand="0" w:noVBand="1" w:val="04A0"/>
+        <w:tblBorders>
+          <w:top w:val="single" w:sz="5" w:color="8EA2B3"/>
+          <w:left w:val="single" w:sz="5" w:color="8EA2B3"/>
+          <w:bottom w:val="single" w:sz="5" w:color="8EA2B3"/>
+          <w:right w:val="single" w:sz="5" w:color="8EA2B3"/>
+          <w:insideH w:val="single" w:sz="5" w:color="8EA2B3"/>
+          <w:insideV w:val="single" w:sz="5" w:color="8EA2B3"/>
+        </w:tblBorders>
+      </w:tblPr>
+      <w:tblGrid>
+        <w:gridCol w:w="10368"/>
+      </w:tblGrid>
+      <w:tr>
+        <w:trPr>
+          <w:trHeight w:val="1584" w:hRule="atLeast"/>
+        </w:trPr>
+        <w:tc>
+          <w:tcPr>
+            <w:tcW w:type="dxa" w:w="10368"/>
             <w:vAlign w:val="top"/>
             <w:tcMar>
-              <w:top w:w="55" w:type="dxa"/>
-              <w:start w:w="90" w:type="dxa"/>
-              <w:bottom w:w="55" w:type="dxa"/>
-              <w:end w:w="90" w:type="dxa"/>
+              <w:top w:w="85" w:type="dxa"/>
+              <w:start w:w="115" w:type="dxa"/>
+              <w:bottom w:w="85" w:type="dxa"/>
+              <w:end w:w="115" w:type="dxa"/>
             </w:tcMar>
           </w:tcPr>
           <w:p>
@@ -840,7 +923,7 @@
                 <w:b w:val="0"/>
                 <w:i w:val="0"/>
                 <w:color w:val="1C2731"/>
-                <w:sz w:val="16"/>
+                <w:sz w:val="18"/>
               </w:rPr>
             </w:r>
           </w:p>
@@ -850,7 +933,7 @@
     <w:p>
       <w:pPr>
         <w:keepNext/>
-        <w:spacing w:before="50" w:after="30"/>
+        <w:spacing w:before="140" w:after="80"/>
       </w:pPr>
       <w:r>
         <w:rPr>
@@ -858,14 +941,14 @@
           <w:b/>
           <w:i w:val="0"/>
           <w:color w:val="193A5A"/>
-          <w:sz w:val="20"/>
+          <w:sz w:val="22"/>
         </w:rPr>
         <w:t>4. Confirmation</w:t>
       </w:r>
     </w:p>
     <w:p>
       <w:pPr>
-        <w:spacing w:after="20"/>
+        <w:spacing w:after="140"/>
       </w:pPr>
       <w:r>
         <w:rPr>
@@ -873,14 +956,14 @@
           <w:b w:val="0"/>
           <w:i w:val="0"/>
           <w:color w:val="1C2731"/>
-          <w:sz w:val="14"/>
+          <w:sz w:val="17"/>
         </w:rPr>
         <w:t>This response reflects my independent professional judgment based on the materials and procedures identified above. It does not constitute institutional endorsement, regulatory approval, certification, a claim of institutional adoption, or a claim about production performance. I understand that this response may be cited publicly and in professional or immigration-related submissions as evidence of independent review.</w:t>
       </w:r>
     </w:p>
     <w:tbl>
       <w:tblPr>
-        <w:tblW w:type="dxa" w:w="10656"/>
+        <w:tblW w:type="dxa" w:w="10368"/>
         <w:tblLayout w:type="fixed"/>
         <w:tblLook w:firstColumn="1" w:firstRow="1" w:lastColumn="0" w:lastRow="0" w:noHBand="0" w:noVBand="1" w:val="04A0"/>
         <w:tblBorders>
@@ -893,19 +976,19 @@
         </w:tblBorders>
       </w:tblPr>
       <w:tblGrid>
-        <w:gridCol w:w="3240"/>
-        <w:gridCol w:w="4536"/>
-        <w:gridCol w:w="2880"/>
+        <w:gridCol w:w="3168"/>
+        <w:gridCol w:w="4392"/>
+        <w:gridCol w:w="2808"/>
       </w:tblGrid>
       <w:tr>
         <w:tc>
           <w:tcPr>
-            <w:tcW w:type="dxa" w:w="3552"/>
+            <w:tcW w:type="dxa" w:w="3456"/>
             <w:tcMar>
-              <w:top w:w="55" w:type="dxa"/>
-              <w:start w:w="90" w:type="dxa"/>
-              <w:bottom w:w="55" w:type="dxa"/>
-              <w:end w:w="90" w:type="dxa"/>
+              <w:top w:w="85" w:type="dxa"/>
+              <w:start w:w="115" w:type="dxa"/>
+              <w:bottom w:w="85" w:type="dxa"/>
+              <w:end w:w="115" w:type="dxa"/>
             </w:tcMar>
           </w:tcPr>
           <w:p>
@@ -915,7 +998,7 @@
                 <w:b/>
                 <w:i w:val="0"/>
                 <w:color w:val="1C2731"/>
-                <w:sz w:val="16"/>
+                <w:sz w:val="17"/>
               </w:rPr>
               <w:t>Name (printed): __________________</w:t>
             </w:r>
@@ -923,12 +1006,12 @@
         </w:tc>
         <w:tc>
           <w:tcPr>
-            <w:tcW w:type="dxa" w:w="3552"/>
+            <w:tcW w:type="dxa" w:w="3456"/>
             <w:tcMar>
-              <w:top w:w="55" w:type="dxa"/>
-              <w:start w:w="90" w:type="dxa"/>
-              <w:bottom w:w="55" w:type="dxa"/>
-              <w:end w:w="90" w:type="dxa"/>
+              <w:top w:w="85" w:type="dxa"/>
+              <w:start w:w="115" w:type="dxa"/>
+              <w:bottom w:w="85" w:type="dxa"/>
+              <w:end w:w="115" w:type="dxa"/>
             </w:tcMar>
           </w:tcPr>
           <w:p>
@@ -938,7 +1021,7 @@
                 <w:b/>
                 <w:i w:val="0"/>
                 <w:color w:val="1C2731"/>
-                <w:sz w:val="16"/>
+                <w:sz w:val="17"/>
               </w:rPr>
               <w:t>Signature: __________________________</w:t>
             </w:r>
@@ -946,12 +1029,12 @@
         </w:tc>
         <w:tc>
           <w:tcPr>
-            <w:tcW w:type="dxa" w:w="3552"/>
+            <w:tcW w:type="dxa" w:w="3456"/>
             <w:tcMar>
-              <w:top w:w="55" w:type="dxa"/>
-              <w:start w:w="90" w:type="dxa"/>
-              <w:bottom w:w="55" w:type="dxa"/>
-              <w:end w:w="90" w:type="dxa"/>
+              <w:top w:w="85" w:type="dxa"/>
+              <w:start w:w="115" w:type="dxa"/>
+              <w:bottom w:w="85" w:type="dxa"/>
+              <w:end w:w="115" w:type="dxa"/>
             </w:tcMar>
           </w:tcPr>
           <w:p>
@@ -961,7 +1044,7 @@
                 <w:b/>
                 <w:i w:val="0"/>
                 <w:color w:val="1C2731"/>
-                <w:sz w:val="16"/>
+                <w:sz w:val="17"/>
               </w:rPr>
               <w:t>Date: ______________</w:t>
             </w:r>
@@ -972,7 +1055,7 @@
     <w:sectPr>
       <w:footerReference w:type="default" r:id="rId9"/>
       <w:pgSz w:w="12240" w:h="15840"/>
-      <w:pgMar w:top="547" w:right="792" w:bottom="547" w:left="792" w:header="720" w:footer="720" w:gutter="0"/>
+      <w:pgMar w:top="792" w:right="936" w:bottom="792" w:left="936" w:header="720" w:footer="720" w:gutter="0"/>
       <w:cols w:space="720"/>
       <w:docGrid w:linePitch="360"/>
     </w:sectPr>
@@ -993,7 +1076,7 @@
         <w:b w:val="0"/>
         <w:i w:val="0"/>
         <w:color w:val="56626C"/>
-        <w:sz w:val="14"/>
+        <w:sz w:val="15"/>
       </w:rPr>
       <w:t>CCAF independent review | Stable snapshot: review-v1.3.1</w:t>
     </w:r>
@@ -1365,12 +1448,12 @@
     <w:qFormat/>
     <w:rsid w:val="00FC693F"/>
     <w:pPr>
-      <w:spacing w:after="20" w:line="240" w:lineRule="auto"/>
+      <w:spacing w:after="60" w:line="252" w:lineRule="auto"/>
     </w:pPr>
     <w:rPr>
       <w:rFonts w:ascii="Arial" w:hAnsi="Arial"/>
       <w:color w:val="1C2731"/>
-      <w:sz w:val="16"/>
+      <w:sz w:val="18"/>
     </w:rPr>
   </w:style>
   <w:style w:type="paragraph" w:styleId="Header">

</xml_diff>

<commit_message>
Keep reviewer form readable on one page
</commit_message>
<xml_diff>
--- a/docs/CCAF_Independent_Review_Response_Template.docx
+++ b/docs/CCAF_Independent_Review_Response_Template.docx
@@ -4,7 +4,7 @@
   <w:body>
     <w:p>
       <w:pPr>
-        <w:spacing w:after="40"/>
+        <w:spacing w:after="20"/>
         <w:jc w:val="center"/>
       </w:pPr>
       <w:r>
@@ -13,14 +13,14 @@
           <w:b/>
           <w:i w:val="0"/>
           <w:color w:val="193A5A"/>
-          <w:sz w:val="29"/>
+          <w:sz w:val="28"/>
         </w:rPr>
         <w:t>INDEPENDENT TECHNICAL REVIEW RESPONSE</w:t>
       </w:r>
     </w:p>
     <w:p>
       <w:pPr>
-        <w:spacing w:after="140"/>
+        <w:spacing w:after="80"/>
         <w:jc w:val="center"/>
       </w:pPr>
       <w:r>
@@ -29,14 +29,14 @@
           <w:b w:val="0"/>
           <w:i/>
           <w:color w:val="1C2731"/>
-          <w:sz w:val="19"/>
+          <w:sz w:val="18"/>
         </w:rPr>
         <w:t>Continuous Control Assurance Framework (CCAF), Version 1.3.1</w:t>
       </w:r>
     </w:p>
     <w:p>
       <w:pPr>
-        <w:spacing w:after="100"/>
+        <w:spacing w:after="60"/>
       </w:pPr>
       <w:r>
         <w:rPr>
@@ -44,7 +44,7 @@
           <w:b w:val="0"/>
           <w:i w:val="0"/>
           <w:color w:val="56626C"/>
-          <w:sz w:val="17"/>
+          <w:sz w:val="16"/>
         </w:rPr>
         <w:t>This concise form records the materials and procedures personally reviewed and the reviewer's independent professional judgment. A documents-based design review is sufficient; repository inspection and local reproduction are optional.</w:t>
       </w:r>
@@ -52,7 +52,7 @@
     <w:p>
       <w:pPr>
         <w:keepNext/>
-        <w:spacing w:before="140" w:after="80"/>
+        <w:spacing w:before="80" w:after="40"/>
       </w:pPr>
       <w:r>
         <w:rPr>
@@ -60,14 +60,14 @@
           <w:b/>
           <w:i w:val="0"/>
           <w:color w:val="193A5A"/>
-          <w:sz w:val="22"/>
+          <w:sz w:val="20"/>
         </w:rPr>
         <w:t>1. Reviewer information</w:t>
       </w:r>
     </w:p>
     <w:tbl>
       <w:tblPr>
-        <w:tblW w:type="dxa" w:w="10368"/>
+        <w:tblW w:type="dxa" w:w="10656"/>
         <w:tblLayout w:type="fixed"/>
         <w:tblLook w:firstColumn="1" w:firstRow="1" w:lastColumn="0" w:lastRow="0" w:noHBand="0" w:noVBand="1" w:val="04A0"/>
         <w:tblBorders>
@@ -80,19 +80,19 @@
         </w:tblBorders>
       </w:tblPr>
       <w:tblGrid>
-        <w:gridCol w:w="5184"/>
-        <w:gridCol w:w="5184"/>
+        <w:gridCol w:w="5328"/>
+        <w:gridCol w:w="5328"/>
       </w:tblGrid>
       <w:tr>
         <w:tc>
           <w:tcPr>
-            <w:tcW w:type="dxa" w:w="5184"/>
+            <w:tcW w:type="dxa" w:w="5328"/>
             <w:vAlign w:val="center"/>
             <w:tcMar>
-              <w:top w:w="90" w:type="dxa"/>
-              <w:start w:w="115" w:type="dxa"/>
-              <w:bottom w:w="90" w:type="dxa"/>
-              <w:end w:w="115" w:type="dxa"/>
+              <w:top w:w="70" w:type="dxa"/>
+              <w:start w:w="95" w:type="dxa"/>
+              <w:bottom w:w="70" w:type="dxa"/>
+              <w:end w:w="95" w:type="dxa"/>
             </w:tcMar>
           </w:tcPr>
           <w:p>
@@ -105,7 +105,7 @@
                 <w:b/>
                 <w:i w:val="0"/>
                 <w:color w:val="1C2731"/>
-                <w:sz w:val="17"/>
+                <w:sz w:val="16"/>
               </w:rPr>
               <w:t>Reviewer name: __________________________</w:t>
             </w:r>
@@ -113,13 +113,13 @@
         </w:tc>
         <w:tc>
           <w:tcPr>
-            <w:tcW w:type="dxa" w:w="5184"/>
+            <w:tcW w:type="dxa" w:w="5328"/>
             <w:vAlign w:val="center"/>
             <w:tcMar>
-              <w:top w:w="90" w:type="dxa"/>
-              <w:start w:w="115" w:type="dxa"/>
-              <w:bottom w:w="90" w:type="dxa"/>
-              <w:end w:w="115" w:type="dxa"/>
+              <w:top w:w="70" w:type="dxa"/>
+              <w:start w:w="95" w:type="dxa"/>
+              <w:bottom w:w="70" w:type="dxa"/>
+              <w:end w:w="95" w:type="dxa"/>
             </w:tcMar>
           </w:tcPr>
           <w:p>
@@ -132,7 +132,7 @@
                 <w:b/>
                 <w:i w:val="0"/>
                 <w:color w:val="1C2731"/>
-                <w:sz w:val="17"/>
+                <w:sz w:val="16"/>
               </w:rPr>
               <w:t>Current professional title: __________________________</w:t>
             </w:r>
@@ -142,13 +142,13 @@
       <w:tr>
         <w:tc>
           <w:tcPr>
-            <w:tcW w:type="dxa" w:w="5184"/>
+            <w:tcW w:type="dxa" w:w="5328"/>
             <w:vAlign w:val="center"/>
             <w:tcMar>
-              <w:top w:w="90" w:type="dxa"/>
-              <w:start w:w="115" w:type="dxa"/>
-              <w:bottom w:w="90" w:type="dxa"/>
-              <w:end w:w="115" w:type="dxa"/>
+              <w:top w:w="70" w:type="dxa"/>
+              <w:start w:w="95" w:type="dxa"/>
+              <w:bottom w:w="70" w:type="dxa"/>
+              <w:end w:w="95" w:type="dxa"/>
             </w:tcMar>
           </w:tcPr>
           <w:p>
@@ -161,7 +161,7 @@
                 <w:b/>
                 <w:i w:val="0"/>
                 <w:color w:val="1C2731"/>
-                <w:sz w:val="17"/>
+                <w:sz w:val="16"/>
               </w:rPr>
               <w:t>Organization: __________________________</w:t>
             </w:r>
@@ -169,13 +169,13 @@
         </w:tc>
         <w:tc>
           <w:tcPr>
-            <w:tcW w:type="dxa" w:w="5184"/>
+            <w:tcW w:type="dxa" w:w="5328"/>
             <w:vAlign w:val="center"/>
             <w:tcMar>
-              <w:top w:w="90" w:type="dxa"/>
-              <w:start w:w="115" w:type="dxa"/>
-              <w:bottom w:w="90" w:type="dxa"/>
-              <w:end w:w="115" w:type="dxa"/>
+              <w:top w:w="70" w:type="dxa"/>
+              <w:start w:w="95" w:type="dxa"/>
+              <w:bottom w:w="70" w:type="dxa"/>
+              <w:end w:w="95" w:type="dxa"/>
             </w:tcMar>
           </w:tcPr>
           <w:p>
@@ -188,7 +188,7 @@
                 <w:b/>
                 <w:i w:val="0"/>
                 <w:color w:val="1C2731"/>
-                <w:sz w:val="17"/>
+                <w:sz w:val="16"/>
               </w:rPr>
               <w:t>Email or telephone: __________________________</w:t>
             </w:r>
@@ -198,13 +198,13 @@
       <w:tr>
         <w:tc>
           <w:tcPr>
-            <w:tcW w:type="dxa" w:w="5184"/>
+            <w:tcW w:type="dxa" w:w="5328"/>
             <w:vAlign w:val="center"/>
             <w:tcMar>
-              <w:top w:w="90" w:type="dxa"/>
-              <w:start w:w="115" w:type="dxa"/>
-              <w:bottom w:w="90" w:type="dxa"/>
-              <w:end w:w="115" w:type="dxa"/>
+              <w:top w:w="70" w:type="dxa"/>
+              <w:start w:w="95" w:type="dxa"/>
+              <w:bottom w:w="70" w:type="dxa"/>
+              <w:end w:w="95" w:type="dxa"/>
             </w:tcMar>
           </w:tcPr>
           <w:p>
@@ -217,7 +217,7 @@
                 <w:b/>
                 <w:i w:val="0"/>
                 <w:color w:val="1C2731"/>
-                <w:sz w:val="17"/>
+                <w:sz w:val="16"/>
               </w:rPr>
               <w:t>Relevant experience (brief): __________________</w:t>
             </w:r>
@@ -225,13 +225,13 @@
         </w:tc>
         <w:tc>
           <w:tcPr>
-            <w:tcW w:type="dxa" w:w="5184"/>
+            <w:tcW w:type="dxa" w:w="5328"/>
             <w:vAlign w:val="center"/>
             <w:tcMar>
-              <w:top w:w="90" w:type="dxa"/>
-              <w:start w:w="115" w:type="dxa"/>
-              <w:bottom w:w="90" w:type="dxa"/>
-              <w:end w:w="115" w:type="dxa"/>
+              <w:top w:w="70" w:type="dxa"/>
+              <w:start w:w="95" w:type="dxa"/>
+              <w:bottom w:w="70" w:type="dxa"/>
+              <w:end w:w="95" w:type="dxa"/>
             </w:tcMar>
           </w:tcPr>
           <w:p>
@@ -244,7 +244,7 @@
                 <w:b/>
                 <w:i w:val="0"/>
                 <w:color w:val="1C2731"/>
-                <w:sz w:val="17"/>
+                <w:sz w:val="16"/>
               </w:rPr>
               <w:t>Review date: __________________________</w:t>
             </w:r>
@@ -254,13 +254,13 @@
       <w:tr>
         <w:tc>
           <w:tcPr>
-            <w:tcW w:type="dxa" w:w="10368"/>
+            <w:tcW w:type="dxa" w:w="10656"/>
             <w:gridSpan w:val="2"/>
             <w:tcMar>
-              <w:top w:w="90" w:type="dxa"/>
-              <w:start w:w="115" w:type="dxa"/>
-              <w:bottom w:w="90" w:type="dxa"/>
-              <w:end w:w="115" w:type="dxa"/>
+              <w:top w:w="70" w:type="dxa"/>
+              <w:start w:w="95" w:type="dxa"/>
+              <w:bottom w:w="70" w:type="dxa"/>
+              <w:end w:w="95" w:type="dxa"/>
             </w:tcMar>
           </w:tcPr>
           <w:p>
@@ -270,7 +270,7 @@
                 <w:b/>
                 <w:i w:val="0"/>
                 <w:color w:val="1C2731"/>
-                <w:sz w:val="17"/>
+                <w:sz w:val="16"/>
               </w:rPr>
               <w:t>Prior relationship, conflict, or compensation, if any: ________________________________________________</w:t>
             </w:r>
@@ -281,7 +281,7 @@
     <w:p>
       <w:pPr>
         <w:keepNext/>
-        <w:spacing w:before="140" w:after="80"/>
+        <w:spacing w:before="80" w:after="40"/>
       </w:pPr>
       <w:r>
         <w:rPr>
@@ -289,14 +289,14 @@
           <w:b/>
           <w:i w:val="0"/>
           <w:color w:val="193A5A"/>
-          <w:sz w:val="22"/>
+          <w:sz w:val="20"/>
         </w:rPr>
         <w:t>2. Materials, scope, and procedures reviewed</w:t>
       </w:r>
     </w:p>
     <w:tbl>
       <w:tblPr>
-        <w:tblW w:type="dxa" w:w="10368"/>
+        <w:tblW w:type="dxa" w:w="10656"/>
         <w:tblLayout w:type="fixed"/>
         <w:tblLook w:firstColumn="1" w:firstRow="1" w:lastColumn="0" w:lastRow="0" w:noHBand="0" w:noVBand="1" w:val="04A0"/>
         <w:tblBorders>
@@ -309,18 +309,18 @@
         </w:tblBorders>
       </w:tblPr>
       <w:tblGrid>
-        <w:gridCol w:w="10368"/>
+        <w:gridCol w:w="10656"/>
       </w:tblGrid>
       <w:tr>
         <w:tc>
           <w:tcPr>
-            <w:tcW w:type="dxa" w:w="10368"/>
+            <w:tcW w:type="dxa" w:w="10656"/>
             <w:shd w:fill="EAF0F5"/>
             <w:tcMar>
-              <w:top w:w="85" w:type="dxa"/>
-              <w:start w:w="115" w:type="dxa"/>
-              <w:bottom w:w="85" w:type="dxa"/>
-              <w:end w:w="115" w:type="dxa"/>
+              <w:top w:w="60" w:type="dxa"/>
+              <w:start w:w="95" w:type="dxa"/>
+              <w:bottom w:w="60" w:type="dxa"/>
+              <w:end w:w="95" w:type="dxa"/>
             </w:tcMar>
           </w:tcPr>
           <w:p>
@@ -330,7 +330,7 @@
                 <w:b/>
                 <w:i w:val="0"/>
                 <w:color w:val="1C2731"/>
-                <w:sz w:val="17"/>
+                <w:sz w:val="16"/>
               </w:rPr>
               <w:t xml:space="preserve">Stable snapshot: review-v1.3.1  |  </w:t>
             </w:r>
@@ -340,7 +340,7 @@
                 <w:b w:val="0"/>
                 <w:i w:val="0"/>
                 <w:color w:val="215B91"/>
-                <w:sz w:val="16"/>
+                <w:sz w:val="14"/>
               </w:rPr>
               <w:t>https://github.com/Ayodele-Adeniyi/continuous-control-assurance-framework/tree/review-v1.3.1</w:t>
             </w:r>
@@ -350,12 +350,12 @@
       <w:tr>
         <w:tc>
           <w:tcPr>
-            <w:tcW w:type="dxa" w:w="10368"/>
+            <w:tcW w:type="dxa" w:w="10656"/>
             <w:tcMar>
-              <w:top w:w="80" w:type="dxa"/>
-              <w:start w:w="115" w:type="dxa"/>
-              <w:bottom w:w="80" w:type="dxa"/>
-              <w:end w:w="115" w:type="dxa"/>
+              <w:top w:w="60" w:type="dxa"/>
+              <w:start w:w="95" w:type="dxa"/>
+              <w:bottom w:w="60" w:type="dxa"/>
+              <w:end w:w="95" w:type="dxa"/>
             </w:tcMar>
           </w:tcPr>
           <w:p>
@@ -365,7 +365,7 @@
                 <w:b/>
                 <w:i w:val="0"/>
                 <w:color w:val="1C2731"/>
-                <w:sz w:val="17"/>
+                <w:sz w:val="16"/>
               </w:rPr>
               <w:t xml:space="preserve">Materials/procedures: </w:t>
             </w:r>
@@ -375,7 +375,7 @@
                 <w:b w:val="0"/>
                 <w:i w:val="0"/>
                 <w:color w:val="1C2731"/>
-                <w:sz w:val="16"/>
+                <w:sz w:val="15"/>
               </w:rPr>
               <w:t>☐ Methodology  ☐ Control-Test Catalog  ☐ Repository/code (optional)  ☐ Local reproduction (optional)  ☐ Automated tests (optional)</w:t>
             </w:r>
@@ -385,12 +385,12 @@
       <w:tr>
         <w:tc>
           <w:tcPr>
-            <w:tcW w:type="dxa" w:w="10368"/>
+            <w:tcW w:type="dxa" w:w="10656"/>
             <w:tcMar>
-              <w:top w:w="80" w:type="dxa"/>
-              <w:start w:w="115" w:type="dxa"/>
-              <w:bottom w:w="80" w:type="dxa"/>
-              <w:end w:w="115" w:type="dxa"/>
+              <w:top w:w="60" w:type="dxa"/>
+              <w:start w:w="95" w:type="dxa"/>
+              <w:bottom w:w="60" w:type="dxa"/>
+              <w:end w:w="95" w:type="dxa"/>
             </w:tcMar>
           </w:tcPr>
           <w:p>
@@ -400,7 +400,7 @@
                 <w:b/>
                 <w:i w:val="0"/>
                 <w:color w:val="1C2731"/>
-                <w:sz w:val="17"/>
+                <w:sz w:val="16"/>
               </w:rPr>
               <w:t xml:space="preserve">Catalog scope: </w:t>
             </w:r>
@@ -410,7 +410,7 @@
                 <w:b w:val="0"/>
                 <w:i w:val="0"/>
                 <w:color w:val="1C2731"/>
-                <w:sz w:val="16"/>
+                <w:sz w:val="15"/>
               </w:rPr>
               <w:t>☐ All 20 controls  ☐ Selected modules/control IDs: __________________________</w:t>
             </w:r>
@@ -423,7 +423,7 @@
                 <w:b w:val="0"/>
                 <w:i w:val="0"/>
                 <w:color w:val="1C2731"/>
-                <w:sz w:val="16"/>
+                <w:sz w:val="15"/>
               </w:rPr>
               <w:t>Observed result and seed, if locally reproduced: __________________________________________</w:t>
             </w:r>
@@ -433,13 +433,13 @@
       <w:tr>
         <w:tc>
           <w:tcPr>
-            <w:tcW w:type="dxa" w:w="10368"/>
+            <w:tcW w:type="dxa" w:w="10656"/>
             <w:shd w:fill="EAF0F5"/>
             <w:tcMar>
-              <w:top w:w="90" w:type="dxa"/>
-              <w:start w:w="115" w:type="dxa"/>
-              <w:bottom w:w="90" w:type="dxa"/>
-              <w:end w:w="115" w:type="dxa"/>
+              <w:top w:w="65" w:type="dxa"/>
+              <w:start w:w="95" w:type="dxa"/>
+              <w:bottom w:w="65" w:type="dxa"/>
+              <w:end w:w="95" w:type="dxa"/>
             </w:tcMar>
           </w:tcPr>
           <w:p>
@@ -449,7 +449,7 @@
                 <w:b/>
                 <w:i w:val="0"/>
                 <w:color w:val="1C2731"/>
-                <w:sz w:val="17"/>
+                <w:sz w:val="16"/>
               </w:rPr>
               <w:t xml:space="preserve">Documented release facts: </w:t>
             </w:r>
@@ -459,7 +459,7 @@
                 <w:b w:val="0"/>
                 <w:i w:val="0"/>
                 <w:color w:val="1C2731"/>
-                <w:sz w:val="16"/>
+                <w:sz w:val="15"/>
               </w:rPr>
               <w:t>Version 1.3.1; Apache-2.0 license; 20 control tests using synthetic demonstration data. Under the official seed-42 benchmark, the release documentation reports 165 of 165 deliberately planted conditions detected, 3 additional peer-comparison observations, and 168 total exceptions.</w:t>
             </w:r>
@@ -472,7 +472,7 @@
                 <w:b w:val="0"/>
                 <w:i/>
                 <w:color w:val="56626C"/>
-                <w:sz w:val="16"/>
+                <w:sz w:val="15"/>
               </w:rPr>
               <w:t>Corrections, if any: ________________________________________________</w:t>
             </w:r>
@@ -481,14 +481,9 @@
       </w:tr>
     </w:tbl>
     <w:p>
-      <w:r>
-        <w:br w:type="page"/>
-      </w:r>
-    </w:p>
-    <w:p>
       <w:pPr>
         <w:keepNext/>
-        <w:spacing w:before="140" w:after="80"/>
+        <w:spacing w:before="80" w:after="40"/>
       </w:pPr>
       <w:r>
         <w:rPr>
@@ -496,7 +491,7 @@
           <w:b/>
           <w:i w:val="0"/>
           <w:color w:val="193A5A"/>
-          <w:sz w:val="22"/>
+          <w:sz w:val="20"/>
         </w:rPr>
         <w:t>3. Professional opinion</w:t>
       </w:r>
@@ -504,7 +499,7 @@
     <w:p>
       <w:pPr>
         <w:keepNext/>
-        <w:spacing w:before="100" w:after="40"/>
+        <w:spacing w:before="50" w:after="20"/>
       </w:pPr>
       <w:r>
         <w:rPr>
@@ -512,7 +507,7 @@
           <w:b/>
           <w:i w:val="0"/>
           <w:color w:val="1C2731"/>
-          <w:sz w:val="19"/>
+          <w:sz w:val="17"/>
         </w:rPr>
         <w:t xml:space="preserve">Technical soundness. </w:t>
       </w:r>
@@ -522,28 +517,153 @@
           <w:b w:val="0"/>
           <w:i w:val="0"/>
           <w:color w:val="1C2731"/>
-          <w:sz w:val="18"/>
+          <w:sz w:val="17"/>
         </w:rPr>
         <w:t>In my professional judgment, this framework is:</w:t>
       </w:r>
     </w:p>
+    <w:tbl>
+      <w:tblPr>
+        <w:tblW w:type="dxa" w:w="10368"/>
+        <w:tblLayout w:type="fixed"/>
+        <w:tblLook w:firstColumn="1" w:firstRow="1" w:lastColumn="0" w:lastRow="0" w:noHBand="0" w:noVBand="1" w:val="04A0"/>
+        <w:tblBorders>
+          <w:top w:val="single" w:sz="4" w:color="8EA2B3"/>
+          <w:left w:val="single" w:sz="4" w:color="8EA2B3"/>
+          <w:bottom w:val="single" w:sz="4" w:color="8EA2B3"/>
+          <w:right w:val="single" w:sz="4" w:color="8EA2B3"/>
+          <w:insideH w:val="single" w:sz="4" w:color="8EA2B3"/>
+          <w:insideV w:val="single" w:sz="4" w:color="8EA2B3"/>
+        </w:tblBorders>
+      </w:tblPr>
+      <w:tblGrid>
+        <w:gridCol w:w="4824"/>
+        <w:gridCol w:w="3168"/>
+        <w:gridCol w:w="2376"/>
+      </w:tblGrid>
+      <w:tr>
+        <w:tc>
+          <w:tcPr>
+            <w:tcW w:type="dxa" w:w="3552"/>
+            <w:vAlign w:val="center"/>
+            <w:tcMar>
+              <w:top w:w="55" w:type="dxa"/>
+              <w:start w:w="70" w:type="dxa"/>
+              <w:bottom w:w="55" w:type="dxa"/>
+              <w:end w:w="70" w:type="dxa"/>
+            </w:tcMar>
+          </w:tcPr>
+          <w:p>
+            <w:pPr>
+              <w:spacing w:after="0"/>
+            </w:pPr>
+            <w:r>
+              <w:rPr>
+                <w:rFonts w:ascii="Arial" w:hAnsi="Arial"/>
+                <w:b w:val="0"/>
+                <w:i w:val="0"/>
+                <w:color w:val="1C2731"/>
+                <w:sz w:val="15"/>
+              </w:rPr>
+              <w:t>☐ Technically sound and consistent with professional control-testing practice for a synthetic reference prototype</w:t>
+            </w:r>
+          </w:p>
+        </w:tc>
+        <w:tc>
+          <w:tcPr>
+            <w:tcW w:type="dxa" w:w="3552"/>
+            <w:vAlign w:val="center"/>
+            <w:tcMar>
+              <w:top w:w="55" w:type="dxa"/>
+              <w:start w:w="70" w:type="dxa"/>
+              <w:bottom w:w="55" w:type="dxa"/>
+              <w:end w:w="70" w:type="dxa"/>
+            </w:tcMar>
+          </w:tcPr>
+          <w:p>
+            <w:pPr>
+              <w:spacing w:after="0"/>
+            </w:pPr>
+            <w:r>
+              <w:rPr>
+                <w:rFonts w:ascii="Arial" w:hAnsi="Arial"/>
+                <w:b w:val="0"/>
+                <w:i w:val="0"/>
+                <w:color w:val="1C2731"/>
+                <w:sz w:val="15"/>
+              </w:rPr>
+              <w:t>☐ Technically sound with minor reservations explained below</w:t>
+            </w:r>
+          </w:p>
+        </w:tc>
+        <w:tc>
+          <w:tcPr>
+            <w:tcW w:type="dxa" w:w="3552"/>
+            <w:vAlign w:val="center"/>
+            <w:tcMar>
+              <w:top w:w="55" w:type="dxa"/>
+              <w:start w:w="70" w:type="dxa"/>
+              <w:bottom w:w="55" w:type="dxa"/>
+              <w:end w:w="70" w:type="dxa"/>
+            </w:tcMar>
+          </w:tcPr>
+          <w:p>
+            <w:pPr>
+              <w:spacing w:after="0"/>
+            </w:pPr>
+            <w:r>
+              <w:rPr>
+                <w:rFonts w:ascii="Arial" w:hAnsi="Arial"/>
+                <w:b w:val="0"/>
+                <w:i w:val="0"/>
+                <w:color w:val="1C2731"/>
+                <w:sz w:val="15"/>
+              </w:rPr>
+              <w:t>☐ Not technically sound, as explained below</w:t>
+            </w:r>
+          </w:p>
+        </w:tc>
+      </w:tr>
+    </w:tbl>
     <w:p>
       <w:pPr>
-        <w:spacing w:after="60" w:line="252" w:lineRule="auto"/>
-        <w:ind w:left="216"/>
+        <w:spacing w:before="20" w:after="30"/>
       </w:pPr>
       <w:r>
         <w:rPr>
           <w:rFonts w:ascii="Arial" w:hAnsi="Arial"/>
           <w:b w:val="0"/>
+          <w:i/>
+          <w:color w:val="56626C"/>
+          <w:sz w:val="15"/>
+        </w:rPr>
+        <w:t xml:space="preserve">Comments (optional): </w:t>
+      </w:r>
+      <w:r>
+        <w:rPr>
+          <w:rFonts w:ascii="Arial" w:hAnsi="Arial"/>
+          <w:b w:val="0"/>
+          <w:i w:val="0"/>
+          <w:color w:val="56626C"/>
+          <w:sz w:val="15"/>
+        </w:rPr>
+        <w:t>____________________________________________________________</w:t>
+      </w:r>
+    </w:p>
+    <w:p>
+      <w:pPr>
+        <w:keepNext/>
+        <w:spacing w:before="50" w:after="20"/>
+      </w:pPr>
+      <w:r>
+        <w:rPr>
+          <w:rFonts w:ascii="Arial" w:hAnsi="Arial"/>
+          <w:b/>
           <w:i w:val="0"/>
           <w:color w:val="1C2731"/>
           <w:sz w:val="17"/>
         </w:rPr>
-        <w:t>☐ Technically sound and consistent with professional control-testing practice for a synthetic reference prototype</w:t>
-      </w:r>
-      <w:r>
-        <w:br/>
+        <w:t xml:space="preserve">Claims and limitations. </w:t>
       </w:r>
       <w:r>
         <w:rPr>
@@ -553,10 +673,151 @@
           <w:color w:val="1C2731"/>
           <w:sz w:val="17"/>
         </w:rPr>
-        <w:t>☐ Technically sound with minor reservations explained below</w:t>
+        <w:t>In my professional judgment, the framework's claims are:</w:t>
+      </w:r>
+    </w:p>
+    <w:tbl>
+      <w:tblPr>
+        <w:tblW w:type="dxa" w:w="10368"/>
+        <w:tblLayout w:type="fixed"/>
+        <w:tblLook w:firstColumn="1" w:firstRow="1" w:lastColumn="0" w:lastRow="0" w:noHBand="0" w:noVBand="1" w:val="04A0"/>
+        <w:tblBorders>
+          <w:top w:val="single" w:sz="4" w:color="8EA2B3"/>
+          <w:left w:val="single" w:sz="4" w:color="8EA2B3"/>
+          <w:bottom w:val="single" w:sz="4" w:color="8EA2B3"/>
+          <w:right w:val="single" w:sz="4" w:color="8EA2B3"/>
+          <w:insideH w:val="single" w:sz="4" w:color="8EA2B3"/>
+          <w:insideV w:val="single" w:sz="4" w:color="8EA2B3"/>
+        </w:tblBorders>
+      </w:tblPr>
+      <w:tblGrid>
+        <w:gridCol w:w="4824"/>
+        <w:gridCol w:w="3168"/>
+        <w:gridCol w:w="2376"/>
+      </w:tblGrid>
+      <w:tr>
+        <w:tc>
+          <w:tcPr>
+            <w:tcW w:type="dxa" w:w="3552"/>
+            <w:vAlign w:val="center"/>
+            <w:tcMar>
+              <w:top w:w="55" w:type="dxa"/>
+              <w:start w:w="70" w:type="dxa"/>
+              <w:bottom w:w="55" w:type="dxa"/>
+              <w:end w:w="70" w:type="dxa"/>
+            </w:tcMar>
+          </w:tcPr>
+          <w:p>
+            <w:pPr>
+              <w:spacing w:after="0"/>
+            </w:pPr>
+            <w:r>
+              <w:rPr>
+                <w:rFonts w:ascii="Arial" w:hAnsi="Arial"/>
+                <w:b w:val="0"/>
+                <w:i w:val="0"/>
+                <w:color w:val="1C2731"/>
+                <w:sz w:val="15"/>
+              </w:rPr>
+              <w:t>☐ Appropriately bounded to what the demonstration establishes</w:t>
+            </w:r>
+          </w:p>
+        </w:tc>
+        <w:tc>
+          <w:tcPr>
+            <w:tcW w:type="dxa" w:w="3552"/>
+            <w:vAlign w:val="center"/>
+            <w:tcMar>
+              <w:top w:w="55" w:type="dxa"/>
+              <w:start w:w="70" w:type="dxa"/>
+              <w:bottom w:w="55" w:type="dxa"/>
+              <w:end w:w="70" w:type="dxa"/>
+            </w:tcMar>
+          </w:tcPr>
+          <w:p>
+            <w:pPr>
+              <w:spacing w:after="0"/>
+            </w:pPr>
+            <w:r>
+              <w:rPr>
+                <w:rFonts w:ascii="Arial" w:hAnsi="Arial"/>
+                <w:b w:val="0"/>
+                <w:i w:val="0"/>
+                <w:color w:val="1C2731"/>
+                <w:sz w:val="15"/>
+              </w:rPr>
+              <w:t>☐ Generally appropriate, but some claims are overstated as explained below</w:t>
+            </w:r>
+          </w:p>
+        </w:tc>
+        <w:tc>
+          <w:tcPr>
+            <w:tcW w:type="dxa" w:w="3552"/>
+            <w:vAlign w:val="center"/>
+            <w:tcMar>
+              <w:top w:w="55" w:type="dxa"/>
+              <w:start w:w="70" w:type="dxa"/>
+              <w:bottom w:w="55" w:type="dxa"/>
+              <w:end w:w="70" w:type="dxa"/>
+            </w:tcMar>
+          </w:tcPr>
+          <w:p>
+            <w:pPr>
+              <w:spacing w:after="0"/>
+            </w:pPr>
+            <w:r>
+              <w:rPr>
+                <w:rFonts w:ascii="Arial" w:hAnsi="Arial"/>
+                <w:b w:val="0"/>
+                <w:i w:val="0"/>
+                <w:color w:val="1C2731"/>
+                <w:sz w:val="15"/>
+              </w:rPr>
+              <w:t>☐ Not appropriately bounded, as explained below</w:t>
+            </w:r>
+          </w:p>
+        </w:tc>
+      </w:tr>
+    </w:tbl>
+    <w:p>
+      <w:pPr>
+        <w:spacing w:before="20" w:after="30"/>
+      </w:pPr>
+      <w:r>
+        <w:rPr>
+          <w:rFonts w:ascii="Arial" w:hAnsi="Arial"/>
+          <w:b w:val="0"/>
+          <w:i/>
+          <w:color w:val="56626C"/>
+          <w:sz w:val="15"/>
+        </w:rPr>
+        <w:t xml:space="preserve">Comments (optional): </w:t>
       </w:r>
       <w:r>
-        <w:br/>
+        <w:rPr>
+          <w:rFonts w:ascii="Arial" w:hAnsi="Arial"/>
+          <w:b w:val="0"/>
+          <w:i w:val="0"/>
+          <w:color w:val="56626C"/>
+          <w:sz w:val="15"/>
+        </w:rPr>
+        <w:t>____________________________________________________________</w:t>
+      </w:r>
+    </w:p>
+    <w:p>
+      <w:pPr>
+        <w:keepNext/>
+        <w:spacing w:before="50" w:after="20"/>
+      </w:pPr>
+      <w:r>
+        <w:rPr>
+          <w:rFonts w:ascii="Arial" w:hAnsi="Arial"/>
+          <w:b/>
+          <w:i w:val="0"/>
+          <w:color w:val="1C2731"/>
+          <w:sz w:val="17"/>
+        </w:rPr>
+        <w:t xml:space="preserve">Transferability. </w:t>
       </w:r>
       <w:r>
         <w:rPr>
@@ -566,13 +827,115 @@
           <w:color w:val="1C2731"/>
           <w:sz w:val="17"/>
         </w:rPr>
-        <w:t>☐ Not technically sound, as explained below</w:t>
+        <w:t>In my professional judgment, this methodology:</w:t>
       </w:r>
     </w:p>
+    <w:tbl>
+      <w:tblPr>
+        <w:tblW w:type="dxa" w:w="10368"/>
+        <w:tblLayout w:type="fixed"/>
+        <w:tblLook w:firstColumn="1" w:firstRow="1" w:lastColumn="0" w:lastRow="0" w:noHBand="0" w:noVBand="1" w:val="04A0"/>
+        <w:tblBorders>
+          <w:top w:val="single" w:sz="4" w:color="8EA2B3"/>
+          <w:left w:val="single" w:sz="4" w:color="8EA2B3"/>
+          <w:bottom w:val="single" w:sz="4" w:color="8EA2B3"/>
+          <w:right w:val="single" w:sz="4" w:color="8EA2B3"/>
+          <w:insideH w:val="single" w:sz="4" w:color="8EA2B3"/>
+          <w:insideV w:val="single" w:sz="4" w:color="8EA2B3"/>
+        </w:tblBorders>
+      </w:tblPr>
+      <w:tblGrid>
+        <w:gridCol w:w="4824"/>
+        <w:gridCol w:w="3168"/>
+        <w:gridCol w:w="2376"/>
+      </w:tblGrid>
+      <w:tr>
+        <w:tc>
+          <w:tcPr>
+            <w:tcW w:type="dxa" w:w="3552"/>
+            <w:vAlign w:val="center"/>
+            <w:tcMar>
+              <w:top w:w="55" w:type="dxa"/>
+              <w:start w:w="70" w:type="dxa"/>
+              <w:bottom w:w="55" w:type="dxa"/>
+              <w:end w:w="70" w:type="dxa"/>
+            </w:tcMar>
+          </w:tcPr>
+          <w:p>
+            <w:pPr>
+              <w:spacing w:after="0"/>
+            </w:pPr>
+            <w:r>
+              <w:rPr>
+                <w:rFonts w:ascii="Arial" w:hAnsi="Arial"/>
+                <w:b w:val="0"/>
+                <w:i w:val="0"/>
+                <w:color w:val="1C2731"/>
+                <w:sz w:val="15"/>
+              </w:rPr>
+              <w:t>☐ Could be adapted by other institutions or practitioners to their own authorized data and control environments</w:t>
+            </w:r>
+          </w:p>
+        </w:tc>
+        <w:tc>
+          <w:tcPr>
+            <w:tcW w:type="dxa" w:w="3552"/>
+            <w:vAlign w:val="center"/>
+            <w:tcMar>
+              <w:top w:w="55" w:type="dxa"/>
+              <w:start w:w="70" w:type="dxa"/>
+              <w:bottom w:w="55" w:type="dxa"/>
+              <w:end w:w="70" w:type="dxa"/>
+            </w:tcMar>
+          </w:tcPr>
+          <w:p>
+            <w:pPr>
+              <w:spacing w:after="0"/>
+            </w:pPr>
+            <w:r>
+              <w:rPr>
+                <w:rFonts w:ascii="Arial" w:hAnsi="Arial"/>
+                <w:b w:val="0"/>
+                <w:i w:val="0"/>
+                <w:color w:val="1C2731"/>
+                <w:sz w:val="15"/>
+              </w:rPr>
+              <w:t>☐ Could be adapted with significant effort, as explained below</w:t>
+            </w:r>
+          </w:p>
+        </w:tc>
+        <w:tc>
+          <w:tcPr>
+            <w:tcW w:type="dxa" w:w="3552"/>
+            <w:vAlign w:val="center"/>
+            <w:tcMar>
+              <w:top w:w="55" w:type="dxa"/>
+              <w:start w:w="70" w:type="dxa"/>
+              <w:bottom w:w="55" w:type="dxa"/>
+              <w:end w:w="70" w:type="dxa"/>
+            </w:tcMar>
+          </w:tcPr>
+          <w:p>
+            <w:pPr>
+              <w:spacing w:after="0"/>
+            </w:pPr>
+            <w:r>
+              <w:rPr>
+                <w:rFonts w:ascii="Arial" w:hAnsi="Arial"/>
+                <w:b w:val="0"/>
+                <w:i w:val="0"/>
+                <w:color w:val="1C2731"/>
+                <w:sz w:val="15"/>
+              </w:rPr>
+              <w:t>☐ Is not practically transferable, as explained below</w:t>
+            </w:r>
+          </w:p>
+        </w:tc>
+      </w:tr>
+    </w:tbl>
     <w:p>
       <w:pPr>
-        <w:keepNext/>
-        <w:spacing w:after="40"/>
+        <w:spacing w:before="20" w:after="30"/>
       </w:pPr>
       <w:r>
         <w:rPr>
@@ -580,14 +943,50 @@
           <w:b w:val="0"/>
           <w:i/>
           <w:color w:val="56626C"/>
+          <w:sz w:val="15"/>
+        </w:rPr>
+        <w:t xml:space="preserve">Comments (optional): </w:t>
+      </w:r>
+      <w:r>
+        <w:rPr>
+          <w:rFonts w:ascii="Arial" w:hAnsi="Arial"/>
+          <w:b w:val="0"/>
+          <w:i w:val="0"/>
+          <w:color w:val="56626C"/>
+          <w:sz w:val="15"/>
+        </w:rPr>
+        <w:t>____________________________________________________________</w:t>
+      </w:r>
+    </w:p>
+    <w:p>
+      <w:pPr>
+        <w:keepNext/>
+        <w:spacing w:before="60" w:after="40"/>
+      </w:pPr>
+      <w:r>
+        <w:rPr>
+          <w:rFonts w:ascii="Arial" w:hAnsi="Arial"/>
+          <w:b/>
+          <w:i w:val="0"/>
+          <w:color w:val="1C2731"/>
           <w:sz w:val="17"/>
         </w:rPr>
-        <w:t>Comments (optional):</w:t>
+        <w:t xml:space="preserve">Overall assessment. </w:t>
+      </w:r>
+      <w:r>
+        <w:rPr>
+          <w:rFonts w:ascii="Arial" w:hAnsi="Arial"/>
+          <w:b w:val="0"/>
+          <w:i w:val="0"/>
+          <w:color w:val="1C2731"/>
+          <w:sz w:val="17"/>
+        </w:rPr>
+        <w:t>Briefly address technical soundness, limitations, and potential transferability (2-4 sentences):</w:t>
       </w:r>
     </w:p>
     <w:tbl>
       <w:tblPr>
-        <w:tblW w:type="dxa" w:w="10368"/>
+        <w:tblW w:type="dxa" w:w="10656"/>
         <w:tblLayout w:type="fixed"/>
         <w:tblLook w:firstColumn="1" w:firstRow="1" w:lastColumn="0" w:lastRow="0" w:noHBand="0" w:noVBand="1" w:val="04A0"/>
         <w:tblBorders>
@@ -600,320 +999,21 @@
         </w:tblBorders>
       </w:tblPr>
       <w:tblGrid>
-        <w:gridCol w:w="10368"/>
+        <w:gridCol w:w="10656"/>
       </w:tblGrid>
       <w:tr>
         <w:trPr>
-          <w:trHeight w:val="547" w:hRule="atLeast"/>
+          <w:trHeight w:val="1037" w:hRule="atLeast"/>
         </w:trPr>
         <w:tc>
           <w:tcPr>
-            <w:tcW w:type="dxa" w:w="10368"/>
-            <w:tcMar>
-              <w:top w:w="70" w:type="dxa"/>
-              <w:start w:w="115" w:type="dxa"/>
-              <w:bottom w:w="70" w:type="dxa"/>
-              <w:end w:w="115" w:type="dxa"/>
-            </w:tcMar>
-          </w:tcPr>
-          <w:p/>
-        </w:tc>
-      </w:tr>
-    </w:tbl>
-    <w:p>
-      <w:pPr>
-        <w:keepNext/>
-        <w:spacing w:before="100" w:after="40"/>
-      </w:pPr>
-      <w:r>
-        <w:rPr>
-          <w:rFonts w:ascii="Arial" w:hAnsi="Arial"/>
-          <w:b/>
-          <w:i w:val="0"/>
-          <w:color w:val="1C2731"/>
-          <w:sz w:val="19"/>
-        </w:rPr>
-        <w:t xml:space="preserve">Claims and limitations. </w:t>
-      </w:r>
-      <w:r>
-        <w:rPr>
-          <w:rFonts w:ascii="Arial" w:hAnsi="Arial"/>
-          <w:b w:val="0"/>
-          <w:i w:val="0"/>
-          <w:color w:val="1C2731"/>
-          <w:sz w:val="18"/>
-        </w:rPr>
-        <w:t>In my professional judgment, the framework's claims are:</w:t>
-      </w:r>
-    </w:p>
-    <w:p>
-      <w:pPr>
-        <w:spacing w:after="60" w:line="252" w:lineRule="auto"/>
-        <w:ind w:left="216"/>
-      </w:pPr>
-      <w:r>
-        <w:rPr>
-          <w:rFonts w:ascii="Arial" w:hAnsi="Arial"/>
-          <w:b w:val="0"/>
-          <w:i w:val="0"/>
-          <w:color w:val="1C2731"/>
-          <w:sz w:val="17"/>
-        </w:rPr>
-        <w:t>☐ Appropriately bounded to what the demonstration establishes</w:t>
-      </w:r>
-      <w:r>
-        <w:br/>
-      </w:r>
-      <w:r>
-        <w:rPr>
-          <w:rFonts w:ascii="Arial" w:hAnsi="Arial"/>
-          <w:b w:val="0"/>
-          <w:i w:val="0"/>
-          <w:color w:val="1C2731"/>
-          <w:sz w:val="17"/>
-        </w:rPr>
-        <w:t>☐ Generally appropriate, but some claims are overstated as explained below</w:t>
-      </w:r>
-      <w:r>
-        <w:br/>
-      </w:r>
-      <w:r>
-        <w:rPr>
-          <w:rFonts w:ascii="Arial" w:hAnsi="Arial"/>
-          <w:b w:val="0"/>
-          <w:i w:val="0"/>
-          <w:color w:val="1C2731"/>
-          <w:sz w:val="17"/>
-        </w:rPr>
-        <w:t>☐ Not appropriately bounded, as explained below</w:t>
-      </w:r>
-    </w:p>
-    <w:p>
-      <w:pPr>
-        <w:keepNext/>
-        <w:spacing w:after="40"/>
-      </w:pPr>
-      <w:r>
-        <w:rPr>
-          <w:rFonts w:ascii="Arial" w:hAnsi="Arial"/>
-          <w:b w:val="0"/>
-          <w:i/>
-          <w:color w:val="56626C"/>
-          <w:sz w:val="17"/>
-        </w:rPr>
-        <w:t>Comments (optional):</w:t>
-      </w:r>
-    </w:p>
-    <w:tbl>
-      <w:tblPr>
-        <w:tblW w:type="dxa" w:w="10368"/>
-        <w:tblLayout w:type="fixed"/>
-        <w:tblLook w:firstColumn="1" w:firstRow="1" w:lastColumn="0" w:lastRow="0" w:noHBand="0" w:noVBand="1" w:val="04A0"/>
-        <w:tblBorders>
-          <w:top w:val="single" w:sz="5" w:color="8EA2B3"/>
-          <w:left w:val="single" w:sz="5" w:color="8EA2B3"/>
-          <w:bottom w:val="single" w:sz="5" w:color="8EA2B3"/>
-          <w:right w:val="single" w:sz="5" w:color="8EA2B3"/>
-          <w:insideH w:val="single" w:sz="5" w:color="8EA2B3"/>
-          <w:insideV w:val="single" w:sz="5" w:color="8EA2B3"/>
-        </w:tblBorders>
-      </w:tblPr>
-      <w:tblGrid>
-        <w:gridCol w:w="10368"/>
-      </w:tblGrid>
-      <w:tr>
-        <w:trPr>
-          <w:trHeight w:val="547" w:hRule="atLeast"/>
-        </w:trPr>
-        <w:tc>
-          <w:tcPr>
-            <w:tcW w:type="dxa" w:w="10368"/>
-            <w:tcMar>
-              <w:top w:w="70" w:type="dxa"/>
-              <w:start w:w="115" w:type="dxa"/>
-              <w:bottom w:w="70" w:type="dxa"/>
-              <w:end w:w="115" w:type="dxa"/>
-            </w:tcMar>
-          </w:tcPr>
-          <w:p/>
-        </w:tc>
-      </w:tr>
-    </w:tbl>
-    <w:p>
-      <w:pPr>
-        <w:keepNext/>
-        <w:spacing w:before="100" w:after="40"/>
-      </w:pPr>
-      <w:r>
-        <w:rPr>
-          <w:rFonts w:ascii="Arial" w:hAnsi="Arial"/>
-          <w:b/>
-          <w:i w:val="0"/>
-          <w:color w:val="1C2731"/>
-          <w:sz w:val="19"/>
-        </w:rPr>
-        <w:t xml:space="preserve">Transferability. </w:t>
-      </w:r>
-      <w:r>
-        <w:rPr>
-          <w:rFonts w:ascii="Arial" w:hAnsi="Arial"/>
-          <w:b w:val="0"/>
-          <w:i w:val="0"/>
-          <w:color w:val="1C2731"/>
-          <w:sz w:val="18"/>
-        </w:rPr>
-        <w:t>In my professional judgment, this methodology:</w:t>
-      </w:r>
-    </w:p>
-    <w:p>
-      <w:pPr>
-        <w:spacing w:after="60" w:line="252" w:lineRule="auto"/>
-        <w:ind w:left="216"/>
-      </w:pPr>
-      <w:r>
-        <w:rPr>
-          <w:rFonts w:ascii="Arial" w:hAnsi="Arial"/>
-          <w:b w:val="0"/>
-          <w:i w:val="0"/>
-          <w:color w:val="1C2731"/>
-          <w:sz w:val="17"/>
-        </w:rPr>
-        <w:t>☐ Could be adapted by other institutions or practitioners to their own authorized data and control environments</w:t>
-      </w:r>
-      <w:r>
-        <w:br/>
-      </w:r>
-      <w:r>
-        <w:rPr>
-          <w:rFonts w:ascii="Arial" w:hAnsi="Arial"/>
-          <w:b w:val="0"/>
-          <w:i w:val="0"/>
-          <w:color w:val="1C2731"/>
-          <w:sz w:val="17"/>
-        </w:rPr>
-        <w:t>☐ Could be adapted with significant effort, as explained below</w:t>
-      </w:r>
-      <w:r>
-        <w:br/>
-      </w:r>
-      <w:r>
-        <w:rPr>
-          <w:rFonts w:ascii="Arial" w:hAnsi="Arial"/>
-          <w:b w:val="0"/>
-          <w:i w:val="0"/>
-          <w:color w:val="1C2731"/>
-          <w:sz w:val="17"/>
-        </w:rPr>
-        <w:t>☐ Is not practically transferable, as explained below</w:t>
-      </w:r>
-    </w:p>
-    <w:p>
-      <w:pPr>
-        <w:keepNext/>
-        <w:spacing w:after="40"/>
-      </w:pPr>
-      <w:r>
-        <w:rPr>
-          <w:rFonts w:ascii="Arial" w:hAnsi="Arial"/>
-          <w:b w:val="0"/>
-          <w:i/>
-          <w:color w:val="56626C"/>
-          <w:sz w:val="17"/>
-        </w:rPr>
-        <w:t>Comments (optional):</w:t>
-      </w:r>
-    </w:p>
-    <w:tbl>
-      <w:tblPr>
-        <w:tblW w:type="dxa" w:w="10368"/>
-        <w:tblLayout w:type="fixed"/>
-        <w:tblLook w:firstColumn="1" w:firstRow="1" w:lastColumn="0" w:lastRow="0" w:noHBand="0" w:noVBand="1" w:val="04A0"/>
-        <w:tblBorders>
-          <w:top w:val="single" w:sz="5" w:color="8EA2B3"/>
-          <w:left w:val="single" w:sz="5" w:color="8EA2B3"/>
-          <w:bottom w:val="single" w:sz="5" w:color="8EA2B3"/>
-          <w:right w:val="single" w:sz="5" w:color="8EA2B3"/>
-          <w:insideH w:val="single" w:sz="5" w:color="8EA2B3"/>
-          <w:insideV w:val="single" w:sz="5" w:color="8EA2B3"/>
-        </w:tblBorders>
-      </w:tblPr>
-      <w:tblGrid>
-        <w:gridCol w:w="10368"/>
-      </w:tblGrid>
-      <w:tr>
-        <w:trPr>
-          <w:trHeight w:val="547" w:hRule="atLeast"/>
-        </w:trPr>
-        <w:tc>
-          <w:tcPr>
-            <w:tcW w:type="dxa" w:w="10368"/>
-            <w:tcMar>
-              <w:top w:w="70" w:type="dxa"/>
-              <w:start w:w="115" w:type="dxa"/>
-              <w:bottom w:w="70" w:type="dxa"/>
-              <w:end w:w="115" w:type="dxa"/>
-            </w:tcMar>
-          </w:tcPr>
-          <w:p/>
-        </w:tc>
-      </w:tr>
-    </w:tbl>
-    <w:p>
-      <w:pPr>
-        <w:keepNext/>
-        <w:spacing w:before="140" w:after="60"/>
-      </w:pPr>
-      <w:r>
-        <w:rPr>
-          <w:rFonts w:ascii="Arial" w:hAnsi="Arial"/>
-          <w:b/>
-          <w:i w:val="0"/>
-          <w:color w:val="1C2731"/>
-          <w:sz w:val="19"/>
-        </w:rPr>
-        <w:t xml:space="preserve">Overall assessment. </w:t>
-      </w:r>
-      <w:r>
-        <w:rPr>
-          <w:rFonts w:ascii="Arial" w:hAnsi="Arial"/>
-          <w:b w:val="0"/>
-          <w:i w:val="0"/>
-          <w:color w:val="1C2731"/>
-          <w:sz w:val="18"/>
-        </w:rPr>
-        <w:t>Briefly address technical soundness, limitations, and potential transferability (2-4 sentences):</w:t>
-      </w:r>
-    </w:p>
-    <w:tbl>
-      <w:tblPr>
-        <w:tblW w:type="dxa" w:w="10368"/>
-        <w:tblLayout w:type="fixed"/>
-        <w:tblLook w:firstColumn="1" w:firstRow="1" w:lastColumn="0" w:lastRow="0" w:noHBand="0" w:noVBand="1" w:val="04A0"/>
-        <w:tblBorders>
-          <w:top w:val="single" w:sz="5" w:color="8EA2B3"/>
-          <w:left w:val="single" w:sz="5" w:color="8EA2B3"/>
-          <w:bottom w:val="single" w:sz="5" w:color="8EA2B3"/>
-          <w:right w:val="single" w:sz="5" w:color="8EA2B3"/>
-          <w:insideH w:val="single" w:sz="5" w:color="8EA2B3"/>
-          <w:insideV w:val="single" w:sz="5" w:color="8EA2B3"/>
-        </w:tblBorders>
-      </w:tblPr>
-      <w:tblGrid>
-        <w:gridCol w:w="10368"/>
-      </w:tblGrid>
-      <w:tr>
-        <w:trPr>
-          <w:trHeight w:val="1584" w:hRule="atLeast"/>
-        </w:trPr>
-        <w:tc>
-          <w:tcPr>
-            <w:tcW w:type="dxa" w:w="10368"/>
+            <w:tcW w:type="dxa" w:w="10656"/>
             <w:vAlign w:val="top"/>
             <w:tcMar>
-              <w:top w:w="85" w:type="dxa"/>
-              <w:start w:w="115" w:type="dxa"/>
-              <w:bottom w:w="85" w:type="dxa"/>
-              <w:end w:w="115" w:type="dxa"/>
+              <w:top w:w="65" w:type="dxa"/>
+              <w:start w:w="95" w:type="dxa"/>
+              <w:bottom w:w="65" w:type="dxa"/>
+              <w:end w:w="95" w:type="dxa"/>
             </w:tcMar>
           </w:tcPr>
           <w:p>
@@ -923,7 +1023,7 @@
                 <w:b w:val="0"/>
                 <w:i w:val="0"/>
                 <w:color w:val="1C2731"/>
-                <w:sz w:val="18"/>
+                <w:sz w:val="17"/>
               </w:rPr>
             </w:r>
           </w:p>
@@ -933,7 +1033,7 @@
     <w:p>
       <w:pPr>
         <w:keepNext/>
-        <w:spacing w:before="140" w:after="80"/>
+        <w:spacing w:before="80" w:after="40"/>
       </w:pPr>
       <w:r>
         <w:rPr>
@@ -941,14 +1041,14 @@
           <w:b/>
           <w:i w:val="0"/>
           <w:color w:val="193A5A"/>
-          <w:sz w:val="22"/>
+          <w:sz w:val="20"/>
         </w:rPr>
         <w:t>4. Confirmation</w:t>
       </w:r>
     </w:p>
     <w:p>
       <w:pPr>
-        <w:spacing w:after="140"/>
+        <w:spacing w:after="60"/>
       </w:pPr>
       <w:r>
         <w:rPr>
@@ -956,14 +1056,14 @@
           <w:b w:val="0"/>
           <w:i w:val="0"/>
           <w:color w:val="1C2731"/>
-          <w:sz w:val="17"/>
+          <w:sz w:val="15"/>
         </w:rPr>
         <w:t>This response reflects my independent professional judgment based on the materials and procedures identified above. It does not constitute institutional endorsement, regulatory approval, certification, a claim of institutional adoption, or a claim about production performance. I understand that this response may be cited publicly and in professional or immigration-related submissions as evidence of independent review.</w:t>
       </w:r>
     </w:p>
     <w:tbl>
       <w:tblPr>
-        <w:tblW w:type="dxa" w:w="10368"/>
+        <w:tblW w:type="dxa" w:w="10656"/>
         <w:tblLayout w:type="fixed"/>
         <w:tblLook w:firstColumn="1" w:firstRow="1" w:lastColumn="0" w:lastRow="0" w:noHBand="0" w:noVBand="1" w:val="04A0"/>
         <w:tblBorders>
@@ -976,19 +1076,19 @@
         </w:tblBorders>
       </w:tblPr>
       <w:tblGrid>
-        <w:gridCol w:w="3168"/>
-        <w:gridCol w:w="4392"/>
-        <w:gridCol w:w="2808"/>
+        <w:gridCol w:w="3240"/>
+        <w:gridCol w:w="4536"/>
+        <w:gridCol w:w="2880"/>
       </w:tblGrid>
       <w:tr>
         <w:tc>
           <w:tcPr>
-            <w:tcW w:type="dxa" w:w="3456"/>
+            <w:tcW w:type="dxa" w:w="3552"/>
             <w:tcMar>
-              <w:top w:w="85" w:type="dxa"/>
-              <w:start w:w="115" w:type="dxa"/>
-              <w:bottom w:w="85" w:type="dxa"/>
-              <w:end w:w="115" w:type="dxa"/>
+              <w:top w:w="60" w:type="dxa"/>
+              <w:start w:w="95" w:type="dxa"/>
+              <w:bottom w:w="60" w:type="dxa"/>
+              <w:end w:w="95" w:type="dxa"/>
             </w:tcMar>
           </w:tcPr>
           <w:p>
@@ -998,7 +1098,7 @@
                 <w:b/>
                 <w:i w:val="0"/>
                 <w:color w:val="1C2731"/>
-                <w:sz w:val="17"/>
+                <w:sz w:val="16"/>
               </w:rPr>
               <w:t>Name (printed): __________________</w:t>
             </w:r>
@@ -1006,12 +1106,12 @@
         </w:tc>
         <w:tc>
           <w:tcPr>
-            <w:tcW w:type="dxa" w:w="3456"/>
+            <w:tcW w:type="dxa" w:w="3552"/>
             <w:tcMar>
-              <w:top w:w="85" w:type="dxa"/>
-              <w:start w:w="115" w:type="dxa"/>
-              <w:bottom w:w="85" w:type="dxa"/>
-              <w:end w:w="115" w:type="dxa"/>
+              <w:top w:w="60" w:type="dxa"/>
+              <w:start w:w="95" w:type="dxa"/>
+              <w:bottom w:w="60" w:type="dxa"/>
+              <w:end w:w="95" w:type="dxa"/>
             </w:tcMar>
           </w:tcPr>
           <w:p>
@@ -1021,7 +1121,7 @@
                 <w:b/>
                 <w:i w:val="0"/>
                 <w:color w:val="1C2731"/>
-                <w:sz w:val="17"/>
+                <w:sz w:val="16"/>
               </w:rPr>
               <w:t>Signature: __________________________</w:t>
             </w:r>
@@ -1029,12 +1129,12 @@
         </w:tc>
         <w:tc>
           <w:tcPr>
-            <w:tcW w:type="dxa" w:w="3456"/>
+            <w:tcW w:type="dxa" w:w="3552"/>
             <w:tcMar>
-              <w:top w:w="85" w:type="dxa"/>
-              <w:start w:w="115" w:type="dxa"/>
-              <w:bottom w:w="85" w:type="dxa"/>
-              <w:end w:w="115" w:type="dxa"/>
+              <w:top w:w="60" w:type="dxa"/>
+              <w:start w:w="95" w:type="dxa"/>
+              <w:bottom w:w="60" w:type="dxa"/>
+              <w:end w:w="95" w:type="dxa"/>
             </w:tcMar>
           </w:tcPr>
           <w:p>
@@ -1044,7 +1144,7 @@
                 <w:b/>
                 <w:i w:val="0"/>
                 <w:color w:val="1C2731"/>
-                <w:sz w:val="17"/>
+                <w:sz w:val="16"/>
               </w:rPr>
               <w:t>Date: ______________</w:t>
             </w:r>
@@ -1055,7 +1155,7 @@
     <w:sectPr>
       <w:footerReference w:type="default" r:id="rId9"/>
       <w:pgSz w:w="12240" w:h="15840"/>
-      <w:pgMar w:top="792" w:right="936" w:bottom="792" w:left="936" w:header="720" w:footer="720" w:gutter="0"/>
+      <w:pgMar w:top="605" w:right="792" w:bottom="605" w:left="792" w:header="720" w:footer="720" w:gutter="0"/>
       <w:cols w:space="720"/>
       <w:docGrid w:linePitch="360"/>
     </w:sectPr>
@@ -1076,7 +1176,7 @@
         <w:b w:val="0"/>
         <w:i w:val="0"/>
         <w:color w:val="56626C"/>
-        <w:sz w:val="15"/>
+        <w:sz w:val="14"/>
       </w:rPr>
       <w:t>CCAF independent review | Stable snapshot: review-v1.3.1</w:t>
     </w:r>
@@ -1448,12 +1548,12 @@
     <w:qFormat/>
     <w:rsid w:val="00FC693F"/>
     <w:pPr>
-      <w:spacing w:after="60" w:line="252" w:lineRule="auto"/>
+      <w:spacing w:after="40" w:line="240" w:lineRule="auto"/>
     </w:pPr>
     <w:rPr>
       <w:rFonts w:ascii="Arial" w:hAnsi="Arial"/>
       <w:color w:val="1C2731"/>
-      <w:sz w:val="18"/>
+      <w:sz w:val="17"/>
     </w:rPr>
   </w:style>
   <w:style w:type="paragraph" w:styleId="Header">

</xml_diff>

<commit_message>
Refine reviewer response wording
</commit_message>
<xml_diff>
--- a/docs/CCAF_Independent_Review_Response_Template.docx
+++ b/docs/CCAF_Independent_Review_Response_Template.docx
@@ -46,7 +46,7 @@
           <w:color w:val="56626C"/>
           <w:sz w:val="16"/>
         </w:rPr>
-        <w:t>This concise form records the materials and procedures personally reviewed and the reviewer's independent professional judgment. A documents-based design review is sufficient; repository inspection and local reproduction are optional.</w:t>
+        <w:t>This concise form records the materials and procedures personally reviewed and the reviewer's independent professional judgment. A documents-based design review is sufficient; you do not need to install or run any software.</w:t>
       </w:r>
     </w:p>
     <w:p>
@@ -377,7 +377,7 @@
                 <w:color w:val="1C2731"/>
                 <w:sz w:val="15"/>
               </w:rPr>
-              <w:t>☐ Methodology  ☐ Control-Test Catalog  ☐ Repository/code (optional)  ☐ Local reproduction (optional)  ☐ Automated tests (optional)</w:t>
+              <w:t>☐ Methodology and Release Documentation  ☐ Control-Test Catalog  ☐ Repository/source code (optional)  ☐ Local reproduction (optional)  ☐ Automated test suite (optional)</w:t>
             </w:r>
           </w:p>
         </w:tc>
@@ -425,7 +425,7 @@
                 <w:color w:val="1C2731"/>
                 <w:sz w:val="15"/>
               </w:rPr>
-              <w:t>Observed result and seed, if locally reproduced: __________________________________________</w:t>
+              <w:t>Observed result and seed, if locally reproduced (optional): _________________________________</w:t>
             </w:r>
           </w:p>
         </w:tc>
@@ -1058,7 +1058,7 @@
           <w:color w:val="1C2731"/>
           <w:sz w:val="15"/>
         </w:rPr>
-        <w:t>This response reflects my independent professional judgment based on the materials and procedures identified above. It does not constitute institutional endorsement, regulatory approval, certification, a claim of institutional adoption, or a claim about production performance. I understand that this response may be cited publicly and in professional or immigration-related submissions as evidence of independent review.</w:t>
+        <w:t>This response reflects my independent professional judgment based on the materials and procedures identified above. It does not constitute institutional endorsement, regulatory approval, certification, a claim of institutional adoption, or a claim about production performance. I consent to this response being cited publicly and in professional or immigration-related submissions as evidence of independent review.</w:t>
       </w:r>
     </w:p>
     <w:tbl>

</xml_diff>